<commit_message>
Sync to upstream it-27 (SHA: c2feb82f4f1b0b8392df52dbbef0776c7aa7a033)
</commit_message>
<xml_diff>
--- a/BaseApp/Source/Base Application/Inventory/Reports/InventoryCustomerSales.docx
+++ b/BaseApp/Source/Base Application/Inventory/Reports/InventoryCustomerSales.docx
@@ -4,15 +4,15 @@
   <w:body>
     <w:tbl>
       <w:tblPr>
-        <w:tblStyle w:val="PlainTable1"/>
+        <w:tblStyle w:val="TableGrid"/>
         <w:tblW w:w="10490" w:type="dxa"/>
         <w:tblBorders>
-          <w:top w:val="none" w:sz="0" w:space="0" w:color="auto"/>
-          <w:left w:val="none" w:sz="0" w:space="0" w:color="auto"/>
-          <w:bottom w:val="none" w:sz="0" w:space="0" w:color="auto"/>
-          <w:right w:val="none" w:sz="0" w:space="0" w:color="auto"/>
-          <w:insideH w:val="none" w:sz="0" w:space="0" w:color="auto"/>
-          <w:insideV w:val="none" w:sz="0" w:space="0" w:color="auto"/>
+          <w:top w:val="none" w:color="auto" w:sz="0" w:space="0"/>
+          <w:left w:val="none" w:color="auto" w:sz="0" w:space="0"/>
+          <w:bottom w:val="none" w:color="auto" w:sz="0" w:space="0"/>
+          <w:right w:val="none" w:color="auto" w:sz="0" w:space="0"/>
+          <w:insideH w:val="none" w:color="auto" w:sz="0" w:space="0"/>
+          <w:insideV w:val="none" w:color="auto" w:sz="0" w:space="0"/>
         </w:tblBorders>
         <w:tblLayout w:type="fixed"/>
         <w:tblLook w:val="04A0" w:firstRow="1" w:lastRow="0" w:firstColumn="1" w:lastColumn="0" w:noHBand="0" w:noVBand="1"/>
@@ -29,9 +29,7 @@
       </w:tblGrid>
       <w:tr>
         <w:trPr>
-          <w:cnfStyle w:val="100000000000" w:firstRow="1" w:lastRow="0" w:firstColumn="0" w:lastColumn="0" w:oddVBand="0" w:evenVBand="0" w:oddHBand="0" w:evenHBand="0" w:firstRowFirstColumn="0" w:firstRowLastColumn="0" w:lastRowFirstColumn="0" w:lastRowLastColumn="0"/>
-          <w:trHeight w:hRule="exact" w:val="567"/>
-          <w:tblHeader/>
+          <w:trHeight w:val="567" w:hRule="exact"/>
         </w:trPr>
         <w:sdt>
           <w:sdtPr>
@@ -40,25 +38,22 @@
               <w:sz w:val="16"/>
               <w:szCs w:val="16"/>
             </w:rPr>
-            <w:alias w:val="#Nav: /Labels/CustomerNoLabel"/>
-            <w:tag w:val="#Nav: FS_YSR_InventoryCustomerSales/50003"/>
-            <w:id w:val="-1315333048"/>
+            <w:id w:val="501544555"/>
             <w:placeholder>
               <w:docPart w:val="DefaultPlaceholder_-1854013440"/>
             </w:placeholder>
-            <w:dataBinding w:prefixMappings="xmlns:ns0='urn:microsoft-dynamics-nav/reports/FS_YSR_InventoryCustomerSales/50003/'" w:xpath="/ns0:NavWordReportXmlPart[1]/ns0:Labels[1]/ns0:CustomerNoLabel[1]" w:storeItemID="{17357049-351C-4FB5-BA49-88074E24903C}"/>
+            <w:dataBinding w:prefixMappings="xmlns:ns0='urn:microsoft-dynamics-nav/reports/Inventory_Customer_Sales/713/'" w:xpath="/ns0:NavWordReportXmlPart[1]/ns0:Labels[1]/ns0:CustomerNoLbl[1]" w:storeItemID="{0E62280E-706F-45D7-BEE2-B24E4BE14C14}"/>
             <w:text/>
+            <w:alias w:val="#Nav: /Labels/CustomerNoLbl"/>
+            <w:tag w:val="#Nav: Inventory_Customer_Sales/713"/>
           </w:sdtPr>
           <w:sdtContent>
             <w:tc>
               <w:tcPr>
-                <w:cnfStyle w:val="001000000000" w:firstRow="0" w:lastRow="0" w:firstColumn="1" w:lastColumn="0" w:oddVBand="0" w:evenVBand="0" w:oddHBand="0" w:evenHBand="0" w:firstRowFirstColumn="0" w:firstRowLastColumn="0" w:lastRowFirstColumn="0" w:lastRowLastColumn="0"/>
                 <w:tcW w:w="1276" w:type="dxa"/>
                 <w:tcBorders>
-                  <w:bottom w:val="single" w:sz="4" w:space="0" w:color="auto"/>
+                  <w:bottom w:val="single" w:color="auto" w:sz="4" w:space="0"/>
                 </w:tcBorders>
-                <w:shd w:val="clear" w:color="auto" w:fill="auto"/>
-                <w:vAlign w:val="center"/>
               </w:tcPr>
               <w:p>
                 <w:pPr>
@@ -75,7 +70,7 @@
                     <w:sz w:val="16"/>
                     <w:szCs w:val="16"/>
                   </w:rPr>
-                  <w:t>CustomerNoLabel</w:t>
+                  <w:t>CustomerNoLbl</w:t>
                 </w:r>
                 <w:proofErr w:type="spellEnd"/>
               </w:p>
@@ -89,28 +84,25 @@
               <w:sz w:val="16"/>
               <w:szCs w:val="16"/>
             </w:rPr>
-            <w:alias w:val="#Nav: /Labels/CustNameLabel"/>
-            <w:tag w:val="#Nav: FS_YSR_InventoryCustomerSales/50003"/>
-            <w:id w:val="-1817716117"/>
+            <w:id w:val="-1060179346"/>
             <w:placeholder>
               <w:docPart w:val="DefaultPlaceholder_-1854013440"/>
             </w:placeholder>
-            <w:dataBinding w:prefixMappings="xmlns:ns0='urn:microsoft-dynamics-nav/reports/FS_YSR_InventoryCustomerSales/50003/'" w:xpath="/ns0:NavWordReportXmlPart[1]/ns0:Labels[1]/ns0:CustNameLabel[1]" w:storeItemID="{17357049-351C-4FB5-BA49-88074E24903C}"/>
+            <w:dataBinding w:prefixMappings="xmlns:ns0='urn:microsoft-dynamics-nav/reports/Inventory_Customer_Sales/713/'" w:xpath="/ns0:NavWordReportXmlPart[1]/ns0:Labels[1]/ns0:CustNameLbl[1]" w:storeItemID="{0E62280E-706F-45D7-BEE2-B24E4BE14C14}"/>
             <w:text/>
+            <w:alias w:val="#Nav: /Labels/CustNameLbl"/>
+            <w:tag w:val="#Nav: Inventory_Customer_Sales/713"/>
           </w:sdtPr>
           <w:sdtContent>
             <w:tc>
               <w:tcPr>
                 <w:tcW w:w="3544" w:type="dxa"/>
                 <w:tcBorders>
-                  <w:bottom w:val="single" w:sz="4" w:space="0" w:color="auto"/>
+                  <w:bottom w:val="single" w:color="auto" w:sz="4" w:space="0"/>
                 </w:tcBorders>
-                <w:shd w:val="clear" w:color="auto" w:fill="auto"/>
-                <w:vAlign w:val="center"/>
               </w:tcPr>
               <w:p>
                 <w:pPr>
-                  <w:cnfStyle w:val="100000000000" w:firstRow="1" w:lastRow="0" w:firstColumn="0" w:lastColumn="0" w:oddVBand="0" w:evenVBand="0" w:oddHBand="0" w:evenHBand="0" w:firstRowFirstColumn="0" w:firstRowLastColumn="0" w:lastRowFirstColumn="0" w:lastRowLastColumn="0"/>
                   <w:rPr>
                     <w:rFonts w:ascii="Segoe UI" w:hAnsi="Segoe UI" w:cs="Segoe UI"/>
                     <w:sz w:val="16"/>
@@ -124,7 +116,7 @@
                     <w:sz w:val="16"/>
                     <w:szCs w:val="16"/>
                   </w:rPr>
-                  <w:t>CustNameLabel</w:t>
+                  <w:t>CustNameLbl</w:t>
                 </w:r>
                 <w:proofErr w:type="spellEnd"/>
               </w:p>
@@ -135,15 +127,11 @@
           <w:tcPr>
             <w:tcW w:w="709" w:type="dxa"/>
             <w:tcBorders>
-              <w:bottom w:val="single" w:sz="4" w:space="0" w:color="auto"/>
+              <w:bottom w:val="single" w:color="auto" w:sz="4" w:space="0"/>
             </w:tcBorders>
-            <w:shd w:val="clear" w:color="auto" w:fill="auto"/>
-            <w:vAlign w:val="bottom"/>
           </w:tcPr>
           <w:p>
             <w:pPr>
-              <w:jc w:val="right"/>
-              <w:cnfStyle w:val="100000000000" w:firstRow="1" w:lastRow="0" w:firstColumn="0" w:lastColumn="0" w:oddVBand="0" w:evenVBand="0" w:oddHBand="0" w:evenHBand="0" w:firstRowFirstColumn="0" w:firstRowLastColumn="0" w:lastRowFirstColumn="0" w:lastRowLastColumn="0"/>
               <w:rPr>
                 <w:rFonts w:ascii="Segoe UI" w:hAnsi="Segoe UI" w:cs="Segoe UI"/>
                 <w:sz w:val="16"/>
@@ -156,10 +144,8 @@
           <w:tcPr>
             <w:tcW w:w="992" w:type="dxa"/>
             <w:tcBorders>
-              <w:bottom w:val="single" w:sz="4" w:space="0" w:color="auto"/>
+              <w:bottom w:val="single" w:color="auto" w:sz="4" w:space="0"/>
             </w:tcBorders>
-            <w:shd w:val="clear" w:color="auto" w:fill="auto"/>
-            <w:vAlign w:val="center"/>
           </w:tcPr>
           <w:sdt>
             <w:sdtPr>
@@ -168,14 +154,14 @@
                 <w:sz w:val="16"/>
                 <w:szCs w:val="16"/>
               </w:rPr>
-              <w:alias w:val="#Nav: /Labels/InvQtyLabel"/>
-              <w:tag w:val="#Nav: FS_YSR_InventoryCustomerSales/50003"/>
-              <w:id w:val="135541012"/>
+              <w:id w:val="1986968305"/>
               <w:placeholder>
-                <w:docPart w:val="9DDBA3633D6C4A31997050B21A372EF2"/>
+                <w:docPart w:val="DefaultPlaceholder_-1854013440"/>
               </w:placeholder>
-              <w:dataBinding w:prefixMappings="xmlns:ns0='urn:microsoft-dynamics-nav/reports/FS_YSR_InventoryCustomerSales/50003/'" w:xpath="/ns0:NavWordReportXmlPart[1]/ns0:Labels[1]/ns0:InvQtyLabel[1]" w:storeItemID="{17357049-351C-4FB5-BA49-88074E24903C}"/>
+              <w:dataBinding w:prefixMappings="xmlns:ns0='urn:microsoft-dynamics-nav/reports/Inventory_Customer_Sales/713/'" w:xpath="/ns0:NavWordReportXmlPart[1]/ns0:Labels[1]/ns0:InvQtyLbl[1]" w:storeItemID="{0E62280E-706F-45D7-BEE2-B24E4BE14C14}"/>
               <w:text/>
+              <w:alias w:val="#Nav: /Labels/InvQtyLbl"/>
+              <w:tag w:val="#Nav: Inventory_Customer_Sales/713"/>
             </w:sdtPr>
             <w:sdtContent>
               <w:p>
@@ -184,7 +170,6 @@
                     <w:tab w:val="left" w:pos="1711"/>
                   </w:tabs>
                   <w:jc w:val="right"/>
-                  <w:cnfStyle w:val="100000000000" w:firstRow="1" w:lastRow="0" w:firstColumn="0" w:lastColumn="0" w:oddVBand="0" w:evenVBand="0" w:oddHBand="0" w:evenHBand="0" w:firstRowFirstColumn="0" w:firstRowLastColumn="0" w:lastRowFirstColumn="0" w:lastRowLastColumn="0"/>
                   <w:rPr>
                     <w:rFonts w:ascii="Segoe UI" w:hAnsi="Segoe UI" w:cs="Segoe UI"/>
                     <w:sz w:val="16"/>
@@ -198,7 +183,7 @@
                     <w:sz w:val="16"/>
                     <w:szCs w:val="16"/>
                   </w:rPr>
-                  <w:t>InvQtyLabel</w:t>
+                  <w:t>InvQtyLbl</w:t>
                 </w:r>
                 <w:proofErr w:type="spellEnd"/>
               </w:p>
@@ -208,7 +193,6 @@
             <w:pPr>
               <w:ind w:right="320"/>
               <w:jc w:val="right"/>
-              <w:cnfStyle w:val="100000000000" w:firstRow="1" w:lastRow="0" w:firstColumn="0" w:lastColumn="0" w:oddVBand="0" w:evenVBand="0" w:oddHBand="0" w:evenHBand="0" w:firstRowFirstColumn="0" w:firstRowLastColumn="0" w:lastRowFirstColumn="0" w:lastRowLastColumn="0"/>
               <w:rPr>
                 <w:rFonts w:ascii="Segoe UI" w:hAnsi="Segoe UI" w:cs="Segoe UI"/>
                 <w:sz w:val="16"/>
@@ -224,24 +208,22 @@
               <w:sz w:val="16"/>
               <w:szCs w:val="16"/>
             </w:rPr>
-            <w:alias w:val="#Nav: /Labels/AmountLabel"/>
-            <w:tag w:val="#Nav: FS_YSR_InventoryCustomerSales/50003"/>
-            <w:id w:val="-1968493587"/>
+            <w:id w:val="208617712"/>
             <w:placeholder>
               <w:docPart w:val="DefaultPlaceholder_-1854013440"/>
             </w:placeholder>
-            <w:dataBinding w:prefixMappings="xmlns:ns0='urn:microsoft-dynamics-nav/reports/FS_YSR_InventoryCustomerSales/50003/'" w:xpath="/ns0:NavWordReportXmlPart[1]/ns0:Labels[1]/ns0:AmountLabel[1]" w:storeItemID="{17357049-351C-4FB5-BA49-88074E24903C}"/>
+            <w:dataBinding w:prefixMappings="xmlns:ns0='urn:microsoft-dynamics-nav/reports/Inventory_Customer_Sales/713/'" w:xpath="/ns0:NavWordReportXmlPart[1]/ns0:Labels[1]/ns0:AmountLbl[1]" w:storeItemID="{0E62280E-706F-45D7-BEE2-B24E4BE14C14}"/>
             <w:text/>
+            <w:alias w:val="#Nav: /Labels/AmountLbl"/>
+            <w:tag w:val="#Nav: Inventory_Customer_Sales/713"/>
           </w:sdtPr>
           <w:sdtContent>
             <w:tc>
               <w:tcPr>
                 <w:tcW w:w="992" w:type="dxa"/>
                 <w:tcBorders>
-                  <w:bottom w:val="single" w:sz="4" w:space="0" w:color="auto"/>
+                  <w:bottom w:val="single" w:color="auto" w:sz="4" w:space="0"/>
                 </w:tcBorders>
-                <w:shd w:val="clear" w:color="auto" w:fill="auto"/>
-                <w:vAlign w:val="center"/>
               </w:tcPr>
               <w:p>
                 <w:pPr>
@@ -249,7 +231,6 @@
                     <w:tab w:val="left" w:pos="1711"/>
                   </w:tabs>
                   <w:jc w:val="right"/>
-                  <w:cnfStyle w:val="100000000000" w:firstRow="1" w:lastRow="0" w:firstColumn="0" w:lastColumn="0" w:oddVBand="0" w:evenVBand="0" w:oddHBand="0" w:evenHBand="0" w:firstRowFirstColumn="0" w:firstRowLastColumn="0" w:lastRowFirstColumn="0" w:lastRowLastColumn="0"/>
                   <w:rPr>
                     <w:rFonts w:ascii="Segoe UI" w:hAnsi="Segoe UI" w:cs="Segoe UI"/>
                     <w:sz w:val="16"/>
@@ -263,7 +244,7 @@
                     <w:sz w:val="16"/>
                     <w:szCs w:val="16"/>
                   </w:rPr>
-                  <w:t>AmountLabel</w:t>
+                  <w:t>AmountLbl</w:t>
                 </w:r>
                 <w:proofErr w:type="spellEnd"/>
               </w:p>
@@ -274,10 +255,8 @@
           <w:tcPr>
             <w:tcW w:w="992" w:type="dxa"/>
             <w:tcBorders>
-              <w:bottom w:val="single" w:sz="4" w:space="0" w:color="auto"/>
+              <w:bottom w:val="single" w:color="auto" w:sz="4" w:space="0"/>
             </w:tcBorders>
-            <w:shd w:val="clear" w:color="auto" w:fill="auto"/>
-            <w:vAlign w:val="center"/>
           </w:tcPr>
           <w:sdt>
             <w:sdtPr>
@@ -286,14 +265,14 @@
                 <w:sz w:val="16"/>
                 <w:szCs w:val="16"/>
               </w:rPr>
-              <w:alias w:val="#Nav: /Labels/DiscountAmtLabel"/>
-              <w:tag w:val="#Nav: FS_YSR_InventoryCustomerSales/50003"/>
-              <w:id w:val="309132118"/>
+              <w:id w:val="1430861775"/>
               <w:placeholder>
-                <w:docPart w:val="D68FD56984E5485F84E4ED8C5C4B8C12"/>
+                <w:docPart w:val="DefaultPlaceholder_-1854013440"/>
               </w:placeholder>
-              <w:dataBinding w:prefixMappings="xmlns:ns0='urn:microsoft-dynamics-nav/reports/FS_YSR_InventoryCustomerSales/50003/'" w:xpath="/ns0:NavWordReportXmlPart[1]/ns0:Labels[1]/ns0:DiscountAmtLabel[1]" w:storeItemID="{17357049-351C-4FB5-BA49-88074E24903C}"/>
+              <w:dataBinding w:prefixMappings="xmlns:ns0='urn:microsoft-dynamics-nav/reports/Inventory_Customer_Sales/713/'" w:xpath="/ns0:NavWordReportXmlPart[1]/ns0:Labels[1]/ns0:DiscountAmtLbl[1]" w:storeItemID="{0E62280E-706F-45D7-BEE2-B24E4BE14C14}"/>
               <w:text/>
+              <w:alias w:val="#Nav: /Labels/DiscountAmtLbl"/>
+              <w:tag w:val="#Nav: Inventory_Customer_Sales/713"/>
             </w:sdtPr>
             <w:sdtContent>
               <w:p>
@@ -302,7 +281,6 @@
                     <w:tab w:val="left" w:pos="1711"/>
                   </w:tabs>
                   <w:jc w:val="right"/>
-                  <w:cnfStyle w:val="100000000000" w:firstRow="1" w:lastRow="0" w:firstColumn="0" w:lastColumn="0" w:oddVBand="0" w:evenVBand="0" w:oddHBand="0" w:evenHBand="0" w:firstRowFirstColumn="0" w:firstRowLastColumn="0" w:lastRowFirstColumn="0" w:lastRowLastColumn="0"/>
                   <w:rPr>
                     <w:rFonts w:ascii="Segoe UI" w:hAnsi="Segoe UI" w:cs="Segoe UI"/>
                     <w:sz w:val="16"/>
@@ -316,7 +294,7 @@
                     <w:sz w:val="16"/>
                     <w:szCs w:val="16"/>
                   </w:rPr>
-                  <w:t>DiscountAmtLabel</w:t>
+                  <w:t>DiscountAmtLbl</w:t>
                 </w:r>
                 <w:proofErr w:type="spellEnd"/>
               </w:p>
@@ -326,7 +304,6 @@
             <w:pPr>
               <w:ind w:right="320"/>
               <w:jc w:val="right"/>
-              <w:cnfStyle w:val="100000000000" w:firstRow="1" w:lastRow="0" w:firstColumn="0" w:lastColumn="0" w:oddVBand="0" w:evenVBand="0" w:oddHBand="0" w:evenHBand="0" w:firstRowFirstColumn="0" w:firstRowLastColumn="0" w:lastRowFirstColumn="0" w:lastRowLastColumn="0"/>
               <w:rPr>
                 <w:rFonts w:ascii="Segoe UI" w:hAnsi="Segoe UI" w:cs="Segoe UI"/>
                 <w:sz w:val="16"/>
@@ -342,24 +319,22 @@
               <w:sz w:val="16"/>
               <w:szCs w:val="16"/>
             </w:rPr>
-            <w:alias w:val="#Nav: /Labels/ProfitLabel"/>
-            <w:tag w:val="#Nav: FS_YSR_InventoryCustomerSales/50003"/>
-            <w:id w:val="-287818975"/>
+            <w:id w:val="-469984770"/>
             <w:placeholder>
               <w:docPart w:val="DefaultPlaceholder_-1854013440"/>
             </w:placeholder>
-            <w:dataBinding w:prefixMappings="xmlns:ns0='urn:microsoft-dynamics-nav/reports/FS_YSR_InventoryCustomerSales/50003/'" w:xpath="/ns0:NavWordReportXmlPart[1]/ns0:Labels[1]/ns0:ProfitLabel[1]" w:storeItemID="{17357049-351C-4FB5-BA49-88074E24903C}"/>
+            <w:dataBinding w:prefixMappings="xmlns:ns0='urn:microsoft-dynamics-nav/reports/Inventory_Customer_Sales/713/'" w:xpath="/ns0:NavWordReportXmlPart[1]/ns0:Labels[1]/ns0:ProfitLbl[1]" w:storeItemID="{0E62280E-706F-45D7-BEE2-B24E4BE14C14}"/>
             <w:text/>
+            <w:alias w:val="#Nav: /Labels/ProfitLbl"/>
+            <w:tag w:val="#Nav: Inventory_Customer_Sales/713"/>
           </w:sdtPr>
           <w:sdtContent>
             <w:tc>
               <w:tcPr>
                 <w:tcW w:w="993" w:type="dxa"/>
                 <w:tcBorders>
-                  <w:bottom w:val="single" w:sz="4" w:space="0" w:color="auto"/>
+                  <w:bottom w:val="single" w:color="auto" w:sz="4" w:space="0"/>
                 </w:tcBorders>
-                <w:shd w:val="clear" w:color="auto" w:fill="auto"/>
-                <w:vAlign w:val="center"/>
               </w:tcPr>
               <w:p>
                 <w:pPr>
@@ -367,11 +342,10 @@
                     <w:tab w:val="left" w:pos="1711"/>
                   </w:tabs>
                   <w:jc w:val="right"/>
-                  <w:cnfStyle w:val="100000000000" w:firstRow="1" w:lastRow="0" w:firstColumn="0" w:lastColumn="0" w:oddVBand="0" w:evenVBand="0" w:oddHBand="0" w:evenHBand="0" w:firstRowFirstColumn="0" w:firstRowLastColumn="0" w:lastRowFirstColumn="0" w:lastRowLastColumn="0"/>
                   <w:rPr>
                     <w:rFonts w:ascii="Segoe UI" w:hAnsi="Segoe UI" w:cs="Segoe UI"/>
-                    <w:b w:val="0"/>
-                    <w:bCs w:val="0"/>
+                    <w:b/>
+                    <w:bCs/>
                     <w:sz w:val="16"/>
                     <w:szCs w:val="16"/>
                   </w:rPr>
@@ -383,7 +357,7 @@
                     <w:sz w:val="16"/>
                     <w:szCs w:val="16"/>
                   </w:rPr>
-                  <w:t>ProfitLabel</w:t>
+                  <w:t>ProfitLbl</w:t>
                 </w:r>
                 <w:proofErr w:type="spellEnd"/>
               </w:p>
@@ -397,24 +371,22 @@
               <w:sz w:val="16"/>
               <w:szCs w:val="16"/>
             </w:rPr>
-            <w:alias w:val="#Nav: /Labels/ProfitPctLabel"/>
-            <w:tag w:val="#Nav: FS_YSR_InventoryCustomerSales/50003"/>
-            <w:id w:val="1767031759"/>
+            <w:id w:val="482126167"/>
             <w:placeholder>
               <w:docPart w:val="DefaultPlaceholder_-1854013440"/>
             </w:placeholder>
-            <w:dataBinding w:prefixMappings="xmlns:ns0='urn:microsoft-dynamics-nav/reports/FS_YSR_InventoryCustomerSales/50003/'" w:xpath="/ns0:NavWordReportXmlPart[1]/ns0:Labels[1]/ns0:ProfitPctLabel[1]" w:storeItemID="{17357049-351C-4FB5-BA49-88074E24903C}"/>
+            <w:dataBinding w:prefixMappings="xmlns:ns0='urn:microsoft-dynamics-nav/reports/Inventory_Customer_Sales/713/'" w:xpath="/ns0:NavWordReportXmlPart[1]/ns0:Labels[1]/ns0:ProfitPctLbl[1]" w:storeItemID="{0E62280E-706F-45D7-BEE2-B24E4BE14C14}"/>
             <w:text/>
+            <w:alias w:val="#Nav: /Labels/ProfitPctLbl"/>
+            <w:tag w:val="#Nav: Inventory_Customer_Sales/713"/>
           </w:sdtPr>
           <w:sdtContent>
             <w:tc>
               <w:tcPr>
                 <w:tcW w:w="992" w:type="dxa"/>
                 <w:tcBorders>
-                  <w:bottom w:val="single" w:sz="4" w:space="0" w:color="auto"/>
+                  <w:bottom w:val="single" w:color="auto" w:sz="4" w:space="0"/>
                 </w:tcBorders>
-                <w:shd w:val="clear" w:color="auto" w:fill="auto"/>
-                <w:vAlign w:val="center"/>
               </w:tcPr>
               <w:p>
                 <w:pPr>
@@ -422,7 +394,6 @@
                     <w:tab w:val="left" w:pos="1711"/>
                   </w:tabs>
                   <w:jc w:val="right"/>
-                  <w:cnfStyle w:val="100000000000" w:firstRow="1" w:lastRow="0" w:firstColumn="0" w:lastColumn="0" w:oddVBand="0" w:evenVBand="0" w:oddHBand="0" w:evenHBand="0" w:firstRowFirstColumn="0" w:firstRowLastColumn="0" w:lastRowFirstColumn="0" w:lastRowLastColumn="0"/>
                   <w:rPr>
                     <w:rFonts w:ascii="Segoe UI" w:hAnsi="Segoe UI" w:cs="Segoe UI"/>
                     <w:sz w:val="16"/>
@@ -436,7 +407,7 @@
                     <w:sz w:val="16"/>
                     <w:szCs w:val="16"/>
                   </w:rPr>
-                  <w:t>ProfitPctLabel</w:t>
+                  <w:t>ProfitPctLbl</w:t>
                 </w:r>
                 <w:proofErr w:type="spellEnd"/>
               </w:p>
@@ -446,24 +417,21 @@
       </w:tr>
       <w:tr>
         <w:trPr>
-          <w:cnfStyle w:val="000000100000" w:firstRow="0" w:lastRow="0" w:firstColumn="0" w:lastColumn="0" w:oddVBand="0" w:evenVBand="0" w:oddHBand="1" w:evenHBand="0" w:firstRowFirstColumn="0" w:firstRowLastColumn="0" w:lastRowFirstColumn="0" w:lastRowLastColumn="0"/>
-          <w:trHeight w:hRule="exact" w:val="113"/>
+          <w:trHeight w:val="113" w:hRule="exact"/>
         </w:trPr>
         <w:tc>
           <w:tcPr>
-            <w:cnfStyle w:val="001000000000" w:firstRow="0" w:lastRow="0" w:firstColumn="1" w:lastColumn="0" w:oddVBand="0" w:evenVBand="0" w:oddHBand="0" w:evenHBand="0" w:firstRowFirstColumn="0" w:firstRowLastColumn="0" w:lastRowFirstColumn="0" w:lastRowLastColumn="0"/>
             <w:tcW w:w="1276" w:type="dxa"/>
             <w:tcBorders>
-              <w:top w:val="single" w:sz="4" w:space="0" w:color="auto"/>
+              <w:top w:val="single" w:color="auto" w:sz="4" w:space="0"/>
             </w:tcBorders>
-            <w:shd w:val="clear" w:color="auto" w:fill="auto"/>
           </w:tcPr>
           <w:p>
             <w:pPr>
               <w:rPr>
                 <w:rFonts w:ascii="Segoe UI" w:hAnsi="Segoe UI" w:cs="Segoe UI"/>
-                <w:b w:val="0"/>
-                <w:bCs w:val="0"/>
+                <w:b/>
+                <w:bCs/>
                 <w:sz w:val="16"/>
                 <w:szCs w:val="16"/>
               </w:rPr>
@@ -474,13 +442,11 @@
           <w:tcPr>
             <w:tcW w:w="3544" w:type="dxa"/>
             <w:tcBorders>
-              <w:top w:val="single" w:sz="4" w:space="0" w:color="auto"/>
+              <w:top w:val="single" w:color="auto" w:sz="4" w:space="0"/>
             </w:tcBorders>
-            <w:shd w:val="clear" w:color="auto" w:fill="auto"/>
           </w:tcPr>
           <w:p>
             <w:pPr>
-              <w:cnfStyle w:val="000000100000" w:firstRow="0" w:lastRow="0" w:firstColumn="0" w:lastColumn="0" w:oddVBand="0" w:evenVBand="0" w:oddHBand="1" w:evenHBand="0" w:firstRowFirstColumn="0" w:firstRowLastColumn="0" w:lastRowFirstColumn="0" w:lastRowLastColumn="0"/>
               <w:rPr>
                 <w:rFonts w:ascii="Segoe UI" w:hAnsi="Segoe UI" w:cs="Segoe UI"/>
                 <w:sz w:val="16"/>
@@ -493,13 +459,11 @@
           <w:tcPr>
             <w:tcW w:w="709" w:type="dxa"/>
             <w:tcBorders>
-              <w:top w:val="single" w:sz="4" w:space="0" w:color="auto"/>
+              <w:top w:val="single" w:color="auto" w:sz="4" w:space="0"/>
             </w:tcBorders>
-            <w:shd w:val="clear" w:color="auto" w:fill="auto"/>
           </w:tcPr>
           <w:p>
             <w:pPr>
-              <w:cnfStyle w:val="000000100000" w:firstRow="0" w:lastRow="0" w:firstColumn="0" w:lastColumn="0" w:oddVBand="0" w:evenVBand="0" w:oddHBand="1" w:evenHBand="0" w:firstRowFirstColumn="0" w:firstRowLastColumn="0" w:lastRowFirstColumn="0" w:lastRowLastColumn="0"/>
               <w:rPr>
                 <w:rFonts w:ascii="Segoe UI" w:hAnsi="Segoe UI" w:cs="Segoe UI"/>
                 <w:sz w:val="16"/>
@@ -512,13 +476,12 @@
           <w:tcPr>
             <w:tcW w:w="992" w:type="dxa"/>
             <w:tcBorders>
-              <w:top w:val="single" w:sz="4" w:space="0" w:color="auto"/>
+              <w:top w:val="single" w:color="auto" w:sz="4" w:space="0"/>
             </w:tcBorders>
-            <w:shd w:val="clear" w:color="auto" w:fill="auto"/>
           </w:tcPr>
           <w:p>
             <w:pPr>
-              <w:cnfStyle w:val="000000100000" w:firstRow="0" w:lastRow="0" w:firstColumn="0" w:lastColumn="0" w:oddVBand="0" w:evenVBand="0" w:oddHBand="1" w:evenHBand="0" w:firstRowFirstColumn="0" w:firstRowLastColumn="0" w:lastRowFirstColumn="0" w:lastRowLastColumn="0"/>
+              <w:jc w:val="right"/>
               <w:rPr>
                 <w:rFonts w:ascii="Segoe UI" w:hAnsi="Segoe UI" w:cs="Segoe UI"/>
                 <w:sz w:val="16"/>
@@ -531,13 +494,12 @@
           <w:tcPr>
             <w:tcW w:w="992" w:type="dxa"/>
             <w:tcBorders>
-              <w:top w:val="single" w:sz="4" w:space="0" w:color="auto"/>
+              <w:top w:val="single" w:color="auto" w:sz="4" w:space="0"/>
             </w:tcBorders>
-            <w:shd w:val="clear" w:color="auto" w:fill="auto"/>
           </w:tcPr>
           <w:p>
             <w:pPr>
-              <w:cnfStyle w:val="000000100000" w:firstRow="0" w:lastRow="0" w:firstColumn="0" w:lastColumn="0" w:oddVBand="0" w:evenVBand="0" w:oddHBand="1" w:evenHBand="0" w:firstRowFirstColumn="0" w:firstRowLastColumn="0" w:lastRowFirstColumn="0" w:lastRowLastColumn="0"/>
+              <w:jc w:val="right"/>
               <w:rPr>
                 <w:rFonts w:ascii="Segoe UI" w:hAnsi="Segoe UI" w:cs="Segoe UI"/>
                 <w:sz w:val="16"/>
@@ -550,13 +512,12 @@
           <w:tcPr>
             <w:tcW w:w="992" w:type="dxa"/>
             <w:tcBorders>
-              <w:top w:val="single" w:sz="4" w:space="0" w:color="auto"/>
+              <w:top w:val="single" w:color="auto" w:sz="4" w:space="0"/>
             </w:tcBorders>
-            <w:shd w:val="clear" w:color="auto" w:fill="auto"/>
           </w:tcPr>
           <w:p>
             <w:pPr>
-              <w:cnfStyle w:val="000000100000" w:firstRow="0" w:lastRow="0" w:firstColumn="0" w:lastColumn="0" w:oddVBand="0" w:evenVBand="0" w:oddHBand="1" w:evenHBand="0" w:firstRowFirstColumn="0" w:firstRowLastColumn="0" w:lastRowFirstColumn="0" w:lastRowLastColumn="0"/>
+              <w:jc w:val="right"/>
               <w:rPr>
                 <w:rFonts w:ascii="Segoe UI" w:hAnsi="Segoe UI" w:cs="Segoe UI"/>
                 <w:sz w:val="16"/>
@@ -569,13 +530,12 @@
           <w:tcPr>
             <w:tcW w:w="993" w:type="dxa"/>
             <w:tcBorders>
-              <w:top w:val="single" w:sz="4" w:space="0" w:color="auto"/>
+              <w:top w:val="single" w:color="auto" w:sz="4" w:space="0"/>
             </w:tcBorders>
-            <w:shd w:val="clear" w:color="auto" w:fill="auto"/>
           </w:tcPr>
           <w:p>
             <w:pPr>
-              <w:cnfStyle w:val="000000100000" w:firstRow="0" w:lastRow="0" w:firstColumn="0" w:lastColumn="0" w:oddVBand="0" w:evenVBand="0" w:oddHBand="1" w:evenHBand="0" w:firstRowFirstColumn="0" w:firstRowLastColumn="0" w:lastRowFirstColumn="0" w:lastRowLastColumn="0"/>
+              <w:jc w:val="right"/>
               <w:rPr>
                 <w:rFonts w:ascii="Segoe UI" w:hAnsi="Segoe UI" w:cs="Segoe UI"/>
                 <w:sz w:val="16"/>
@@ -588,13 +548,12 @@
           <w:tcPr>
             <w:tcW w:w="992" w:type="dxa"/>
             <w:tcBorders>
-              <w:top w:val="single" w:sz="4" w:space="0" w:color="auto"/>
+              <w:top w:val="single" w:color="auto" w:sz="4" w:space="0"/>
             </w:tcBorders>
-            <w:shd w:val="clear" w:color="auto" w:fill="auto"/>
           </w:tcPr>
           <w:p>
             <w:pPr>
-              <w:cnfStyle w:val="000000100000" w:firstRow="0" w:lastRow="0" w:firstColumn="0" w:lastColumn="0" w:oddVBand="0" w:evenVBand="0" w:oddHBand="1" w:evenHBand="0" w:firstRowFirstColumn="0" w:firstRowLastColumn="0" w:lastRowFirstColumn="0" w:lastRowLastColumn="0"/>
+              <w:jc w:val="right"/>
               <w:rPr>
                 <w:rFonts w:ascii="Segoe UI" w:hAnsi="Segoe UI" w:cs="Segoe UI"/>
                 <w:sz w:val="16"/>
@@ -608,20 +567,22 @@
         <w:sdtPr>
           <w:rPr>
             <w:rFonts w:ascii="Segoe UI" w:hAnsi="Segoe UI" w:cs="Segoe UI"/>
-            <w:b w:val="0"/>
-            <w:bCs w:val="0"/>
+            <w:b/>
+            <w:bCs/>
             <w:sz w:val="16"/>
             <w:szCs w:val="16"/>
             <w:lang w:eastAsia="zh-CN"/>
           </w:rPr>
           <w:alias w:val="#Nav: /Item"/>
-          <w:tag w:val="#Nav: FS_YSR_InventoryCustomerSales/50003"/>
+          <w:tag w:val="#Nav: Inventory_Customer_Sales/713"/>
           <w:id w:val="37015946"/>
-          <w15:dataBinding w:prefixMappings="xmlns:ns0='urn:microsoft-dynamics-nav/reports/FS_YSR_InventoryCustomerSales/50003/' " w:xpath="/ns0:NavWordReportXmlPart[1]/ns0:Item" w:storeItemID="{17357049-351C-4FB5-BA49-88074E24903C}"/>
+          <w15:dataBinding w:prefixMappings="xmlns:ns0='urn:microsoft-dynamics-nav/reports/Inventory_Customer_Sales/713/'" w:xpath="/ns0:NavWordReportXmlPart[1]/ns0:Item" w:storeItemID="{0E62280E-706F-45D7-BEE2-B24E4BE14C14}"/>
           <w15:repeatingSection/>
         </w:sdtPr>
         <w:sdtEndPr>
           <w:rPr>
+            <w:b w:val="0"/>
+            <w:bCs w:val="0"/>
             <w:lang w:eastAsia="ja-JP"/>
           </w:rPr>
         </w:sdtEndPr>
@@ -630,8 +591,8 @@
             <w:sdtPr>
               <w:rPr>
                 <w:rFonts w:ascii="Segoe UI" w:hAnsi="Segoe UI" w:cs="Segoe UI"/>
-                <w:b w:val="0"/>
-                <w:bCs w:val="0"/>
+                <w:b/>
+                <w:bCs/>
                 <w:sz w:val="16"/>
                 <w:szCs w:val="16"/>
                 <w:lang w:eastAsia="zh-CN"/>
@@ -644,20 +605,19 @@
             </w:sdtPr>
             <w:sdtEndPr>
               <w:rPr>
+                <w:b w:val="0"/>
+                <w:bCs w:val="0"/>
                 <w:lang w:eastAsia="ja-JP"/>
               </w:rPr>
             </w:sdtEndPr>
             <w:sdtContent>
               <w:tr>
                 <w:trPr>
-                  <w:trHeight w:hRule="exact" w:val="91"/>
+                  <w:trHeight w:val="91" w:hRule="exact"/>
                 </w:trPr>
                 <w:tc>
                   <w:tcPr>
-                    <w:cnfStyle w:val="001000000000" w:firstRow="0" w:lastRow="0" w:firstColumn="1" w:lastColumn="0" w:oddVBand="0" w:evenVBand="0" w:oddHBand="0" w:evenHBand="0" w:firstRowFirstColumn="0" w:firstRowLastColumn="0" w:lastRowFirstColumn="0" w:lastRowLastColumn="0"/>
                     <w:tcW w:w="1276" w:type="dxa"/>
-                    <w:shd w:val="clear" w:color="auto" w:fill="auto"/>
-                    <w:vAlign w:val="bottom"/>
                   </w:tcPr>
                   <w:p>
                     <w:pPr>
@@ -673,12 +633,9 @@
                   <w:tcPr>
                     <w:tcW w:w="4253" w:type="dxa"/>
                     <w:gridSpan w:val="2"/>
-                    <w:shd w:val="clear" w:color="auto" w:fill="auto"/>
-                    <w:vAlign w:val="bottom"/>
                   </w:tcPr>
                   <w:p>
                     <w:pPr>
-                      <w:cnfStyle w:val="000000000000" w:firstRow="0" w:lastRow="0" w:firstColumn="0" w:lastColumn="0" w:oddVBand="0" w:evenVBand="0" w:oddHBand="0" w:evenHBand="0" w:firstRowFirstColumn="0" w:firstRowLastColumn="0" w:lastRowFirstColumn="0" w:lastRowLastColumn="0"/>
                       <w:rPr>
                         <w:rFonts w:ascii="Segoe UI" w:hAnsi="Segoe UI" w:cs="Segoe UI"/>
                         <w:b/>
@@ -692,13 +649,11 @@
                 <w:tc>
                   <w:tcPr>
                     <w:tcW w:w="992" w:type="dxa"/>
-                    <w:shd w:val="clear" w:color="auto" w:fill="auto"/>
-                    <w:vAlign w:val="bottom"/>
                   </w:tcPr>
                   <w:p>
                     <w:pPr>
                       <w:spacing w:after="120"/>
-                      <w:cnfStyle w:val="000000000000" w:firstRow="0" w:lastRow="0" w:firstColumn="0" w:lastColumn="0" w:oddVBand="0" w:evenVBand="0" w:oddHBand="0" w:evenHBand="0" w:firstRowFirstColumn="0" w:firstRowLastColumn="0" w:lastRowFirstColumn="0" w:lastRowLastColumn="0"/>
+                      <w:jc w:val="right"/>
                       <w:rPr>
                         <w:rFonts w:ascii="Segoe UI" w:hAnsi="Segoe UI" w:cs="Segoe UI"/>
                         <w:b/>
@@ -712,14 +667,11 @@
                 <w:tc>
                   <w:tcPr>
                     <w:tcW w:w="992" w:type="dxa"/>
-                    <w:shd w:val="clear" w:color="auto" w:fill="auto"/>
-                    <w:vAlign w:val="bottom"/>
                   </w:tcPr>
                   <w:p>
                     <w:pPr>
                       <w:spacing w:after="120"/>
                       <w:jc w:val="right"/>
-                      <w:cnfStyle w:val="000000000000" w:firstRow="0" w:lastRow="0" w:firstColumn="0" w:lastColumn="0" w:oddVBand="0" w:evenVBand="0" w:oddHBand="0" w:evenHBand="0" w:firstRowFirstColumn="0" w:firstRowLastColumn="0" w:lastRowFirstColumn="0" w:lastRowLastColumn="0"/>
                       <w:rPr>
                         <w:rFonts w:ascii="Segoe UI" w:hAnsi="Segoe UI" w:cs="Segoe UI"/>
                         <w:b/>
@@ -733,14 +685,11 @@
                 <w:tc>
                   <w:tcPr>
                     <w:tcW w:w="992" w:type="dxa"/>
-                    <w:shd w:val="clear" w:color="auto" w:fill="auto"/>
-                    <w:vAlign w:val="bottom"/>
                   </w:tcPr>
                   <w:p>
                     <w:pPr>
                       <w:spacing w:after="120"/>
                       <w:jc w:val="right"/>
-                      <w:cnfStyle w:val="000000000000" w:firstRow="0" w:lastRow="0" w:firstColumn="0" w:lastColumn="0" w:oddVBand="0" w:evenVBand="0" w:oddHBand="0" w:evenHBand="0" w:firstRowFirstColumn="0" w:firstRowLastColumn="0" w:lastRowFirstColumn="0" w:lastRowLastColumn="0"/>
                       <w:rPr>
                         <w:rFonts w:ascii="Segoe UI" w:hAnsi="Segoe UI" w:cs="Segoe UI"/>
                         <w:b/>
@@ -754,14 +703,11 @@
                 <w:tc>
                   <w:tcPr>
                     <w:tcW w:w="993" w:type="dxa"/>
-                    <w:shd w:val="clear" w:color="auto" w:fill="auto"/>
-                    <w:vAlign w:val="bottom"/>
                   </w:tcPr>
                   <w:p>
                     <w:pPr>
                       <w:spacing w:after="120"/>
                       <w:jc w:val="right"/>
-                      <w:cnfStyle w:val="000000000000" w:firstRow="0" w:lastRow="0" w:firstColumn="0" w:lastColumn="0" w:oddVBand="0" w:evenVBand="0" w:oddHBand="0" w:evenHBand="0" w:firstRowFirstColumn="0" w:firstRowLastColumn="0" w:lastRowFirstColumn="0" w:lastRowLastColumn="0"/>
                       <w:rPr>
                         <w:rFonts w:ascii="Segoe UI" w:hAnsi="Segoe UI" w:cs="Segoe UI"/>
                         <w:b/>
@@ -775,14 +721,11 @@
                 <w:tc>
                   <w:tcPr>
                     <w:tcW w:w="992" w:type="dxa"/>
-                    <w:shd w:val="clear" w:color="auto" w:fill="auto"/>
-                    <w:vAlign w:val="bottom"/>
                   </w:tcPr>
                   <w:p>
                     <w:pPr>
                       <w:spacing w:after="120"/>
                       <w:jc w:val="right"/>
-                      <w:cnfStyle w:val="000000000000" w:firstRow="0" w:lastRow="0" w:firstColumn="0" w:lastColumn="0" w:oddVBand="0" w:evenVBand="0" w:oddHBand="0" w:evenHBand="0" w:firstRowFirstColumn="0" w:firstRowLastColumn="0" w:lastRowFirstColumn="0" w:lastRowLastColumn="0"/>
                       <w:rPr>
                         <w:rFonts w:ascii="Segoe UI" w:hAnsi="Segoe UI" w:cs="Segoe UI"/>
                         <w:b/>
@@ -796,8 +739,7 @@
               </w:tr>
               <w:tr>
                 <w:trPr>
-                  <w:cnfStyle w:val="000000100000" w:firstRow="0" w:lastRow="0" w:firstColumn="0" w:lastColumn="0" w:oddVBand="0" w:evenVBand="0" w:oddHBand="1" w:evenHBand="0" w:firstRowFirstColumn="0" w:firstRowLastColumn="0" w:lastRowFirstColumn="0" w:lastRowLastColumn="0"/>
-                  <w:trHeight w:hRule="exact" w:val="227"/>
+                  <w:trHeight w:val="227" w:hRule="exact"/>
                 </w:trPr>
                 <w:sdt>
                   <w:sdtPr>
@@ -812,15 +754,12 @@
                     <w:placeholder>
                       <w:docPart w:val="DefaultPlaceholder_-1854013440"/>
                     </w:placeholder>
-                    <w15:dataBinding w:prefixMappings="xmlns:ns0='urn:microsoft-dynamics-nav/reports/FS_YSR_InventoryCustomerSales/50003/' " w:xpath="/ns0:NavWordReportXmlPart[1]/ns0:Item[1]/ns0:No_Item[1]" w:storeItemID="{17357049-351C-4FB5-BA49-88074E24903C}" w16sdtdh:storeItemChecksum="xzfrIg=="/>
+                    <w15:dataBinding w:prefixMappings="xmlns:ns0='urn:microsoft-dynamics-nav/reports/FS_YSR_InventoryCustomerSales/50003/' " w:xpath="/ns0:NavWordReportXmlPart[1]/ns0:Item[1]/ns0:No_Item[1]" w:storeItemID="{17357049-351C-4FB5-BA49-88074E24903C}"/>
                   </w:sdtPr>
                   <w:sdtContent>
                     <w:tc>
                       <w:tcPr>
-                        <w:cnfStyle w:val="001000000000" w:firstRow="0" w:lastRow="0" w:firstColumn="1" w:lastColumn="0" w:oddVBand="0" w:evenVBand="0" w:oddHBand="0" w:evenHBand="0" w:firstRowFirstColumn="0" w:firstRowLastColumn="0" w:lastRowFirstColumn="0" w:lastRowLastColumn="0"/>
                         <w:tcW w:w="1276" w:type="dxa"/>
-                        <w:shd w:val="clear" w:color="auto" w:fill="auto"/>
-                        <w:vAlign w:val="center"/>
                       </w:tcPr>
                       <w:p>
                         <w:pPr>
@@ -859,19 +798,16 @@
                     <w:placeholder>
                       <w:docPart w:val="DefaultPlaceholder_-1854013440"/>
                     </w:placeholder>
-                    <w15:dataBinding w:prefixMappings="xmlns:ns0='urn:microsoft-dynamics-nav/reports/FS_YSR_InventoryCustomerSales/50003/' " w:xpath="/ns0:NavWordReportXmlPart[1]/ns0:Item[1]/ns0:Description_Item[1]" w:storeItemID="{17357049-351C-4FB5-BA49-88074E24903C}" w16sdtdh:storeItemChecksum="xzfrIg=="/>
+                    <w15:dataBinding w:prefixMappings="xmlns:ns0='urn:microsoft-dynamics-nav/reports/FS_YSR_InventoryCustomerSales/50003/' " w:xpath="/ns0:NavWordReportXmlPart[1]/ns0:Item[1]/ns0:Description_Item[1]" w:storeItemID="{17357049-351C-4FB5-BA49-88074E24903C}"/>
                   </w:sdtPr>
                   <w:sdtContent>
                     <w:tc>
                       <w:tcPr>
                         <w:tcW w:w="4253" w:type="dxa"/>
                         <w:gridSpan w:val="2"/>
-                        <w:shd w:val="clear" w:color="auto" w:fill="auto"/>
-                        <w:vAlign w:val="center"/>
                       </w:tcPr>
                       <w:p>
                         <w:pPr>
-                          <w:cnfStyle w:val="000000100000" w:firstRow="0" w:lastRow="0" w:firstColumn="0" w:lastColumn="0" w:oddVBand="0" w:evenVBand="0" w:oddHBand="1" w:evenHBand="0" w:firstRowFirstColumn="0" w:firstRowLastColumn="0" w:lastRowFirstColumn="0" w:lastRowLastColumn="0"/>
                           <w:rPr>
                             <w:rFonts w:ascii="Segoe UI" w:hAnsi="Segoe UI" w:cs="Segoe UI"/>
                             <w:b/>
@@ -899,13 +835,11 @@
                 <w:tc>
                   <w:tcPr>
                     <w:tcW w:w="992" w:type="dxa"/>
-                    <w:shd w:val="clear" w:color="auto" w:fill="auto"/>
-                    <w:vAlign w:val="bottom"/>
                   </w:tcPr>
                   <w:p>
                     <w:pPr>
                       <w:spacing w:after="120"/>
-                      <w:cnfStyle w:val="000000100000" w:firstRow="0" w:lastRow="0" w:firstColumn="0" w:lastColumn="0" w:oddVBand="0" w:evenVBand="0" w:oddHBand="1" w:evenHBand="0" w:firstRowFirstColumn="0" w:firstRowLastColumn="0" w:lastRowFirstColumn="0" w:lastRowLastColumn="0"/>
+                      <w:jc w:val="right"/>
                       <w:rPr>
                         <w:rFonts w:ascii="Segoe UI" w:hAnsi="Segoe UI" w:cs="Segoe UI"/>
                         <w:b/>
@@ -919,14 +853,11 @@
                 <w:tc>
                   <w:tcPr>
                     <w:tcW w:w="992" w:type="dxa"/>
-                    <w:shd w:val="clear" w:color="auto" w:fill="auto"/>
-                    <w:vAlign w:val="bottom"/>
                   </w:tcPr>
                   <w:p>
                     <w:pPr>
                       <w:spacing w:after="120"/>
                       <w:jc w:val="right"/>
-                      <w:cnfStyle w:val="000000100000" w:firstRow="0" w:lastRow="0" w:firstColumn="0" w:lastColumn="0" w:oddVBand="0" w:evenVBand="0" w:oddHBand="1" w:evenHBand="0" w:firstRowFirstColumn="0" w:firstRowLastColumn="0" w:lastRowFirstColumn="0" w:lastRowLastColumn="0"/>
                       <w:rPr>
                         <w:rFonts w:ascii="Segoe UI" w:hAnsi="Segoe UI" w:cs="Segoe UI"/>
                         <w:b/>
@@ -940,14 +871,11 @@
                 <w:tc>
                   <w:tcPr>
                     <w:tcW w:w="992" w:type="dxa"/>
-                    <w:shd w:val="clear" w:color="auto" w:fill="auto"/>
-                    <w:vAlign w:val="bottom"/>
                   </w:tcPr>
                   <w:p>
                     <w:pPr>
                       <w:spacing w:after="120"/>
                       <w:jc w:val="right"/>
-                      <w:cnfStyle w:val="000000100000" w:firstRow="0" w:lastRow="0" w:firstColumn="0" w:lastColumn="0" w:oddVBand="0" w:evenVBand="0" w:oddHBand="1" w:evenHBand="0" w:firstRowFirstColumn="0" w:firstRowLastColumn="0" w:lastRowFirstColumn="0" w:lastRowLastColumn="0"/>
                       <w:rPr>
                         <w:rFonts w:ascii="Segoe UI" w:hAnsi="Segoe UI" w:cs="Segoe UI"/>
                         <w:b/>
@@ -961,14 +889,11 @@
                 <w:tc>
                   <w:tcPr>
                     <w:tcW w:w="993" w:type="dxa"/>
-                    <w:shd w:val="clear" w:color="auto" w:fill="auto"/>
-                    <w:vAlign w:val="bottom"/>
                   </w:tcPr>
                   <w:p>
                     <w:pPr>
                       <w:spacing w:after="120"/>
                       <w:jc w:val="right"/>
-                      <w:cnfStyle w:val="000000100000" w:firstRow="0" w:lastRow="0" w:firstColumn="0" w:lastColumn="0" w:oddVBand="0" w:evenVBand="0" w:oddHBand="1" w:evenHBand="0" w:firstRowFirstColumn="0" w:firstRowLastColumn="0" w:lastRowFirstColumn="0" w:lastRowLastColumn="0"/>
                       <w:rPr>
                         <w:rFonts w:ascii="Segoe UI" w:hAnsi="Segoe UI" w:cs="Segoe UI"/>
                         <w:b/>
@@ -982,14 +907,11 @@
                 <w:tc>
                   <w:tcPr>
                     <w:tcW w:w="992" w:type="dxa"/>
-                    <w:shd w:val="clear" w:color="auto" w:fill="auto"/>
-                    <w:vAlign w:val="bottom"/>
                   </w:tcPr>
                   <w:p>
                     <w:pPr>
                       <w:spacing w:after="120"/>
                       <w:jc w:val="right"/>
-                      <w:cnfStyle w:val="000000100000" w:firstRow="0" w:lastRow="0" w:firstColumn="0" w:lastColumn="0" w:oddVBand="0" w:evenVBand="0" w:oddHBand="1" w:evenHBand="0" w:firstRowFirstColumn="0" w:firstRowLastColumn="0" w:lastRowFirstColumn="0" w:lastRowLastColumn="0"/>
                       <w:rPr>
                         <w:rFonts w:ascii="Segoe UI" w:hAnsi="Segoe UI" w:cs="Segoe UI"/>
                         <w:b/>
@@ -1003,14 +925,11 @@
               </w:tr>
               <w:tr>
                 <w:trPr>
-                  <w:trHeight w:hRule="exact" w:val="198"/>
+                  <w:trHeight w:val="198" w:hRule="exact"/>
                 </w:trPr>
                 <w:tc>
                   <w:tcPr>
-                    <w:cnfStyle w:val="001000000000" w:firstRow="0" w:lastRow="0" w:firstColumn="1" w:lastColumn="0" w:oddVBand="0" w:evenVBand="0" w:oddHBand="0" w:evenHBand="0" w:firstRowFirstColumn="0" w:firstRowLastColumn="0" w:lastRowFirstColumn="0" w:lastRowLastColumn="0"/>
                     <w:tcW w:w="1276" w:type="dxa"/>
-                    <w:shd w:val="clear" w:color="auto" w:fill="auto"/>
-                    <w:vAlign w:val="center"/>
                   </w:tcPr>
                   <w:p>
                     <w:pPr>
@@ -1030,24 +949,21 @@
                       <w:szCs w:val="16"/>
                     </w:rPr>
                     <w:alias w:val="#Nav: /Labels/BaseUnitofMeasure_ItemCaption"/>
-                    <w:tag w:val="#Nav: FS_YSR_InventoryCustomerSales/50003"/>
+                    <w:tag w:val="#Nav: Inventory_Customer_Sales/713"/>
                     <w:id w:val="-1204844"/>
                     <w:placeholder>
                       <w:docPart w:val="DefaultPlaceholder_-1854013440"/>
                     </w:placeholder>
-                    <w:dataBinding w:prefixMappings="xmlns:ns0='urn:microsoft-dynamics-nav/reports/FS_YSR_InventoryCustomerSales/50003/'" w:xpath="/ns0:NavWordReportXmlPart[1]/ns0:Labels[1]/ns0:BaseUnitofMeasure_ItemCaption[1]" w:storeItemID="{17357049-351C-4FB5-BA49-88074E24903C}"/>
+                    <w:dataBinding w:prefixMappings="xmlns:ns0='urn:microsoft-dynamics-nav/reports/Inventory_Customer_Sales/713/'" w:xpath="/ns0:NavWordReportXmlPart[1]/ns0:Labels[1]/ns0:BaseUnitofMeasure_ItemCaption[1]" w:storeItemID="{0E62280E-706F-45D7-BEE2-B24E4BE14C14}"/>
                     <w:text/>
                   </w:sdtPr>
                   <w:sdtContent>
                     <w:tc>
                       <w:tcPr>
                         <w:tcW w:w="3544" w:type="dxa"/>
-                        <w:shd w:val="clear" w:color="auto" w:fill="auto"/>
-                        <w:vAlign w:val="center"/>
                       </w:tcPr>
                       <w:p>
                         <w:pPr>
-                          <w:cnfStyle w:val="000000000000" w:firstRow="0" w:lastRow="0" w:firstColumn="0" w:lastColumn="0" w:oddVBand="0" w:evenVBand="0" w:oddHBand="0" w:evenHBand="0" w:firstRowFirstColumn="0" w:firstRowLastColumn="0" w:lastRowFirstColumn="0" w:lastRowLastColumn="0"/>
                           <w:rPr>
                             <w:rFonts w:ascii="Segoe UI" w:hAnsi="Segoe UI" w:cs="Segoe UI"/>
                             <w:sz w:val="16"/>
@@ -1081,18 +997,15 @@
                     <w:placeholder>
                       <w:docPart w:val="DefaultPlaceholder_-1854013440"/>
                     </w:placeholder>
-                    <w15:dataBinding w:prefixMappings="xmlns:ns0='urn:microsoft-dynamics-nav/reports/FS_YSR_InventoryCustomerSales/50003/' " w:xpath="/ns0:NavWordReportXmlPart[1]/ns0:Item[1]/ns0:BaseUnitofMeasure_Item[1]" w:storeItemID="{17357049-351C-4FB5-BA49-88074E24903C}" w16sdtdh:storeItemChecksum="xzfrIg=="/>
+                    <w15:dataBinding w:prefixMappings="xmlns:ns0='urn:microsoft-dynamics-nav/reports/FS_YSR_InventoryCustomerSales/50003/' " w:xpath="/ns0:NavWordReportXmlPart[1]/ns0:Item[1]/ns0:BaseUnitofMeasure_Item[1]" w:storeItemID="{17357049-351C-4FB5-BA49-88074E24903C}"/>
                   </w:sdtPr>
                   <w:sdtContent>
                     <w:tc>
                       <w:tcPr>
                         <w:tcW w:w="709" w:type="dxa"/>
-                        <w:shd w:val="clear" w:color="auto" w:fill="auto"/>
-                        <w:vAlign w:val="center"/>
                       </w:tcPr>
                       <w:p>
                         <w:pPr>
-                          <w:cnfStyle w:val="000000000000" w:firstRow="0" w:lastRow="0" w:firstColumn="0" w:lastColumn="0" w:oddVBand="0" w:evenVBand="0" w:oddHBand="0" w:evenHBand="0" w:firstRowFirstColumn="0" w:firstRowLastColumn="0" w:lastRowFirstColumn="0" w:lastRowLastColumn="0"/>
                           <w:rPr>
                             <w:rFonts w:ascii="Segoe UI" w:hAnsi="Segoe UI" w:cs="Segoe UI"/>
                             <w:sz w:val="16"/>
@@ -1116,11 +1029,10 @@
                 <w:tc>
                   <w:tcPr>
                     <w:tcW w:w="992" w:type="dxa"/>
-                    <w:shd w:val="clear" w:color="auto" w:fill="auto"/>
                   </w:tcPr>
                   <w:p>
                     <w:pPr>
-                      <w:cnfStyle w:val="000000000000" w:firstRow="0" w:lastRow="0" w:firstColumn="0" w:lastColumn="0" w:oddVBand="0" w:evenVBand="0" w:oddHBand="0" w:evenHBand="0" w:firstRowFirstColumn="0" w:firstRowLastColumn="0" w:lastRowFirstColumn="0" w:lastRowLastColumn="0"/>
+                      <w:jc w:val="right"/>
                       <w:rPr>
                         <w:rFonts w:ascii="Segoe UI" w:hAnsi="Segoe UI" w:cs="Segoe UI"/>
                         <w:sz w:val="16"/>
@@ -1132,11 +1044,10 @@
                 <w:tc>
                   <w:tcPr>
                     <w:tcW w:w="992" w:type="dxa"/>
-                    <w:shd w:val="clear" w:color="auto" w:fill="auto"/>
                   </w:tcPr>
                   <w:p>
                     <w:pPr>
-                      <w:cnfStyle w:val="000000000000" w:firstRow="0" w:lastRow="0" w:firstColumn="0" w:lastColumn="0" w:oddVBand="0" w:evenVBand="0" w:oddHBand="0" w:evenHBand="0" w:firstRowFirstColumn="0" w:firstRowLastColumn="0" w:lastRowFirstColumn="0" w:lastRowLastColumn="0"/>
+                      <w:jc w:val="right"/>
                       <w:rPr>
                         <w:rFonts w:ascii="Segoe UI" w:hAnsi="Segoe UI" w:cs="Segoe UI"/>
                         <w:sz w:val="16"/>
@@ -1148,11 +1059,10 @@
                 <w:tc>
                   <w:tcPr>
                     <w:tcW w:w="992" w:type="dxa"/>
-                    <w:shd w:val="clear" w:color="auto" w:fill="auto"/>
                   </w:tcPr>
                   <w:p>
                     <w:pPr>
-                      <w:cnfStyle w:val="000000000000" w:firstRow="0" w:lastRow="0" w:firstColumn="0" w:lastColumn="0" w:oddVBand="0" w:evenVBand="0" w:oddHBand="0" w:evenHBand="0" w:firstRowFirstColumn="0" w:firstRowLastColumn="0" w:lastRowFirstColumn="0" w:lastRowLastColumn="0"/>
+                      <w:jc w:val="right"/>
                       <w:rPr>
                         <w:rFonts w:ascii="Segoe UI" w:hAnsi="Segoe UI" w:cs="Segoe UI"/>
                         <w:sz w:val="16"/>
@@ -1164,11 +1074,10 @@
                 <w:tc>
                   <w:tcPr>
                     <w:tcW w:w="993" w:type="dxa"/>
-                    <w:shd w:val="clear" w:color="auto" w:fill="auto"/>
                   </w:tcPr>
                   <w:p>
                     <w:pPr>
-                      <w:cnfStyle w:val="000000000000" w:firstRow="0" w:lastRow="0" w:firstColumn="0" w:lastColumn="0" w:oddVBand="0" w:evenVBand="0" w:oddHBand="0" w:evenHBand="0" w:firstRowFirstColumn="0" w:firstRowLastColumn="0" w:lastRowFirstColumn="0" w:lastRowLastColumn="0"/>
+                      <w:jc w:val="right"/>
                       <w:rPr>
                         <w:rFonts w:ascii="Segoe UI" w:hAnsi="Segoe UI" w:cs="Segoe UI"/>
                         <w:sz w:val="16"/>
@@ -1180,11 +1089,10 @@
                 <w:tc>
                   <w:tcPr>
                     <w:tcW w:w="992" w:type="dxa"/>
-                    <w:shd w:val="clear" w:color="auto" w:fill="auto"/>
                   </w:tcPr>
                   <w:p>
                     <w:pPr>
-                      <w:cnfStyle w:val="000000000000" w:firstRow="0" w:lastRow="0" w:firstColumn="0" w:lastColumn="0" w:oddVBand="0" w:evenVBand="0" w:oddHBand="0" w:evenHBand="0" w:firstRowFirstColumn="0" w:firstRowLastColumn="0" w:lastRowFirstColumn="0" w:lastRowLastColumn="0"/>
+                      <w:jc w:val="right"/>
                       <w:rPr>
                         <w:rFonts w:ascii="Segoe UI" w:hAnsi="Segoe UI" w:cs="Segoe UI"/>
                         <w:sz w:val="16"/>
@@ -1198,25 +1106,31 @@
                 <w:sdtPr>
                   <w:rPr>
                     <w:rFonts w:ascii="Segoe UI" w:hAnsi="Segoe UI" w:cs="Segoe UI"/>
-                    <w:b w:val="0"/>
-                    <w:bCs w:val="0"/>
+                    <w:b/>
+                    <w:bCs/>
                     <w:sz w:val="16"/>
                     <w:szCs w:val="16"/>
                     <w:lang w:eastAsia="zh-CN"/>
                   </w:rPr>
                   <w:alias w:val="#Nav: /Item/Item_Ledger_Entry"/>
-                  <w:tag w:val="#Nav: FS_YSR_InventoryCustomerSales/50003"/>
+                  <w:tag w:val="#Nav: Inventory_Customer_Sales/713"/>
                   <w:id w:val="100769726"/>
-                  <w15:dataBinding w:prefixMappings="xmlns:ns0='urn:microsoft-dynamics-nav/reports/FS_YSR_InventoryCustomerSales/50003/' " w:xpath="/ns0:NavWordReportXmlPart[1]/ns0:Item[1]/ns0:Item_Ledger_Entry" w:storeItemID="{17357049-351C-4FB5-BA49-88074E24903C}"/>
+                  <w15:dataBinding w:prefixMappings="xmlns:ns0='urn:microsoft-dynamics-nav/reports/Inventory_Customer_Sales/713/'" w:xpath="/ns0:NavWordReportXmlPart[1]/ns0:Item[1]/ns0:Item_Ledger_Entry" w:storeItemID="{0E62280E-706F-45D7-BEE2-B24E4BE14C14}"/>
                   <w15:repeatingSection/>
                 </w:sdtPr>
+                <w:sdtEndPr>
+                  <w:rPr>
+                    <w:b w:val="0"/>
+                    <w:bCs w:val="0"/>
+                  </w:rPr>
+                </w:sdtEndPr>
                 <w:sdtContent>
                   <w:sdt>
                     <w:sdtPr>
                       <w:rPr>
                         <w:rFonts w:ascii="Segoe UI" w:hAnsi="Segoe UI" w:cs="Segoe UI"/>
-                        <w:b w:val="0"/>
-                        <w:bCs w:val="0"/>
+                        <w:b/>
+                        <w:bCs/>
                         <w:sz w:val="16"/>
                         <w:szCs w:val="16"/>
                         <w:lang w:eastAsia="zh-CN"/>
@@ -1227,30 +1141,42 @@
                       </w:placeholder>
                       <w15:repeatingSectionItem/>
                     </w:sdtPr>
+                    <w:sdtEndPr>
+                      <w:rPr>
+                        <w:b w:val="0"/>
+                        <w:bCs w:val="0"/>
+                      </w:rPr>
+                    </w:sdtEndPr>
                     <w:sdtContent>
                       <w:sdt>
                         <w:sdtPr>
                           <w:rPr>
                             <w:rFonts w:ascii="Segoe UI" w:hAnsi="Segoe UI" w:cs="Segoe UI"/>
-                            <w:b w:val="0"/>
-                            <w:bCs w:val="0"/>
+                            <w:b/>
+                            <w:bCs/>
                             <w:sz w:val="16"/>
                             <w:szCs w:val="16"/>
                             <w:lang w:eastAsia="zh-CN"/>
                           </w:rPr>
                           <w:alias w:val="#Nav: /Item/Item_Ledger_Entry/Integer"/>
-                          <w:tag w:val="#Nav: FS_YSR_InventoryCustomerSales/50003"/>
+                          <w:tag w:val="#Nav: Inventory_Customer_Sales/713"/>
                           <w:id w:val="1092279626"/>
-                          <w15:dataBinding w:prefixMappings="xmlns:ns0='urn:microsoft-dynamics-nav/reports/FS_YSR_InventoryCustomerSales/50003/' " w:xpath="/ns0:NavWordReportXmlPart[1]/ns0:Item[1]/ns0:Item_Ledger_Entry[1]/ns0:Integer" w:storeItemID="{17357049-351C-4FB5-BA49-88074E24903C}"/>
+                          <w15:dataBinding w:prefixMappings="xmlns:ns0='urn:microsoft-dynamics-nav/reports/Inventory_Customer_Sales/713/'" w:xpath="/ns0:NavWordReportXmlPart[1]/ns0:Item[1]/ns0:Item_Ledger_Entry[1]/ns0:Integer" w:storeItemID="{0E62280E-706F-45D7-BEE2-B24E4BE14C14}"/>
                           <w15:repeatingSection/>
                         </w:sdtPr>
+                        <w:sdtEndPr>
+                          <w:rPr>
+                            <w:b w:val="0"/>
+                            <w:bCs w:val="0"/>
+                          </w:rPr>
+                        </w:sdtEndPr>
                         <w:sdtContent>
                           <w:sdt>
                             <w:sdtPr>
                               <w:rPr>
                                 <w:rFonts w:ascii="Segoe UI" w:hAnsi="Segoe UI" w:cs="Segoe UI"/>
-                                <w:b w:val="0"/>
-                                <w:bCs w:val="0"/>
+                                <w:b/>
+                                <w:bCs/>
                                 <w:sz w:val="16"/>
                                 <w:szCs w:val="16"/>
                                 <w:lang w:eastAsia="zh-CN"/>
@@ -1261,18 +1187,23 @@
                               </w:placeholder>
                               <w15:repeatingSectionItem/>
                             </w:sdtPr>
+                            <w:sdtEndPr>
+                              <w:rPr>
+                                <w:b w:val="0"/>
+                                <w:bCs w:val="0"/>
+                              </w:rPr>
+                            </w:sdtEndPr>
                             <w:sdtContent>
                               <w:tr>
                                 <w:trPr>
-                                  <w:cnfStyle w:val="000000100000" w:firstRow="0" w:lastRow="0" w:firstColumn="0" w:lastColumn="0" w:oddVBand="0" w:evenVBand="0" w:oddHBand="1" w:evenHBand="0" w:firstRowFirstColumn="0" w:firstRowLastColumn="0" w:lastRowFirstColumn="0" w:lastRowLastColumn="0"/>
-                                  <w:trHeight w:hRule="exact" w:val="227"/>
+                                  <w:trHeight w:val="227" w:hRule="exact"/>
                                 </w:trPr>
                                 <w:sdt>
                                   <w:sdtPr>
                                     <w:rPr>
                                       <w:rFonts w:ascii="Segoe UI" w:hAnsi="Segoe UI" w:cs="Segoe UI"/>
-                                      <w:b w:val="0"/>
-                                      <w:bCs w:val="0"/>
+                                      <w:b/>
+                                      <w:bCs/>
                                       <w:sz w:val="16"/>
                                       <w:szCs w:val="16"/>
                                       <w:lang w:eastAsia="zh-CN"/>
@@ -1283,29 +1214,25 @@
                                     <w:placeholder>
                                       <w:docPart w:val="DefaultPlaceholder_-1854013440"/>
                                     </w:placeholder>
-                                    <w15:dataBinding w:prefixMappings="xmlns:ns0='urn:microsoft-dynamics-nav/reports/FS_YSR_InventoryCustomerSales/50003/' " w:xpath="/ns0:NavWordReportXmlPart[1]/ns0:Item[1]/ns0:Item_Ledger_Entry[1]/ns0:Integer[1]/ns0:SourceNo_ItemLedgEntry[1]" w:storeItemID="{17357049-351C-4FB5-BA49-88074E24903C}" w16sdtdh:storeItemChecksum="xzfrIg=="/>
+                                    <w15:dataBinding w:prefixMappings="xmlns:ns0='urn:microsoft-dynamics-nav/reports/FS_YSR_InventoryCustomerSales/50003/' " w:xpath="/ns0:NavWordReportXmlPart[1]/ns0:Item[1]/ns0:Item_Ledger_Entry[1]/ns0:Integer[1]/ns0:SourceNo_ItemLedgEntry[1]" w:storeItemID="{17357049-351C-4FB5-BA49-88074E24903C}"/>
                                   </w:sdtPr>
                                   <w:sdtEndPr>
                                     <w:rPr>
-                                      <w:b/>
-                                      <w:bCs/>
                                       <w:lang w:eastAsia="ja-JP"/>
                                     </w:rPr>
                                   </w:sdtEndPr>
                                   <w:sdtContent>
                                     <w:tc>
                                       <w:tcPr>
-                                        <w:cnfStyle w:val="001000000000" w:firstRow="0" w:lastRow="0" w:firstColumn="1" w:lastColumn="0" w:oddVBand="0" w:evenVBand="0" w:oddHBand="0" w:evenHBand="0" w:firstRowFirstColumn="0" w:firstRowLastColumn="0" w:lastRowFirstColumn="0" w:lastRowLastColumn="0"/>
                                         <w:tcW w:w="1276" w:type="dxa"/>
                                         <w:shd w:val="clear" w:color="auto" w:fill="E8E8E8" w:themeFill="background2"/>
-                                        <w:vAlign w:val="center"/>
                                       </w:tcPr>
                                       <w:p>
                                         <w:pPr>
                                           <w:rPr>
                                             <w:rFonts w:ascii="Segoe UI" w:hAnsi="Segoe UI" w:cs="Segoe UI"/>
-                                            <w:b w:val="0"/>
-                                            <w:bCs w:val="0"/>
+                                            <w:b/>
+                                            <w:bCs/>
                                             <w:sz w:val="16"/>
                                             <w:szCs w:val="16"/>
                                           </w:rPr>
@@ -1314,8 +1241,6 @@
                                         <w:r>
                                           <w:rPr>
                                             <w:rFonts w:ascii="Segoe UI" w:hAnsi="Segoe UI" w:cs="Segoe UI"/>
-                                            <w:b w:val="0"/>
-                                            <w:bCs w:val="0"/>
                                             <w:sz w:val="16"/>
                                             <w:szCs w:val="16"/>
                                           </w:rPr>
@@ -1339,18 +1264,16 @@
                                     <w:placeholder>
                                       <w:docPart w:val="DefaultPlaceholder_-1854013440"/>
                                     </w:placeholder>
-                                    <w15:dataBinding w:prefixMappings="xmlns:ns0='urn:microsoft-dynamics-nav/reports/FS_YSR_InventoryCustomerSales/50003/' " w:xpath="/ns0:NavWordReportXmlPart[1]/ns0:Item[1]/ns0:Item_Ledger_Entry[1]/ns0:Integer[1]/ns0:CustName[1]" w:storeItemID="{17357049-351C-4FB5-BA49-88074E24903C}" w16sdtdh:storeItemChecksum="xzfrIg=="/>
+                                    <w15:dataBinding w:prefixMappings="xmlns:ns0='urn:microsoft-dynamics-nav/reports/FS_YSR_InventoryCustomerSales/50003/' " w:xpath="/ns0:NavWordReportXmlPart[1]/ns0:Item[1]/ns0:Item_Ledger_Entry[1]/ns0:Integer[1]/ns0:CustName[1]" w:storeItemID="{17357049-351C-4FB5-BA49-88074E24903C}"/>
                                   </w:sdtPr>
                                   <w:sdtContent>
                                     <w:tc>
                                       <w:tcPr>
                                         <w:tcW w:w="3544" w:type="dxa"/>
                                         <w:shd w:val="clear" w:color="auto" w:fill="E8E8E8" w:themeFill="background2"/>
-                                        <w:vAlign w:val="center"/>
                                       </w:tcPr>
                                       <w:p>
                                         <w:pPr>
-                                          <w:cnfStyle w:val="000000100000" w:firstRow="0" w:lastRow="0" w:firstColumn="0" w:lastColumn="0" w:oddVBand="0" w:evenVBand="0" w:oddHBand="1" w:evenHBand="0" w:firstRowFirstColumn="0" w:firstRowLastColumn="0" w:lastRowFirstColumn="0" w:lastRowLastColumn="0"/>
                                           <w:rPr>
                                             <w:rFonts w:ascii="Segoe UI" w:hAnsi="Segoe UI" w:cs="Segoe UI"/>
                                             <w:sz w:val="16"/>
@@ -1375,11 +1298,9 @@
                                   <w:tcPr>
                                     <w:tcW w:w="709" w:type="dxa"/>
                                     <w:shd w:val="clear" w:color="auto" w:fill="E8E8E8" w:themeFill="background2"/>
-                                    <w:vAlign w:val="center"/>
                                   </w:tcPr>
                                   <w:p>
                                     <w:pPr>
-                                      <w:cnfStyle w:val="000000100000" w:firstRow="0" w:lastRow="0" w:firstColumn="0" w:lastColumn="0" w:oddVBand="0" w:evenVBand="0" w:oddHBand="1" w:evenHBand="0" w:firstRowFirstColumn="0" w:firstRowLastColumn="0" w:lastRowFirstColumn="0" w:lastRowLastColumn="0"/>
                                       <w:rPr>
                                         <w:rFonts w:ascii="Segoe UI" w:hAnsi="Segoe UI" w:cs="Segoe UI"/>
                                         <w:sz w:val="16"/>
@@ -1401,7 +1322,7 @@
                                     <w:placeholder>
                                       <w:docPart w:val="DefaultPlaceholder_-1854013440"/>
                                     </w:placeholder>
-                                    <w15:dataBinding w:prefixMappings="xmlns:ns0='urn:microsoft-dynamics-nav/reports/FS_YSR_InventoryCustomerSales/50003/' " w:xpath="/ns0:NavWordReportXmlPart[1]/ns0:Item[1]/ns0:Item_Ledger_Entry[1]/ns0:Integer[1]/ns0:InvQty_ItemLedgEntry[1]" w:storeItemID="{17357049-351C-4FB5-BA49-88074E24903C}" w16sdtdh:storeItemChecksum="xzfrIg=="/>
+                                    <w15:dataBinding w:prefixMappings="xmlns:ns0='urn:microsoft-dynamics-nav/reports/FS_YSR_InventoryCustomerSales/50003/' " w:xpath="/ns0:NavWordReportXmlPart[1]/ns0:Item[1]/ns0:Item_Ledger_Entry[1]/ns0:Integer[1]/ns0:InvQty_ItemLedgEntry[1]" w:storeItemID="{17357049-351C-4FB5-BA49-88074E24903C}"/>
                                   </w:sdtPr>
                                   <w:sdtContent>
                                     <w:tc>
@@ -1411,7 +1332,7 @@
                                       </w:tcPr>
                                       <w:p>
                                         <w:pPr>
-                                          <w:cnfStyle w:val="000000100000" w:firstRow="0" w:lastRow="0" w:firstColumn="0" w:lastColumn="0" w:oddVBand="0" w:evenVBand="0" w:oddHBand="1" w:evenHBand="0" w:firstRowFirstColumn="0" w:firstRowLastColumn="0" w:lastRowFirstColumn="0" w:lastRowLastColumn="0"/>
+                                          <w:jc w:val="right"/>
                                           <w:rPr>
                                             <w:rFonts w:ascii="Segoe UI" w:hAnsi="Segoe UI" w:cs="Segoe UI"/>
                                             <w:sz w:val="16"/>
@@ -1445,7 +1366,7 @@
                                     <w:placeholder>
                                       <w:docPart w:val="DefaultPlaceholder_-1854013440"/>
                                     </w:placeholder>
-                                    <w15:dataBinding w:prefixMappings="xmlns:ns0='urn:microsoft-dynamics-nav/reports/FS_YSR_InventoryCustomerSales/50003/' " w:xpath="/ns0:NavWordReportXmlPart[1]/ns0:Item[1]/ns0:Item_Ledger_Entry[1]/ns0:Integer[1]/ns0:SalesAmtActual_ItemLedgEntry[1]" w:storeItemID="{17357049-351C-4FB5-BA49-88074E24903C}" w16sdtdh:storeItemChecksum="xzfrIg=="/>
+                                    <w15:dataBinding w:prefixMappings="xmlns:ns0='urn:microsoft-dynamics-nav/reports/FS_YSR_InventoryCustomerSales/50003/' " w:xpath="/ns0:NavWordReportXmlPart[1]/ns0:Item[1]/ns0:Item_Ledger_Entry[1]/ns0:Integer[1]/ns0:SalesAmtActual_ItemLedgEntry[1]" w:storeItemID="{17357049-351C-4FB5-BA49-88074E24903C}"/>
                                   </w:sdtPr>
                                   <w:sdtContent>
                                     <w:tc>
@@ -1455,7 +1376,7 @@
                                       </w:tcPr>
                                       <w:p>
                                         <w:pPr>
-                                          <w:cnfStyle w:val="000000100000" w:firstRow="0" w:lastRow="0" w:firstColumn="0" w:lastColumn="0" w:oddVBand="0" w:evenVBand="0" w:oddHBand="1" w:evenHBand="0" w:firstRowFirstColumn="0" w:firstRowLastColumn="0" w:lastRowFirstColumn="0" w:lastRowLastColumn="0"/>
+                                          <w:jc w:val="right"/>
                                           <w:rPr>
                                             <w:rFonts w:ascii="Segoe UI" w:hAnsi="Segoe UI" w:cs="Segoe UI"/>
                                             <w:sz w:val="16"/>
@@ -1489,7 +1410,7 @@
                                     <w:placeholder>
                                       <w:docPart w:val="DefaultPlaceholder_-1854013440"/>
                                     </w:placeholder>
-                                    <w15:dataBinding w:prefixMappings="xmlns:ns0='urn:microsoft-dynamics-nav/reports/FS_YSR_InventoryCustomerSales/50003/' " w:xpath="/ns0:NavWordReportXmlPart[1]/ns0:Item[1]/ns0:Item_Ledger_Entry[1]/ns0:Integer[1]/ns0:DiscountAmount[1]" w:storeItemID="{17357049-351C-4FB5-BA49-88074E24903C}" w16sdtdh:storeItemChecksum="xzfrIg=="/>
+                                    <w15:dataBinding w:prefixMappings="xmlns:ns0='urn:microsoft-dynamics-nav/reports/FS_YSR_InventoryCustomerSales/50003/' " w:xpath="/ns0:NavWordReportXmlPart[1]/ns0:Item[1]/ns0:Item_Ledger_Entry[1]/ns0:Integer[1]/ns0:DiscountAmount[1]" w:storeItemID="{17357049-351C-4FB5-BA49-88074E24903C}"/>
                                   </w:sdtPr>
                                   <w:sdtContent>
                                     <w:tc>
@@ -1500,7 +1421,6 @@
                                       <w:p>
                                         <w:pPr>
                                           <w:jc w:val="right"/>
-                                          <w:cnfStyle w:val="000000100000" w:firstRow="0" w:lastRow="0" w:firstColumn="0" w:lastColumn="0" w:oddVBand="0" w:evenVBand="0" w:oddHBand="1" w:evenHBand="0" w:firstRowFirstColumn="0" w:firstRowLastColumn="0" w:lastRowFirstColumn="0" w:lastRowLastColumn="0"/>
                                           <w:rPr>
                                             <w:rFonts w:ascii="Segoe UI" w:hAnsi="Segoe UI" w:cs="Segoe UI"/>
                                             <w:sz w:val="16"/>
@@ -1534,7 +1454,7 @@
                                     <w:placeholder>
                                       <w:docPart w:val="DefaultPlaceholder_-1854013440"/>
                                     </w:placeholder>
-                                    <w15:dataBinding w:prefixMappings="xmlns:ns0='urn:microsoft-dynamics-nav/reports/FS_YSR_InventoryCustomerSales/50003/' " w:xpath="/ns0:NavWordReportXmlPart[1]/ns0:Item[1]/ns0:Item_Ledger_Entry[1]/ns0:Integer[1]/ns0:Profit_ItemLedgEntry[1]" w:storeItemID="{17357049-351C-4FB5-BA49-88074E24903C}" w16sdtdh:storeItemChecksum="xzfrIg=="/>
+                                    <w15:dataBinding w:prefixMappings="xmlns:ns0='urn:microsoft-dynamics-nav/reports/FS_YSR_InventoryCustomerSales/50003/' " w:xpath="/ns0:NavWordReportXmlPart[1]/ns0:Item[1]/ns0:Item_Ledger_Entry[1]/ns0:Integer[1]/ns0:Profit_ItemLedgEntry[1]" w:storeItemID="{17357049-351C-4FB5-BA49-88074E24903C}"/>
                                   </w:sdtPr>
                                   <w:sdtContent>
                                     <w:tc>
@@ -1545,7 +1465,6 @@
                                       <w:p>
                                         <w:pPr>
                                           <w:jc w:val="right"/>
-                                          <w:cnfStyle w:val="000000100000" w:firstRow="0" w:lastRow="0" w:firstColumn="0" w:lastColumn="0" w:oddVBand="0" w:evenVBand="0" w:oddHBand="1" w:evenHBand="0" w:firstRowFirstColumn="0" w:firstRowLastColumn="0" w:lastRowFirstColumn="0" w:lastRowLastColumn="0"/>
                                           <w:rPr>
                                             <w:rFonts w:ascii="Segoe UI" w:hAnsi="Segoe UI" w:cs="Segoe UI"/>
                                             <w:sz w:val="16"/>
@@ -1579,7 +1498,7 @@
                                     <w:placeholder>
                                       <w:docPart w:val="DefaultPlaceholder_-1854013440"/>
                                     </w:placeholder>
-                                    <w15:dataBinding w:prefixMappings="xmlns:ns0='urn:microsoft-dynamics-nav/reports/FS_YSR_InventoryCustomerSales/50003/' " w:xpath="/ns0:NavWordReportXmlPart[1]/ns0:Item[1]/ns0:Item_Ledger_Entry[1]/ns0:Integer[1]/ns0:ProfitPct_ItemLedgEntry[1]" w:storeItemID="{17357049-351C-4FB5-BA49-88074E24903C}" w16sdtdh:storeItemChecksum="xzfrIg=="/>
+                                    <w15:dataBinding w:prefixMappings="xmlns:ns0='urn:microsoft-dynamics-nav/reports/FS_YSR_InventoryCustomerSales/50003/' " w:xpath="/ns0:NavWordReportXmlPart[1]/ns0:Item[1]/ns0:Item_Ledger_Entry[1]/ns0:Integer[1]/ns0:ProfitPct_ItemLedgEntry[1]" w:storeItemID="{17357049-351C-4FB5-BA49-88074E24903C}"/>
                                   </w:sdtPr>
                                   <w:sdtContent>
                                     <w:tc>
@@ -1590,7 +1509,6 @@
                                       <w:p>
                                         <w:pPr>
                                           <w:jc w:val="right"/>
-                                          <w:cnfStyle w:val="000000100000" w:firstRow="0" w:lastRow="0" w:firstColumn="0" w:lastColumn="0" w:oddVBand="0" w:evenVBand="0" w:oddHBand="1" w:evenHBand="0" w:firstRowFirstColumn="0" w:firstRowLastColumn="0" w:lastRowFirstColumn="0" w:lastRowLastColumn="0"/>
                                           <w:rPr>
                                             <w:rFonts w:ascii="Segoe UI" w:hAnsi="Segoe UI" w:cs="Segoe UI"/>
                                             <w:sz w:val="16"/>
@@ -1622,14 +1540,11 @@
               </w:sdt>
               <w:tr>
                 <w:trPr>
-                  <w:trHeight w:hRule="exact" w:val="227"/>
+                  <w:trHeight w:val="227" w:hRule="exact"/>
                 </w:trPr>
                 <w:tc>
                   <w:tcPr>
-                    <w:cnfStyle w:val="001000000000" w:firstRow="0" w:lastRow="0" w:firstColumn="1" w:lastColumn="0" w:oddVBand="0" w:evenVBand="0" w:oddHBand="0" w:evenHBand="0" w:firstRowFirstColumn="0" w:firstRowLastColumn="0" w:lastRowFirstColumn="0" w:lastRowLastColumn="0"/>
                     <w:tcW w:w="1276" w:type="dxa"/>
-                    <w:shd w:val="clear" w:color="auto" w:fill="auto"/>
-                    <w:vAlign w:val="center"/>
                   </w:tcPr>
                   <w:p>
                     <w:pPr>
@@ -1659,18 +1574,15 @@
                     <w:placeholder>
                       <w:docPart w:val="DefaultPlaceholder_-1854013440"/>
                     </w:placeholder>
-                    <w15:dataBinding w:prefixMappings="xmlns:ns0='urn:microsoft-dynamics-nav/reports/FS_YSR_InventoryCustomerSales/50003/' " w:xpath="/ns0:NavWordReportXmlPart[1]/ns0:Item[1]/ns0:SubTotals[1]/ns0:SubTotals_Description[1]" w:storeItemID="{17357049-351C-4FB5-BA49-88074E24903C}" w16sdtdh:storeItemChecksum="xzfrIg=="/>
+                    <w15:dataBinding w:prefixMappings="xmlns:ns0='urn:microsoft-dynamics-nav/reports/FS_YSR_InventoryCustomerSales/50003/' " w:xpath="/ns0:NavWordReportXmlPart[1]/ns0:Item[1]/ns0:SubTotals[1]/ns0:SubTotals_Description[1]" w:storeItemID="{17357049-351C-4FB5-BA49-88074E24903C}"/>
                   </w:sdtPr>
                   <w:sdtContent>
                     <w:tc>
                       <w:tcPr>
                         <w:tcW w:w="3544" w:type="dxa"/>
-                        <w:shd w:val="clear" w:color="auto" w:fill="auto"/>
-                        <w:vAlign w:val="center"/>
                       </w:tcPr>
                       <w:p>
                         <w:pPr>
-                          <w:cnfStyle w:val="000000000000" w:firstRow="0" w:lastRow="0" w:firstColumn="0" w:lastColumn="0" w:oddVBand="0" w:evenVBand="0" w:oddHBand="0" w:evenHBand="0" w:firstRowFirstColumn="0" w:firstRowLastColumn="0" w:lastRowFirstColumn="0" w:lastRowLastColumn="0"/>
                           <w:rPr>
                             <w:rFonts w:ascii="Segoe UI" w:hAnsi="Segoe UI" w:cs="Segoe UI"/>
                             <w:b/>
@@ -1698,12 +1610,9 @@
                 <w:tc>
                   <w:tcPr>
                     <w:tcW w:w="709" w:type="dxa"/>
-                    <w:shd w:val="clear" w:color="auto" w:fill="auto"/>
-                    <w:vAlign w:val="center"/>
                   </w:tcPr>
                   <w:p>
                     <w:pPr>
-                      <w:cnfStyle w:val="000000000000" w:firstRow="0" w:lastRow="0" w:firstColumn="0" w:lastColumn="0" w:oddVBand="0" w:evenVBand="0" w:oddHBand="0" w:evenHBand="0" w:firstRowFirstColumn="0" w:firstRowLastColumn="0" w:lastRowFirstColumn="0" w:lastRowLastColumn="0"/>
                       <w:rPr>
                         <w:rFonts w:ascii="Segoe UI" w:hAnsi="Segoe UI" w:cs="Segoe UI"/>
                         <w:b/>
@@ -1729,19 +1638,16 @@
                     <w:placeholder>
                       <w:docPart w:val="DefaultPlaceholder_-1854013440"/>
                     </w:placeholder>
-                    <w15:dataBinding w:prefixMappings="xmlns:ns0='urn:microsoft-dynamics-nav/reports/FS_YSR_InventoryCustomerSales/50003/' " w:xpath="/ns0:NavWordReportXmlPart[1]/ns0:Item[1]/ns0:SubTotals[1]/ns0:SubTotals_InvQty[1]" w:storeItemID="{17357049-351C-4FB5-BA49-88074E24903C}" w16sdtdh:storeItemChecksum="xzfrIg=="/>
+                    <w15:dataBinding w:prefixMappings="xmlns:ns0='urn:microsoft-dynamics-nav/reports/FS_YSR_InventoryCustomerSales/50003/' " w:xpath="/ns0:NavWordReportXmlPart[1]/ns0:Item[1]/ns0:SubTotals[1]/ns0:SubTotals_InvQty[1]" w:storeItemID="{17357049-351C-4FB5-BA49-88074E24903C}"/>
                   </w:sdtPr>
                   <w:sdtContent>
                     <w:tc>
                       <w:tcPr>
                         <w:tcW w:w="992" w:type="dxa"/>
-                        <w:shd w:val="clear" w:color="auto" w:fill="auto"/>
-                        <w:vAlign w:val="center"/>
                       </w:tcPr>
                       <w:p>
                         <w:pPr>
                           <w:jc w:val="right"/>
-                          <w:cnfStyle w:val="000000000000" w:firstRow="0" w:lastRow="0" w:firstColumn="0" w:lastColumn="0" w:oddVBand="0" w:evenVBand="0" w:oddHBand="0" w:evenHBand="0" w:firstRowFirstColumn="0" w:firstRowLastColumn="0" w:lastRowFirstColumn="0" w:lastRowLastColumn="0"/>
                           <w:rPr>
                             <w:rFonts w:ascii="Segoe UI" w:hAnsi="Segoe UI" w:cs="Segoe UI"/>
                             <w:b/>
@@ -1781,19 +1687,16 @@
                     <w:placeholder>
                       <w:docPart w:val="DefaultPlaceholder_-1854013440"/>
                     </w:placeholder>
-                    <w15:dataBinding w:prefixMappings="xmlns:ns0='urn:microsoft-dynamics-nav/reports/FS_YSR_InventoryCustomerSales/50003/' " w:xpath="/ns0:NavWordReportXmlPart[1]/ns0:Item[1]/ns0:SubTotals[1]/ns0:SubTotals_SalesAmtActual[1]" w:storeItemID="{17357049-351C-4FB5-BA49-88074E24903C}" w16sdtdh:storeItemChecksum="xzfrIg=="/>
+                    <w15:dataBinding w:prefixMappings="xmlns:ns0='urn:microsoft-dynamics-nav/reports/FS_YSR_InventoryCustomerSales/50003/' " w:xpath="/ns0:NavWordReportXmlPart[1]/ns0:Item[1]/ns0:SubTotals[1]/ns0:SubTotals_SalesAmtActual[1]" w:storeItemID="{17357049-351C-4FB5-BA49-88074E24903C}"/>
                   </w:sdtPr>
                   <w:sdtContent>
                     <w:tc>
                       <w:tcPr>
                         <w:tcW w:w="992" w:type="dxa"/>
-                        <w:shd w:val="clear" w:color="auto" w:fill="auto"/>
-                        <w:vAlign w:val="center"/>
                       </w:tcPr>
                       <w:p>
                         <w:pPr>
                           <w:jc w:val="right"/>
-                          <w:cnfStyle w:val="000000000000" w:firstRow="0" w:lastRow="0" w:firstColumn="0" w:lastColumn="0" w:oddVBand="0" w:evenVBand="0" w:oddHBand="0" w:evenHBand="0" w:firstRowFirstColumn="0" w:firstRowLastColumn="0" w:lastRowFirstColumn="0" w:lastRowLastColumn="0"/>
                           <w:rPr>
                             <w:rFonts w:ascii="Segoe UI" w:hAnsi="Segoe UI" w:cs="Segoe UI"/>
                             <w:b/>
@@ -1833,19 +1736,16 @@
                     <w:placeholder>
                       <w:docPart w:val="DefaultPlaceholder_-1854013440"/>
                     </w:placeholder>
-                    <w15:dataBinding w:prefixMappings="xmlns:ns0='urn:microsoft-dynamics-nav/reports/FS_YSR_InventoryCustomerSales/50003/' " w:xpath="/ns0:NavWordReportXmlPart[1]/ns0:Item[1]/ns0:SubTotals[1]/ns0:SubTotals_DiscountAmount[1]" w:storeItemID="{17357049-351C-4FB5-BA49-88074E24903C}" w16sdtdh:storeItemChecksum="xzfrIg=="/>
+                    <w15:dataBinding w:prefixMappings="xmlns:ns0='urn:microsoft-dynamics-nav/reports/FS_YSR_InventoryCustomerSales/50003/' " w:xpath="/ns0:NavWordReportXmlPart[1]/ns0:Item[1]/ns0:SubTotals[1]/ns0:SubTotals_DiscountAmount[1]" w:storeItemID="{17357049-351C-4FB5-BA49-88074E24903C}"/>
                   </w:sdtPr>
                   <w:sdtContent>
                     <w:tc>
                       <w:tcPr>
                         <w:tcW w:w="992" w:type="dxa"/>
-                        <w:shd w:val="clear" w:color="auto" w:fill="auto"/>
-                        <w:vAlign w:val="center"/>
                       </w:tcPr>
                       <w:p>
                         <w:pPr>
                           <w:jc w:val="right"/>
-                          <w:cnfStyle w:val="000000000000" w:firstRow="0" w:lastRow="0" w:firstColumn="0" w:lastColumn="0" w:oddVBand="0" w:evenVBand="0" w:oddHBand="0" w:evenHBand="0" w:firstRowFirstColumn="0" w:firstRowLastColumn="0" w:lastRowFirstColumn="0" w:lastRowLastColumn="0"/>
                           <w:rPr>
                             <w:rFonts w:ascii="Segoe UI" w:hAnsi="Segoe UI" w:cs="Segoe UI"/>
                             <w:b/>
@@ -1885,19 +1785,16 @@
                     <w:placeholder>
                       <w:docPart w:val="DefaultPlaceholder_-1854013440"/>
                     </w:placeholder>
-                    <w15:dataBinding w:prefixMappings="xmlns:ns0='urn:microsoft-dynamics-nav/reports/FS_YSR_InventoryCustomerSales/50003/' " w:xpath="/ns0:NavWordReportXmlPart[1]/ns0:Item[1]/ns0:SubTotals[1]/ns0:SubTotals_Profit[1]" w:storeItemID="{17357049-351C-4FB5-BA49-88074E24903C}" w16sdtdh:storeItemChecksum="xzfrIg=="/>
+                    <w15:dataBinding w:prefixMappings="xmlns:ns0='urn:microsoft-dynamics-nav/reports/FS_YSR_InventoryCustomerSales/50003/' " w:xpath="/ns0:NavWordReportXmlPart[1]/ns0:Item[1]/ns0:SubTotals[1]/ns0:SubTotals_Profit[1]" w:storeItemID="{17357049-351C-4FB5-BA49-88074E24903C}"/>
                   </w:sdtPr>
                   <w:sdtContent>
                     <w:tc>
                       <w:tcPr>
                         <w:tcW w:w="993" w:type="dxa"/>
-                        <w:shd w:val="clear" w:color="auto" w:fill="auto"/>
-                        <w:vAlign w:val="center"/>
                       </w:tcPr>
                       <w:p>
                         <w:pPr>
                           <w:jc w:val="right"/>
-                          <w:cnfStyle w:val="000000000000" w:firstRow="0" w:lastRow="0" w:firstColumn="0" w:lastColumn="0" w:oddVBand="0" w:evenVBand="0" w:oddHBand="0" w:evenHBand="0" w:firstRowFirstColumn="0" w:firstRowLastColumn="0" w:lastRowFirstColumn="0" w:lastRowLastColumn="0"/>
                           <w:rPr>
                             <w:rFonts w:ascii="Segoe UI" w:hAnsi="Segoe UI" w:cs="Segoe UI"/>
                             <w:b/>
@@ -1935,19 +1832,16 @@
                     <w:placeholder>
                       <w:docPart w:val="DefaultPlaceholder_-1854013440"/>
                     </w:placeholder>
-                    <w15:dataBinding w:prefixMappings="xmlns:ns0='urn:microsoft-dynamics-nav/reports/FS_YSR_InventoryCustomerSales/50003/' " w:xpath="/ns0:NavWordReportXmlPart[1]/ns0:Item[1]/ns0:SubTotals[1]/ns0:SubTotals_ProfitPct[1]" w:storeItemID="{17357049-351C-4FB5-BA49-88074E24903C}" w16sdtdh:storeItemChecksum="xzfrIg=="/>
+                    <w15:dataBinding w:prefixMappings="xmlns:ns0='urn:microsoft-dynamics-nav/reports/FS_YSR_InventoryCustomerSales/50003/' " w:xpath="/ns0:NavWordReportXmlPart[1]/ns0:Item[1]/ns0:SubTotals[1]/ns0:SubTotals_ProfitPct[1]" w:storeItemID="{17357049-351C-4FB5-BA49-88074E24903C}"/>
                   </w:sdtPr>
                   <w:sdtContent>
                     <w:tc>
                       <w:tcPr>
                         <w:tcW w:w="992" w:type="dxa"/>
-                        <w:shd w:val="clear" w:color="auto" w:fill="auto"/>
-                        <w:vAlign w:val="center"/>
                       </w:tcPr>
                       <w:p>
                         <w:pPr>
                           <w:jc w:val="right"/>
-                          <w:cnfStyle w:val="000000000000" w:firstRow="0" w:lastRow="0" w:firstColumn="0" w:lastColumn="0" w:oddVBand="0" w:evenVBand="0" w:oddHBand="0" w:evenHBand="0" w:firstRowFirstColumn="0" w:firstRowLastColumn="0" w:lastRowFirstColumn="0" w:lastRowLastColumn="0"/>
                           <w:rPr>
                             <w:rFonts w:ascii="Segoe UI" w:hAnsi="Segoe UI" w:cs="Segoe UI"/>
                             <w:sz w:val="16"/>
@@ -1985,162 +1879,14 @@
       </w:sdt>
       <w:tr>
         <w:trPr>
-          <w:cnfStyle w:val="000000100000" w:firstRow="0" w:lastRow="0" w:firstColumn="0" w:lastColumn="0" w:oddVBand="0" w:evenVBand="0" w:oddHBand="1" w:evenHBand="0" w:firstRowFirstColumn="0" w:firstRowLastColumn="0" w:lastRowFirstColumn="0" w:lastRowLastColumn="0"/>
-          <w:trHeight w:hRule="exact" w:val="113"/>
+          <w:trHeight w:val="113" w:hRule="exact"/>
         </w:trPr>
         <w:tc>
           <w:tcPr>
-            <w:cnfStyle w:val="001000000000" w:firstRow="0" w:lastRow="0" w:firstColumn="1" w:lastColumn="0" w:oddVBand="0" w:evenVBand="0" w:oddHBand="0" w:evenHBand="0" w:firstRowFirstColumn="0" w:firstRowLastColumn="0" w:lastRowFirstColumn="0" w:lastRowLastColumn="0"/>
-            <w:tcW w:w="1276" w:type="dxa"/>
-            <w:shd w:val="clear" w:color="auto" w:fill="auto"/>
-          </w:tcPr>
-          <w:p>
-            <w:pPr>
-              <w:rPr>
-                <w:rFonts w:ascii="Segoe UI" w:hAnsi="Segoe UI" w:cs="Segoe UI"/>
-                <w:sz w:val="16"/>
-                <w:szCs w:val="16"/>
-              </w:rPr>
-            </w:pPr>
-          </w:p>
-        </w:tc>
-        <w:tc>
-          <w:tcPr>
-            <w:tcW w:w="3544" w:type="dxa"/>
-            <w:shd w:val="clear" w:color="auto" w:fill="auto"/>
-          </w:tcPr>
-          <w:p>
-            <w:pPr>
-              <w:cnfStyle w:val="000000100000" w:firstRow="0" w:lastRow="0" w:firstColumn="0" w:lastColumn="0" w:oddVBand="0" w:evenVBand="0" w:oddHBand="1" w:evenHBand="0" w:firstRowFirstColumn="0" w:firstRowLastColumn="0" w:lastRowFirstColumn="0" w:lastRowLastColumn="0"/>
-              <w:rPr>
-                <w:rFonts w:ascii="Segoe UI" w:hAnsi="Segoe UI" w:cs="Segoe UI"/>
-                <w:sz w:val="16"/>
-                <w:szCs w:val="16"/>
-              </w:rPr>
-            </w:pPr>
-          </w:p>
-        </w:tc>
-        <w:tc>
-          <w:tcPr>
-            <w:tcW w:w="709" w:type="dxa"/>
-            <w:shd w:val="clear" w:color="auto" w:fill="auto"/>
-          </w:tcPr>
-          <w:p>
-            <w:pPr>
-              <w:cnfStyle w:val="000000100000" w:firstRow="0" w:lastRow="0" w:firstColumn="0" w:lastColumn="0" w:oddVBand="0" w:evenVBand="0" w:oddHBand="1" w:evenHBand="0" w:firstRowFirstColumn="0" w:firstRowLastColumn="0" w:lastRowFirstColumn="0" w:lastRowLastColumn="0"/>
-              <w:rPr>
-                <w:rFonts w:ascii="Segoe UI" w:hAnsi="Segoe UI" w:cs="Segoe UI"/>
-                <w:sz w:val="16"/>
-                <w:szCs w:val="16"/>
-              </w:rPr>
-            </w:pPr>
-          </w:p>
-        </w:tc>
-        <w:tc>
-          <w:tcPr>
-            <w:tcW w:w="992" w:type="dxa"/>
-            <w:shd w:val="clear" w:color="auto" w:fill="auto"/>
-            <w:vAlign w:val="center"/>
-          </w:tcPr>
-          <w:p>
-            <w:pPr>
-              <w:jc w:val="right"/>
-              <w:cnfStyle w:val="000000100000" w:firstRow="0" w:lastRow="0" w:firstColumn="0" w:lastColumn="0" w:oddVBand="0" w:evenVBand="0" w:oddHBand="1" w:evenHBand="0" w:firstRowFirstColumn="0" w:firstRowLastColumn="0" w:lastRowFirstColumn="0" w:lastRowLastColumn="0"/>
-              <w:rPr>
-                <w:rFonts w:ascii="Segoe UI" w:hAnsi="Segoe UI" w:cs="Segoe UI"/>
-                <w:sz w:val="16"/>
-                <w:szCs w:val="16"/>
-              </w:rPr>
-            </w:pPr>
-          </w:p>
-        </w:tc>
-        <w:tc>
-          <w:tcPr>
-            <w:tcW w:w="992" w:type="dxa"/>
-            <w:shd w:val="clear" w:color="auto" w:fill="auto"/>
-            <w:vAlign w:val="center"/>
-          </w:tcPr>
-          <w:p>
-            <w:pPr>
-              <w:jc w:val="right"/>
-              <w:cnfStyle w:val="000000100000" w:firstRow="0" w:lastRow="0" w:firstColumn="0" w:lastColumn="0" w:oddVBand="0" w:evenVBand="0" w:oddHBand="1" w:evenHBand="0" w:firstRowFirstColumn="0" w:firstRowLastColumn="0" w:lastRowFirstColumn="0" w:lastRowLastColumn="0"/>
-              <w:rPr>
-                <w:rFonts w:ascii="Segoe UI" w:hAnsi="Segoe UI" w:cs="Segoe UI"/>
-                <w:sz w:val="16"/>
-                <w:szCs w:val="16"/>
-              </w:rPr>
-            </w:pPr>
-          </w:p>
-        </w:tc>
-        <w:tc>
-          <w:tcPr>
-            <w:tcW w:w="992" w:type="dxa"/>
-            <w:shd w:val="clear" w:color="auto" w:fill="auto"/>
-            <w:vAlign w:val="center"/>
-          </w:tcPr>
-          <w:p>
-            <w:pPr>
-              <w:jc w:val="right"/>
-              <w:cnfStyle w:val="000000100000" w:firstRow="0" w:lastRow="0" w:firstColumn="0" w:lastColumn="0" w:oddVBand="0" w:evenVBand="0" w:oddHBand="1" w:evenHBand="0" w:firstRowFirstColumn="0" w:firstRowLastColumn="0" w:lastRowFirstColumn="0" w:lastRowLastColumn="0"/>
-              <w:rPr>
-                <w:rFonts w:ascii="Segoe UI" w:hAnsi="Segoe UI" w:cs="Segoe UI"/>
-                <w:sz w:val="16"/>
-                <w:szCs w:val="16"/>
-              </w:rPr>
-            </w:pPr>
-          </w:p>
-        </w:tc>
-        <w:tc>
-          <w:tcPr>
-            <w:tcW w:w="993" w:type="dxa"/>
-            <w:shd w:val="clear" w:color="auto" w:fill="auto"/>
-            <w:vAlign w:val="center"/>
-          </w:tcPr>
-          <w:p>
-            <w:pPr>
-              <w:jc w:val="right"/>
-              <w:cnfStyle w:val="000000100000" w:firstRow="0" w:lastRow="0" w:firstColumn="0" w:lastColumn="0" w:oddVBand="0" w:evenVBand="0" w:oddHBand="1" w:evenHBand="0" w:firstRowFirstColumn="0" w:firstRowLastColumn="0" w:lastRowFirstColumn="0" w:lastRowLastColumn="0"/>
-              <w:rPr>
-                <w:rFonts w:ascii="Segoe UI" w:hAnsi="Segoe UI" w:cs="Segoe UI"/>
-                <w:sz w:val="16"/>
-                <w:szCs w:val="16"/>
-              </w:rPr>
-            </w:pPr>
-          </w:p>
-        </w:tc>
-        <w:tc>
-          <w:tcPr>
-            <w:tcW w:w="992" w:type="dxa"/>
-            <w:shd w:val="clear" w:color="auto" w:fill="auto"/>
-            <w:vAlign w:val="center"/>
-          </w:tcPr>
-          <w:p>
-            <w:pPr>
-              <w:jc w:val="right"/>
-              <w:cnfStyle w:val="000000100000" w:firstRow="0" w:lastRow="0" w:firstColumn="0" w:lastColumn="0" w:oddVBand="0" w:evenVBand="0" w:oddHBand="1" w:evenHBand="0" w:firstRowFirstColumn="0" w:firstRowLastColumn="0" w:lastRowFirstColumn="0" w:lastRowLastColumn="0"/>
-              <w:rPr>
-                <w:rFonts w:ascii="Segoe UI" w:hAnsi="Segoe UI" w:cs="Segoe UI"/>
-                <w:sz w:val="16"/>
-                <w:szCs w:val="16"/>
-              </w:rPr>
-            </w:pPr>
-          </w:p>
-        </w:tc>
-      </w:tr>
-      <w:tr>
-        <w:trPr>
-          <w:trHeight w:hRule="exact" w:val="567"/>
-        </w:trPr>
-        <w:tc>
-          <w:tcPr>
-            <w:cnfStyle w:val="001000000000" w:firstRow="0" w:lastRow="0" w:firstColumn="1" w:lastColumn="0" w:oddVBand="0" w:evenVBand="0" w:oddHBand="0" w:evenHBand="0" w:firstRowFirstColumn="0" w:firstRowLastColumn="0" w:lastRowFirstColumn="0" w:lastRowLastColumn="0"/>
             <w:tcW w:w="1276" w:type="dxa"/>
             <w:tcBorders>
-              <w:top w:val="single" w:sz="4" w:space="0" w:color="auto"/>
-              <w:bottom w:val="single" w:sz="4" w:space="0" w:color="auto"/>
+              <w:bottom w:val="single" w:color="auto" w:sz="4" w:space="0"/>
             </w:tcBorders>
-            <w:shd w:val="clear" w:color="auto" w:fill="auto"/>
-            <w:vAlign w:val="center"/>
           </w:tcPr>
           <w:p>
             <w:pPr>
@@ -2156,15 +1902,159 @@
           <w:tcPr>
             <w:tcW w:w="3544" w:type="dxa"/>
             <w:tcBorders>
-              <w:top w:val="single" w:sz="4" w:space="0" w:color="auto"/>
-              <w:bottom w:val="single" w:sz="4" w:space="0" w:color="auto"/>
+              <w:bottom w:val="single" w:color="auto" w:sz="4" w:space="0"/>
             </w:tcBorders>
-            <w:shd w:val="clear" w:color="auto" w:fill="auto"/>
-            <w:vAlign w:val="center"/>
           </w:tcPr>
           <w:p>
             <w:pPr>
-              <w:cnfStyle w:val="000000000000" w:firstRow="0" w:lastRow="0" w:firstColumn="0" w:lastColumn="0" w:oddVBand="0" w:evenVBand="0" w:oddHBand="0" w:evenHBand="0" w:firstRowFirstColumn="0" w:firstRowLastColumn="0" w:lastRowFirstColumn="0" w:lastRowLastColumn="0"/>
+              <w:rPr>
+                <w:rFonts w:ascii="Segoe UI" w:hAnsi="Segoe UI" w:cs="Segoe UI"/>
+                <w:sz w:val="16"/>
+                <w:szCs w:val="16"/>
+              </w:rPr>
+            </w:pPr>
+          </w:p>
+        </w:tc>
+        <w:tc>
+          <w:tcPr>
+            <w:tcW w:w="709" w:type="dxa"/>
+            <w:tcBorders>
+              <w:bottom w:val="single" w:color="auto" w:sz="4" w:space="0"/>
+            </w:tcBorders>
+          </w:tcPr>
+          <w:p>
+            <w:pPr>
+              <w:rPr>
+                <w:rFonts w:ascii="Segoe UI" w:hAnsi="Segoe UI" w:cs="Segoe UI"/>
+                <w:sz w:val="16"/>
+                <w:szCs w:val="16"/>
+              </w:rPr>
+            </w:pPr>
+          </w:p>
+        </w:tc>
+        <w:tc>
+          <w:tcPr>
+            <w:tcW w:w="992" w:type="dxa"/>
+            <w:tcBorders>
+              <w:bottom w:val="single" w:color="auto" w:sz="4" w:space="0"/>
+            </w:tcBorders>
+          </w:tcPr>
+          <w:p>
+            <w:pPr>
+              <w:jc w:val="right"/>
+              <w:rPr>
+                <w:rFonts w:ascii="Segoe UI" w:hAnsi="Segoe UI" w:cs="Segoe UI"/>
+                <w:sz w:val="16"/>
+                <w:szCs w:val="16"/>
+              </w:rPr>
+            </w:pPr>
+          </w:p>
+        </w:tc>
+        <w:tc>
+          <w:tcPr>
+            <w:tcW w:w="992" w:type="dxa"/>
+            <w:tcBorders>
+              <w:bottom w:val="single" w:color="auto" w:sz="4" w:space="0"/>
+            </w:tcBorders>
+          </w:tcPr>
+          <w:p>
+            <w:pPr>
+              <w:jc w:val="right"/>
+              <w:rPr>
+                <w:rFonts w:ascii="Segoe UI" w:hAnsi="Segoe UI" w:cs="Segoe UI"/>
+                <w:sz w:val="16"/>
+                <w:szCs w:val="16"/>
+              </w:rPr>
+            </w:pPr>
+          </w:p>
+        </w:tc>
+        <w:tc>
+          <w:tcPr>
+            <w:tcW w:w="992" w:type="dxa"/>
+            <w:tcBorders>
+              <w:bottom w:val="single" w:color="auto" w:sz="4" w:space="0"/>
+            </w:tcBorders>
+          </w:tcPr>
+          <w:p>
+            <w:pPr>
+              <w:jc w:val="right"/>
+              <w:rPr>
+                <w:rFonts w:ascii="Segoe UI" w:hAnsi="Segoe UI" w:cs="Segoe UI"/>
+                <w:sz w:val="16"/>
+                <w:szCs w:val="16"/>
+              </w:rPr>
+            </w:pPr>
+          </w:p>
+        </w:tc>
+        <w:tc>
+          <w:tcPr>
+            <w:tcW w:w="993" w:type="dxa"/>
+            <w:tcBorders>
+              <w:bottom w:val="single" w:color="auto" w:sz="4" w:space="0"/>
+            </w:tcBorders>
+          </w:tcPr>
+          <w:p>
+            <w:pPr>
+              <w:jc w:val="right"/>
+              <w:rPr>
+                <w:rFonts w:ascii="Segoe UI" w:hAnsi="Segoe UI" w:cs="Segoe UI"/>
+                <w:sz w:val="16"/>
+                <w:szCs w:val="16"/>
+              </w:rPr>
+            </w:pPr>
+          </w:p>
+        </w:tc>
+        <w:tc>
+          <w:tcPr>
+            <w:tcW w:w="992" w:type="dxa"/>
+            <w:tcBorders>
+              <w:bottom w:val="single" w:color="auto" w:sz="4" w:space="0"/>
+            </w:tcBorders>
+          </w:tcPr>
+          <w:p>
+            <w:pPr>
+              <w:jc w:val="right"/>
+              <w:rPr>
+                <w:rFonts w:ascii="Segoe UI" w:hAnsi="Segoe UI" w:cs="Segoe UI"/>
+                <w:sz w:val="16"/>
+                <w:szCs w:val="16"/>
+              </w:rPr>
+            </w:pPr>
+          </w:p>
+        </w:tc>
+      </w:tr>
+      <w:tr>
+        <w:trPr>
+          <w:trHeight w:val="567" w:hRule="exact"/>
+        </w:trPr>
+        <w:tc>
+          <w:tcPr>
+            <w:tcW w:w="1276" w:type="dxa"/>
+            <w:tcBorders>
+              <w:top w:val="single" w:color="auto" w:sz="4" w:space="0"/>
+              <w:bottom w:val="single" w:color="auto" w:sz="4" w:space="0"/>
+            </w:tcBorders>
+          </w:tcPr>
+          <w:p>
+            <w:pPr>
+              <w:rPr>
+                <w:rFonts w:ascii="Segoe UI" w:hAnsi="Segoe UI" w:cs="Segoe UI"/>
+                <w:sz w:val="16"/>
+                <w:szCs w:val="16"/>
+              </w:rPr>
+            </w:pPr>
+          </w:p>
+        </w:tc>
+        <w:tc>
+          <w:tcPr>
+            <w:tcW w:w="3544" w:type="dxa"/>
+            <w:tcBorders>
+              <w:top w:val="single" w:color="auto" w:sz="4" w:space="0"/>
+              <w:bottom w:val="single" w:color="auto" w:sz="4" w:space="0"/>
+            </w:tcBorders>
+          </w:tcPr>
+          <w:p>
+            <w:pPr>
               <w:rPr>
                 <w:rFonts w:ascii="Segoe UI" w:hAnsi="Segoe UI" w:cs="Segoe UI"/>
                 <w:b/>
@@ -2179,15 +2069,12 @@
           <w:tcPr>
             <w:tcW w:w="709" w:type="dxa"/>
             <w:tcBorders>
-              <w:top w:val="single" w:sz="4" w:space="0" w:color="auto"/>
-              <w:bottom w:val="single" w:sz="4" w:space="0" w:color="auto"/>
+              <w:top w:val="single" w:color="auto" w:sz="4" w:space="0"/>
+              <w:bottom w:val="single" w:color="auto" w:sz="4" w:space="0"/>
             </w:tcBorders>
-            <w:shd w:val="clear" w:color="auto" w:fill="auto"/>
-            <w:vAlign w:val="center"/>
           </w:tcPr>
           <w:p>
             <w:pPr>
-              <w:cnfStyle w:val="000000000000" w:firstRow="0" w:lastRow="0" w:firstColumn="0" w:lastColumn="0" w:oddVBand="0" w:evenVBand="0" w:oddHBand="0" w:evenHBand="0" w:firstRowFirstColumn="0" w:firstRowLastColumn="0" w:lastRowFirstColumn="0" w:lastRowLastColumn="0"/>
               <w:rPr>
                 <w:rFonts w:ascii="Segoe UI" w:hAnsi="Segoe UI" w:cs="Segoe UI"/>
                 <w:b/>
@@ -2202,16 +2089,13 @@
           <w:tcPr>
             <w:tcW w:w="992" w:type="dxa"/>
             <w:tcBorders>
-              <w:top w:val="single" w:sz="4" w:space="0" w:color="auto"/>
-              <w:bottom w:val="single" w:sz="4" w:space="0" w:color="auto"/>
+              <w:top w:val="single" w:color="auto" w:sz="4" w:space="0"/>
+              <w:bottom w:val="single" w:color="auto" w:sz="4" w:space="0"/>
             </w:tcBorders>
-            <w:shd w:val="clear" w:color="auto" w:fill="auto"/>
-            <w:vAlign w:val="center"/>
           </w:tcPr>
           <w:p>
             <w:pPr>
               <w:jc w:val="right"/>
-              <w:cnfStyle w:val="000000000000" w:firstRow="0" w:lastRow="0" w:firstColumn="0" w:lastColumn="0" w:oddVBand="0" w:evenVBand="0" w:oddHBand="0" w:evenHBand="0" w:firstRowFirstColumn="0" w:firstRowLastColumn="0" w:lastRowFirstColumn="0" w:lastRowLastColumn="0"/>
               <w:rPr>
                 <w:rFonts w:ascii="Segoe UI" w:hAnsi="Segoe UI" w:cs="Segoe UI"/>
                 <w:b/>
@@ -2242,12 +2126,12 @@
               <w:szCs w:val="16"/>
             </w:rPr>
             <w:alias w:val="#Nav: /Totals/Totals_SalesAmtActual"/>
-            <w:tag w:val="#Nav: FS_YSR_InventoryCustomerSales/50003"/>
+            <w:tag w:val="#Nav: Inventory_Customer_Sales/713"/>
             <w:id w:val="-1960557500"/>
             <w:placeholder>
               <w:docPart w:val="DefaultPlaceholder_-1854013440"/>
             </w:placeholder>
-            <w:dataBinding w:prefixMappings="xmlns:ns0='urn:microsoft-dynamics-nav/reports/FS_YSR_InventoryCustomerSales/50003/'" w:xpath="/ns0:NavWordReportXmlPart[1]/ns0:Totals[1]/ns0:Totals_SalesAmtActual[1]" w:storeItemID="{17357049-351C-4FB5-BA49-88074E24903C}"/>
+            <w:dataBinding w:prefixMappings="xmlns:ns0='urn:microsoft-dynamics-nav/reports/Inventory_Customer_Sales/713/'" w:xpath="/ns0:NavWordReportXmlPart[1]/ns0:Totals[1]/ns0:Totals_SalesAmtActual[1]" w:storeItemID="{0E62280E-706F-45D7-BEE2-B24E4BE14C14}"/>
             <w:text/>
           </w:sdtPr>
           <w:sdtContent>
@@ -2255,16 +2139,13 @@
               <w:tcPr>
                 <w:tcW w:w="992" w:type="dxa"/>
                 <w:tcBorders>
-                  <w:top w:val="single" w:sz="4" w:space="0" w:color="auto"/>
-                  <w:bottom w:val="single" w:sz="4" w:space="0" w:color="auto"/>
+                  <w:top w:val="single" w:color="auto" w:sz="4" w:space="0"/>
+                  <w:bottom w:val="single" w:color="auto" w:sz="4" w:space="0"/>
                 </w:tcBorders>
-                <w:shd w:val="clear" w:color="auto" w:fill="auto"/>
-                <w:vAlign w:val="center"/>
               </w:tcPr>
               <w:p>
                 <w:pPr>
                   <w:jc w:val="right"/>
-                  <w:cnfStyle w:val="000000000000" w:firstRow="0" w:lastRow="0" w:firstColumn="0" w:lastColumn="0" w:oddVBand="0" w:evenVBand="0" w:oddHBand="0" w:evenHBand="0" w:firstRowFirstColumn="0" w:firstRowLastColumn="0" w:lastRowFirstColumn="0" w:lastRowLastColumn="0"/>
                   <w:rPr>
                     <w:rFonts w:ascii="Segoe UI" w:hAnsi="Segoe UI" w:cs="Segoe UI"/>
                     <w:b/>
@@ -2299,12 +2180,12 @@
               <w:szCs w:val="16"/>
             </w:rPr>
             <w:alias w:val="#Nav: /Totals/Totals_DiscountAmount"/>
-            <w:tag w:val="#Nav: FS_YSR_InventoryCustomerSales/50003"/>
+            <w:tag w:val="#Nav: Inventory_Customer_Sales/713"/>
             <w:id w:val="-1954698414"/>
             <w:placeholder>
               <w:docPart w:val="DefaultPlaceholder_-1854013440"/>
             </w:placeholder>
-            <w:dataBinding w:prefixMappings="xmlns:ns0='urn:microsoft-dynamics-nav/reports/FS_YSR_InventoryCustomerSales/50003/'" w:xpath="/ns0:NavWordReportXmlPart[1]/ns0:Totals[1]/ns0:Totals_DiscountAmount[1]" w:storeItemID="{17357049-351C-4FB5-BA49-88074E24903C}"/>
+            <w:dataBinding w:prefixMappings="xmlns:ns0='urn:microsoft-dynamics-nav/reports/Inventory_Customer_Sales/713/'" w:xpath="/ns0:NavWordReportXmlPart[1]/ns0:Totals[1]/ns0:Totals_DiscountAmount[1]" w:storeItemID="{0E62280E-706F-45D7-BEE2-B24E4BE14C14}"/>
             <w:text/>
           </w:sdtPr>
           <w:sdtContent>
@@ -2312,16 +2193,13 @@
               <w:tcPr>
                 <w:tcW w:w="992" w:type="dxa"/>
                 <w:tcBorders>
-                  <w:top w:val="single" w:sz="4" w:space="0" w:color="auto"/>
-                  <w:bottom w:val="single" w:sz="4" w:space="0" w:color="auto"/>
+                  <w:top w:val="single" w:color="auto" w:sz="4" w:space="0"/>
+                  <w:bottom w:val="single" w:color="auto" w:sz="4" w:space="0"/>
                 </w:tcBorders>
-                <w:shd w:val="clear" w:color="auto" w:fill="auto"/>
-                <w:vAlign w:val="center"/>
               </w:tcPr>
               <w:p>
                 <w:pPr>
                   <w:jc w:val="right"/>
-                  <w:cnfStyle w:val="000000000000" w:firstRow="0" w:lastRow="0" w:firstColumn="0" w:lastColumn="0" w:oddVBand="0" w:evenVBand="0" w:oddHBand="0" w:evenHBand="0" w:firstRowFirstColumn="0" w:firstRowLastColumn="0" w:lastRowFirstColumn="0" w:lastRowLastColumn="0"/>
                   <w:rPr>
                     <w:rFonts w:ascii="Segoe UI" w:hAnsi="Segoe UI" w:cs="Segoe UI"/>
                     <w:b/>
@@ -2356,12 +2234,12 @@
               <w:szCs w:val="16"/>
             </w:rPr>
             <w:alias w:val="#Nav: /Totals/Totals_Profit"/>
-            <w:tag w:val="#Nav: FS_YSR_InventoryCustomerSales/50003"/>
+            <w:tag w:val="#Nav: Inventory_Customer_Sales/713"/>
             <w:id w:val="1030993549"/>
             <w:placeholder>
               <w:docPart w:val="DefaultPlaceholder_-1854013440"/>
             </w:placeholder>
-            <w:dataBinding w:prefixMappings="xmlns:ns0='urn:microsoft-dynamics-nav/reports/FS_YSR_InventoryCustomerSales/50003/'" w:xpath="/ns0:NavWordReportXmlPart[1]/ns0:Totals[1]/ns0:Totals_Profit[1]" w:storeItemID="{17357049-351C-4FB5-BA49-88074E24903C}"/>
+            <w:dataBinding w:prefixMappings="xmlns:ns0='urn:microsoft-dynamics-nav/reports/Inventory_Customer_Sales/713/'" w:xpath="/ns0:NavWordReportXmlPart[1]/ns0:Totals[1]/ns0:Totals_Profit[1]" w:storeItemID="{0E62280E-706F-45D7-BEE2-B24E4BE14C14}"/>
             <w:text/>
           </w:sdtPr>
           <w:sdtContent>
@@ -2369,16 +2247,13 @@
               <w:tcPr>
                 <w:tcW w:w="993" w:type="dxa"/>
                 <w:tcBorders>
-                  <w:top w:val="single" w:sz="4" w:space="0" w:color="auto"/>
-                  <w:bottom w:val="single" w:sz="4" w:space="0" w:color="auto"/>
+                  <w:top w:val="single" w:color="auto" w:sz="4" w:space="0"/>
+                  <w:bottom w:val="single" w:color="auto" w:sz="4" w:space="0"/>
                 </w:tcBorders>
-                <w:shd w:val="clear" w:color="auto" w:fill="auto"/>
-                <w:vAlign w:val="center"/>
               </w:tcPr>
               <w:p>
                 <w:pPr>
                   <w:jc w:val="right"/>
-                  <w:cnfStyle w:val="000000000000" w:firstRow="0" w:lastRow="0" w:firstColumn="0" w:lastColumn="0" w:oddVBand="0" w:evenVBand="0" w:oddHBand="0" w:evenHBand="0" w:firstRowFirstColumn="0" w:firstRowLastColumn="0" w:lastRowFirstColumn="0" w:lastRowLastColumn="0"/>
                   <w:rPr>
                     <w:rFonts w:ascii="Segoe UI" w:hAnsi="Segoe UI" w:cs="Segoe UI"/>
                     <w:b/>
@@ -2413,12 +2288,12 @@
               <w:szCs w:val="16"/>
             </w:rPr>
             <w:alias w:val="#Nav: /Totals/Totals_ProfitPct"/>
-            <w:tag w:val="#Nav: FS_YSR_InventoryCustomerSales/50003"/>
+            <w:tag w:val="#Nav: Inventory_Customer_Sales/713"/>
             <w:id w:val="1949193217"/>
             <w:placeholder>
               <w:docPart w:val="DefaultPlaceholder_-1854013440"/>
             </w:placeholder>
-            <w:dataBinding w:prefixMappings="xmlns:ns0='urn:microsoft-dynamics-nav/reports/FS_YSR_InventoryCustomerSales/50003/'" w:xpath="/ns0:NavWordReportXmlPart[1]/ns0:Totals[1]/ns0:Totals_ProfitPct[1]" w:storeItemID="{17357049-351C-4FB5-BA49-88074E24903C}"/>
+            <w:dataBinding w:prefixMappings="xmlns:ns0='urn:microsoft-dynamics-nav/reports/Inventory_Customer_Sales/713/'" w:xpath="/ns0:NavWordReportXmlPart[1]/ns0:Totals[1]/ns0:Totals_ProfitPct[1]" w:storeItemID="{0E62280E-706F-45D7-BEE2-B24E4BE14C14}"/>
             <w:text/>
           </w:sdtPr>
           <w:sdtContent>
@@ -2426,16 +2301,13 @@
               <w:tcPr>
                 <w:tcW w:w="992" w:type="dxa"/>
                 <w:tcBorders>
-                  <w:top w:val="single" w:sz="4" w:space="0" w:color="auto"/>
-                  <w:bottom w:val="single" w:sz="4" w:space="0" w:color="auto"/>
+                  <w:top w:val="single" w:color="auto" w:sz="4" w:space="0"/>
+                  <w:bottom w:val="single" w:color="auto" w:sz="4" w:space="0"/>
                 </w:tcBorders>
-                <w:shd w:val="clear" w:color="auto" w:fill="auto"/>
-                <w:vAlign w:val="center"/>
               </w:tcPr>
               <w:p>
                 <w:pPr>
                   <w:jc w:val="right"/>
-                  <w:cnfStyle w:val="000000000000" w:firstRow="0" w:lastRow="0" w:firstColumn="0" w:lastColumn="0" w:oddVBand="0" w:evenVBand="0" w:oddHBand="0" w:evenHBand="0" w:firstRowFirstColumn="0" w:firstRowLastColumn="0" w:lastRowFirstColumn="0" w:lastRowLastColumn="0"/>
                   <w:rPr>
                     <w:rFonts w:ascii="Segoe UI" w:hAnsi="Segoe UI" w:cs="Segoe UI"/>
                     <w:b/>
@@ -2470,7 +2342,12 @@
       </w:pPr>
     </w:p>
     <w:sectPr>
-      <w:headerReference w:type="default" r:id="rId7"/>
+      <w:headerReference w:type="even" r:id="rId7"/>
+      <w:headerReference w:type="default" r:id="rId8"/>
+      <w:footerReference w:type="even" r:id="rId9"/>
+      <w:footerReference w:type="default" r:id="rId10"/>
+      <w:headerReference w:type="first" r:id="rId11"/>
+      <w:footerReference w:type="first" r:id="rId12"/>
       <w:pgSz w:w="11906" w:h="16838"/>
       <w:pgMar w:top="720" w:right="720" w:bottom="720" w:left="720" w:header="708" w:footer="708" w:gutter="0"/>
       <w:cols w:space="708"/>
@@ -2505,6 +2382,36 @@
 </w:endnotes>
 </file>
 
+<file path=word/footer1.xml><?xml version="1.0" encoding="utf-8"?>
+<w:ftr xmlns:wpc="http://schemas.microsoft.com/office/word/2010/wordprocessingCanvas" xmlns:cx="http://schemas.microsoft.com/office/drawing/2014/chartex" xmlns:cx1="http://schemas.microsoft.com/office/drawing/2015/9/8/chartex" xmlns:cx2="http://schemas.microsoft.com/office/drawing/2015/10/21/chartex" xmlns:cx3="http://schemas.microsoft.com/office/drawing/2016/5/9/chartex" xmlns:cx4="http://schemas.microsoft.com/office/drawing/2016/5/10/chartex" xmlns:cx5="http://schemas.microsoft.com/office/drawing/2016/5/11/chartex" xmlns:cx6="http://schemas.microsoft.com/office/drawing/2016/5/12/chartex" xmlns:cx7="http://schemas.microsoft.com/office/drawing/2016/5/13/chartex" xmlns:cx8="http://schemas.microsoft.com/office/drawing/2016/5/14/chartex" xmlns:mc="http://schemas.openxmlformats.org/markup-compatibility/2006" xmlns:aink="http://schemas.microsoft.com/office/drawing/2016/ink" xmlns:am3d="http://schemas.microsoft.com/office/drawing/2017/model3d" xmlns:o="urn:schemas-microsoft-com:office:office" xmlns:oel="http://schemas.microsoft.com/office/2019/extlst" xmlns:r="http://schemas.openxmlformats.org/officeDocument/2006/relationships" xmlns:m="http://schemas.openxmlformats.org/officeDocument/2006/math" xmlns:v="urn:schemas-microsoft-com:vml" xmlns:wp14="http://schemas.microsoft.com/office/word/2010/wordprocessingDrawing" xmlns:wp="http://schemas.openxmlformats.org/drawingml/2006/wordprocessingDrawing" xmlns:w10="urn:schemas-microsoft-com:office:word" xmlns:w="http://schemas.openxmlformats.org/wordprocessingml/2006/main" xmlns:w14="http://schemas.microsoft.com/office/word/2010/wordml" xmlns:w15="http://schemas.microsoft.com/office/word/2012/wordml" xmlns:w16cex="http://schemas.microsoft.com/office/word/2018/wordml/cex" xmlns:w16cid="http://schemas.microsoft.com/office/word/2016/wordml/cid" xmlns:w16="http://schemas.microsoft.com/office/word/2018/wordml" xmlns:w16du="http://schemas.microsoft.com/office/word/2023/wordml/word16du" xmlns:w16sdtdh="http://schemas.microsoft.com/office/word/2020/wordml/sdtdatahash" xmlns:w16sdtfl="http://schemas.microsoft.com/office/word/2024/wordml/sdtformatlock" xmlns:w16se="http://schemas.microsoft.com/office/word/2015/wordml/symex" xmlns:wpg="http://schemas.microsoft.com/office/word/2010/wordprocessingGroup" xmlns:wpi="http://schemas.microsoft.com/office/word/2010/wordprocessingInk" xmlns:wne="http://schemas.microsoft.com/office/word/2006/wordml" xmlns:wps="http://schemas.microsoft.com/office/word/2010/wordprocessingShape" mc:Ignorable="w14 w15 w16se w16cid w16 w16cex w16sdtdh w16sdtfl w16du wp14">
+  <w:p>
+    <w:pPr>
+      <w:pStyle w:val="Footer"/>
+    </w:pPr>
+  </w:p>
+</w:ftr>
+</file>
+
+<file path=word/footer2.xml><?xml version="1.0" encoding="utf-8"?>
+<w:ftr xmlns:wpc="http://schemas.microsoft.com/office/word/2010/wordprocessingCanvas" xmlns:cx="http://schemas.microsoft.com/office/drawing/2014/chartex" xmlns:cx1="http://schemas.microsoft.com/office/drawing/2015/9/8/chartex" xmlns:cx2="http://schemas.microsoft.com/office/drawing/2015/10/21/chartex" xmlns:cx3="http://schemas.microsoft.com/office/drawing/2016/5/9/chartex" xmlns:cx4="http://schemas.microsoft.com/office/drawing/2016/5/10/chartex" xmlns:cx5="http://schemas.microsoft.com/office/drawing/2016/5/11/chartex" xmlns:cx6="http://schemas.microsoft.com/office/drawing/2016/5/12/chartex" xmlns:cx7="http://schemas.microsoft.com/office/drawing/2016/5/13/chartex" xmlns:cx8="http://schemas.microsoft.com/office/drawing/2016/5/14/chartex" xmlns:mc="http://schemas.openxmlformats.org/markup-compatibility/2006" xmlns:aink="http://schemas.microsoft.com/office/drawing/2016/ink" xmlns:am3d="http://schemas.microsoft.com/office/drawing/2017/model3d" xmlns:o="urn:schemas-microsoft-com:office:office" xmlns:oel="http://schemas.microsoft.com/office/2019/extlst" xmlns:r="http://schemas.openxmlformats.org/officeDocument/2006/relationships" xmlns:m="http://schemas.openxmlformats.org/officeDocument/2006/math" xmlns:v="urn:schemas-microsoft-com:vml" xmlns:wp14="http://schemas.microsoft.com/office/word/2010/wordprocessingDrawing" xmlns:wp="http://schemas.openxmlformats.org/drawingml/2006/wordprocessingDrawing" xmlns:w10="urn:schemas-microsoft-com:office:word" xmlns:w="http://schemas.openxmlformats.org/wordprocessingml/2006/main" xmlns:w14="http://schemas.microsoft.com/office/word/2010/wordml" xmlns:w15="http://schemas.microsoft.com/office/word/2012/wordml" xmlns:w16cex="http://schemas.microsoft.com/office/word/2018/wordml/cex" xmlns:w16cid="http://schemas.microsoft.com/office/word/2016/wordml/cid" xmlns:w16="http://schemas.microsoft.com/office/word/2018/wordml" xmlns:w16du="http://schemas.microsoft.com/office/word/2023/wordml/word16du" xmlns:w16sdtdh="http://schemas.microsoft.com/office/word/2020/wordml/sdtdatahash" xmlns:w16sdtfl="http://schemas.microsoft.com/office/word/2024/wordml/sdtformatlock" xmlns:w16se="http://schemas.microsoft.com/office/word/2015/wordml/symex" xmlns:wpg="http://schemas.microsoft.com/office/word/2010/wordprocessingGroup" xmlns:wpi="http://schemas.microsoft.com/office/word/2010/wordprocessingInk" xmlns:wne="http://schemas.microsoft.com/office/word/2006/wordml" xmlns:wps="http://schemas.microsoft.com/office/word/2010/wordprocessingShape" mc:Ignorable="w14 w15 w16se w16cid w16 w16cex w16sdtdh w16sdtfl w16du wp14">
+  <w:p>
+    <w:pPr>
+      <w:pStyle w:val="Footer"/>
+    </w:pPr>
+  </w:p>
+</w:ftr>
+</file>
+
+<file path=word/footer3.xml><?xml version="1.0" encoding="utf-8"?>
+<w:ftr xmlns:wpc="http://schemas.microsoft.com/office/word/2010/wordprocessingCanvas" xmlns:cx="http://schemas.microsoft.com/office/drawing/2014/chartex" xmlns:cx1="http://schemas.microsoft.com/office/drawing/2015/9/8/chartex" xmlns:cx2="http://schemas.microsoft.com/office/drawing/2015/10/21/chartex" xmlns:cx3="http://schemas.microsoft.com/office/drawing/2016/5/9/chartex" xmlns:cx4="http://schemas.microsoft.com/office/drawing/2016/5/10/chartex" xmlns:cx5="http://schemas.microsoft.com/office/drawing/2016/5/11/chartex" xmlns:cx6="http://schemas.microsoft.com/office/drawing/2016/5/12/chartex" xmlns:cx7="http://schemas.microsoft.com/office/drawing/2016/5/13/chartex" xmlns:cx8="http://schemas.microsoft.com/office/drawing/2016/5/14/chartex" xmlns:mc="http://schemas.openxmlformats.org/markup-compatibility/2006" xmlns:aink="http://schemas.microsoft.com/office/drawing/2016/ink" xmlns:am3d="http://schemas.microsoft.com/office/drawing/2017/model3d" xmlns:o="urn:schemas-microsoft-com:office:office" xmlns:oel="http://schemas.microsoft.com/office/2019/extlst" xmlns:r="http://schemas.openxmlformats.org/officeDocument/2006/relationships" xmlns:m="http://schemas.openxmlformats.org/officeDocument/2006/math" xmlns:v="urn:schemas-microsoft-com:vml" xmlns:wp14="http://schemas.microsoft.com/office/word/2010/wordprocessingDrawing" xmlns:wp="http://schemas.openxmlformats.org/drawingml/2006/wordprocessingDrawing" xmlns:w10="urn:schemas-microsoft-com:office:word" xmlns:w="http://schemas.openxmlformats.org/wordprocessingml/2006/main" xmlns:w14="http://schemas.microsoft.com/office/word/2010/wordml" xmlns:w15="http://schemas.microsoft.com/office/word/2012/wordml" xmlns:w16cex="http://schemas.microsoft.com/office/word/2018/wordml/cex" xmlns:w16cid="http://schemas.microsoft.com/office/word/2016/wordml/cid" xmlns:w16="http://schemas.microsoft.com/office/word/2018/wordml" xmlns:w16du="http://schemas.microsoft.com/office/word/2023/wordml/word16du" xmlns:w16sdtdh="http://schemas.microsoft.com/office/word/2020/wordml/sdtdatahash" xmlns:w16sdtfl="http://schemas.microsoft.com/office/word/2024/wordml/sdtformatlock" xmlns:w16se="http://schemas.microsoft.com/office/word/2015/wordml/symex" xmlns:wpg="http://schemas.microsoft.com/office/word/2010/wordprocessingGroup" xmlns:wpi="http://schemas.microsoft.com/office/word/2010/wordprocessingInk" xmlns:wne="http://schemas.microsoft.com/office/word/2006/wordml" xmlns:wps="http://schemas.microsoft.com/office/word/2010/wordprocessingShape" mc:Ignorable="w14 w15 w16se w16cid w16 w16cex w16sdtdh w16sdtfl w16du wp14">
+  <w:p>
+    <w:pPr>
+      <w:pStyle w:val="Footer"/>
+    </w:pPr>
+  </w:p>
+</w:ftr>
+</file>
+
 <file path=word/footnotes.xml><?xml version="1.0" encoding="utf-8"?>
 <w:footnotes xmlns:wpc="http://schemas.microsoft.com/office/word/2010/wordprocessingCanvas" xmlns:cx="http://schemas.microsoft.com/office/drawing/2014/chartex" xmlns:cx1="http://schemas.microsoft.com/office/drawing/2015/9/8/chartex" xmlns:cx2="http://schemas.microsoft.com/office/drawing/2015/10/21/chartex" xmlns:cx3="http://schemas.microsoft.com/office/drawing/2016/5/9/chartex" xmlns:cx4="http://schemas.microsoft.com/office/drawing/2016/5/10/chartex" xmlns:cx5="http://schemas.microsoft.com/office/drawing/2016/5/11/chartex" xmlns:cx6="http://schemas.microsoft.com/office/drawing/2016/5/12/chartex" xmlns:cx7="http://schemas.microsoft.com/office/drawing/2016/5/13/chartex" xmlns:cx8="http://schemas.microsoft.com/office/drawing/2016/5/14/chartex" xmlns:mc="http://schemas.openxmlformats.org/markup-compatibility/2006" xmlns:aink="http://schemas.microsoft.com/office/drawing/2016/ink" xmlns:am3d="http://schemas.microsoft.com/office/drawing/2017/model3d" xmlns:o="urn:schemas-microsoft-com:office:office" xmlns:oel="http://schemas.microsoft.com/office/2019/extlst" xmlns:r="http://schemas.openxmlformats.org/officeDocument/2006/relationships" xmlns:m="http://schemas.openxmlformats.org/officeDocument/2006/math" xmlns:v="urn:schemas-microsoft-com:vml" xmlns:wp14="http://schemas.microsoft.com/office/word/2010/wordprocessingDrawing" xmlns:wp="http://schemas.openxmlformats.org/drawingml/2006/wordprocessingDrawing" xmlns:w10="urn:schemas-microsoft-com:office:word" xmlns:w="http://schemas.openxmlformats.org/wordprocessingml/2006/main" xmlns:w14="http://schemas.microsoft.com/office/word/2010/wordml" xmlns:w15="http://schemas.microsoft.com/office/word/2012/wordml" xmlns:w16cex="http://schemas.microsoft.com/office/word/2018/wordml/cex" xmlns:w16cid="http://schemas.microsoft.com/office/word/2016/wordml/cid" xmlns:w16="http://schemas.microsoft.com/office/word/2018/wordml" xmlns:w16du="http://schemas.microsoft.com/office/word/2023/wordml/word16du" xmlns:w16sdtdh="http://schemas.microsoft.com/office/word/2020/wordml/sdtdatahash" xmlns:w16sdtfl="http://schemas.microsoft.com/office/word/2024/wordml/sdtformatlock" xmlns:w16se="http://schemas.microsoft.com/office/word/2015/wordml/symex" xmlns:wpg="http://schemas.microsoft.com/office/word/2010/wordprocessingGroup" xmlns:wpi="http://schemas.microsoft.com/office/word/2010/wordprocessingInk" xmlns:wne="http://schemas.microsoft.com/office/word/2006/wordml" xmlns:wps="http://schemas.microsoft.com/office/word/2010/wordprocessingShape" mc:Ignorable="w14 w15 w16se w16cid w16 w16cex w16sdtdh w16sdtfl w16du wp14">
   <w:footnote w:type="separator" w:id="-1">
@@ -2532,17 +2439,27 @@
 
 <file path=word/header1.xml><?xml version="1.0" encoding="utf-8"?>
 <w:hdr xmlns:wpc="http://schemas.microsoft.com/office/word/2010/wordprocessingCanvas" xmlns:cx="http://schemas.microsoft.com/office/drawing/2014/chartex" xmlns:cx1="http://schemas.microsoft.com/office/drawing/2015/9/8/chartex" xmlns:cx2="http://schemas.microsoft.com/office/drawing/2015/10/21/chartex" xmlns:cx3="http://schemas.microsoft.com/office/drawing/2016/5/9/chartex" xmlns:cx4="http://schemas.microsoft.com/office/drawing/2016/5/10/chartex" xmlns:cx5="http://schemas.microsoft.com/office/drawing/2016/5/11/chartex" xmlns:cx6="http://schemas.microsoft.com/office/drawing/2016/5/12/chartex" xmlns:cx7="http://schemas.microsoft.com/office/drawing/2016/5/13/chartex" xmlns:cx8="http://schemas.microsoft.com/office/drawing/2016/5/14/chartex" xmlns:mc="http://schemas.openxmlformats.org/markup-compatibility/2006" xmlns:aink="http://schemas.microsoft.com/office/drawing/2016/ink" xmlns:am3d="http://schemas.microsoft.com/office/drawing/2017/model3d" xmlns:o="urn:schemas-microsoft-com:office:office" xmlns:oel="http://schemas.microsoft.com/office/2019/extlst" xmlns:r="http://schemas.openxmlformats.org/officeDocument/2006/relationships" xmlns:m="http://schemas.openxmlformats.org/officeDocument/2006/math" xmlns:v="urn:schemas-microsoft-com:vml" xmlns:wp14="http://schemas.microsoft.com/office/word/2010/wordprocessingDrawing" xmlns:wp="http://schemas.openxmlformats.org/drawingml/2006/wordprocessingDrawing" xmlns:w10="urn:schemas-microsoft-com:office:word" xmlns:w="http://schemas.openxmlformats.org/wordprocessingml/2006/main" xmlns:w14="http://schemas.microsoft.com/office/word/2010/wordml" xmlns:w15="http://schemas.microsoft.com/office/word/2012/wordml" xmlns:w16cex="http://schemas.microsoft.com/office/word/2018/wordml/cex" xmlns:w16cid="http://schemas.microsoft.com/office/word/2016/wordml/cid" xmlns:w16="http://schemas.microsoft.com/office/word/2018/wordml" xmlns:w16du="http://schemas.microsoft.com/office/word/2023/wordml/word16du" xmlns:w16sdtdh="http://schemas.microsoft.com/office/word/2020/wordml/sdtdatahash" xmlns:w16sdtfl="http://schemas.microsoft.com/office/word/2024/wordml/sdtformatlock" xmlns:w16se="http://schemas.microsoft.com/office/word/2015/wordml/symex" xmlns:wpg="http://schemas.microsoft.com/office/word/2010/wordprocessingGroup" xmlns:wpi="http://schemas.microsoft.com/office/word/2010/wordprocessingInk" xmlns:wne="http://schemas.microsoft.com/office/word/2006/wordml" xmlns:wps="http://schemas.microsoft.com/office/word/2010/wordprocessingShape" mc:Ignorable="w14 w15 w16se w16cid w16 w16cex w16sdtdh w16sdtfl w16du wp14">
+  <w:p>
+    <w:pPr>
+      <w:pStyle w:val="Header"/>
+    </w:pPr>
+  </w:p>
+</w:hdr>
+</file>
+
+<file path=word/header2.xml><?xml version="1.0" encoding="utf-8"?>
+<w:hdr xmlns:wpc="http://schemas.microsoft.com/office/word/2010/wordprocessingCanvas" xmlns:cx="http://schemas.microsoft.com/office/drawing/2014/chartex" xmlns:cx1="http://schemas.microsoft.com/office/drawing/2015/9/8/chartex" xmlns:cx2="http://schemas.microsoft.com/office/drawing/2015/10/21/chartex" xmlns:cx3="http://schemas.microsoft.com/office/drawing/2016/5/9/chartex" xmlns:cx4="http://schemas.microsoft.com/office/drawing/2016/5/10/chartex" xmlns:cx5="http://schemas.microsoft.com/office/drawing/2016/5/11/chartex" xmlns:cx6="http://schemas.microsoft.com/office/drawing/2016/5/12/chartex" xmlns:cx7="http://schemas.microsoft.com/office/drawing/2016/5/13/chartex" xmlns:cx8="http://schemas.microsoft.com/office/drawing/2016/5/14/chartex" xmlns:mc="http://schemas.openxmlformats.org/markup-compatibility/2006" xmlns:aink="http://schemas.microsoft.com/office/drawing/2016/ink" xmlns:am3d="http://schemas.microsoft.com/office/drawing/2017/model3d" xmlns:o="urn:schemas-microsoft-com:office:office" xmlns:oel="http://schemas.microsoft.com/office/2019/extlst" xmlns:r="http://schemas.openxmlformats.org/officeDocument/2006/relationships" xmlns:m="http://schemas.openxmlformats.org/officeDocument/2006/math" xmlns:v="urn:schemas-microsoft-com:vml" xmlns:wp14="http://schemas.microsoft.com/office/word/2010/wordprocessingDrawing" xmlns:wp="http://schemas.openxmlformats.org/drawingml/2006/wordprocessingDrawing" xmlns:w10="urn:schemas-microsoft-com:office:word" xmlns:w="http://schemas.openxmlformats.org/wordprocessingml/2006/main" xmlns:w14="http://schemas.microsoft.com/office/word/2010/wordml" xmlns:w15="http://schemas.microsoft.com/office/word/2012/wordml" xmlns:w16cex="http://schemas.microsoft.com/office/word/2018/wordml/cex" xmlns:w16cid="http://schemas.microsoft.com/office/word/2016/wordml/cid" xmlns:w16="http://schemas.microsoft.com/office/word/2018/wordml" xmlns:w16du="http://schemas.microsoft.com/office/word/2023/wordml/word16du" xmlns:w16sdtdh="http://schemas.microsoft.com/office/word/2020/wordml/sdtdatahash" xmlns:w16sdtfl="http://schemas.microsoft.com/office/word/2024/wordml/sdtformatlock" xmlns:w16se="http://schemas.microsoft.com/office/word/2015/wordml/symex" xmlns:wpg="http://schemas.microsoft.com/office/word/2010/wordprocessingGroup" xmlns:wpi="http://schemas.microsoft.com/office/word/2010/wordprocessingInk" xmlns:wne="http://schemas.microsoft.com/office/word/2006/wordml" xmlns:wps="http://schemas.microsoft.com/office/word/2010/wordprocessingShape" mc:Ignorable="w14 w15 w16se w16cid w16 w16cex w16sdtdh w16sdtfl w16du wp14">
   <w:tbl>
     <w:tblPr>
       <w:tblStyle w:val="TableGrid"/>
       <w:tblW w:w="10490" w:type="dxa"/>
       <w:tblBorders>
-        <w:top w:val="none" w:sz="0" w:space="0" w:color="auto"/>
-        <w:left w:val="none" w:sz="0" w:space="0" w:color="auto"/>
-        <w:bottom w:val="none" w:sz="0" w:space="0" w:color="auto"/>
-        <w:right w:val="none" w:sz="0" w:space="0" w:color="auto"/>
-        <w:insideH w:val="none" w:sz="0" w:space="0" w:color="auto"/>
-        <w:insideV w:val="none" w:sz="0" w:space="0" w:color="auto"/>
+        <w:top w:val="none" w:color="auto" w:sz="0" w:space="0"/>
+        <w:left w:val="none" w:color="auto" w:sz="0" w:space="0"/>
+        <w:bottom w:val="none" w:color="auto" w:sz="0" w:space="0"/>
+        <w:right w:val="none" w:color="auto" w:sz="0" w:space="0"/>
+        <w:insideH w:val="none" w:color="auto" w:sz="0" w:space="0"/>
+        <w:insideV w:val="none" w:color="auto" w:sz="0" w:space="0"/>
       </w:tblBorders>
       <w:tblLook w:val="04A0" w:firstRow="1" w:lastRow="0" w:firstColumn="1" w:lastColumn="0" w:noHBand="0" w:noVBand="1"/>
     </w:tblPr>
@@ -2551,29 +2468,29 @@
       <w:gridCol w:w="5173"/>
     </w:tblGrid>
     <w:tr>
-      <w:tc>
-        <w:tcPr>
-          <w:tcW w:w="5317" w:type="dxa"/>
-        </w:tcPr>
-        <w:sdt>
-          <w:sdtPr>
-            <w:rPr>
-              <w:rFonts w:ascii="Segoe UI" w:hAnsi="Segoe UI" w:cs="Segoe UI"/>
-              <w:b/>
-              <w:bCs/>
-              <w:sz w:val="28"/>
-              <w:szCs w:val="28"/>
-            </w:rPr>
-            <w:alias w:val="#Nav: /Labels/InventoryCustomerSales"/>
-            <w:tag w:val="#Nav: FS_YSR_InventoryCustomerSales/50003"/>
-            <w:id w:val="-1816323594"/>
-            <w:placeholder>
-              <w:docPart w:val="DefaultPlaceholder_-1854013440"/>
-            </w:placeholder>
-            <w:dataBinding w:prefixMappings="xmlns:ns0='urn:microsoft-dynamics-nav/reports/FS_YSR_InventoryCustomerSales/50003/'" w:xpath="/ns0:NavWordReportXmlPart[1]/ns0:Labels[1]/ns0:InventoryCustomerSales[1]" w:storeItemID="{17357049-351C-4FB5-BA49-88074E24903C}"/>
-            <w:text/>
-          </w:sdtPr>
-          <w:sdtContent>
+      <w:sdt>
+        <w:sdtPr>
+          <w:rPr>
+            <w:rFonts w:ascii="Segoe UI" w:hAnsi="Segoe UI" w:cs="Segoe UI"/>
+            <w:b/>
+            <w:bCs/>
+            <w:sz w:val="28"/>
+            <w:szCs w:val="28"/>
+          </w:rPr>
+          <w:alias w:val="#Nav: /Labels/InventoryCustomerSalesLbl"/>
+          <w:tag w:val="#Nav: Inventory_Customer_Sales/713"/>
+          <w:id w:val="1258788525"/>
+          <w:placeholder>
+            <w:docPart w:val="DefaultPlaceholder_-1854013440"/>
+          </w:placeholder>
+          <w:dataBinding w:prefixMappings="xmlns:ns0='urn:microsoft-dynamics-nav/reports/Inventory_Customer_Sales/713/'" w:xpath="/ns0:NavWordReportXmlPart[1]/ns0:Labels[1]/ns0:InventoryCustomerSalesLbl[1]" w:storeItemID="{0E62280E-706F-45D7-BEE2-B24E4BE14C14}"/>
+          <w:text/>
+        </w:sdtPr>
+        <w:sdtContent>
+          <w:tc>
+            <w:tcPr>
+              <w:tcW w:w="5317" w:type="dxa"/>
+            </w:tcPr>
             <w:p>
               <w:pPr>
                 <w:pStyle w:val="Header"/>
@@ -2594,13 +2511,13 @@
                   <w:sz w:val="28"/>
                   <w:szCs w:val="28"/>
                 </w:rPr>
-                <w:t>InventoryCustomerSales</w:t>
+                <w:t>InventoryCustomerSalesLbl</w:t>
               </w:r>
               <w:proofErr w:type="spellEnd"/>
             </w:p>
-          </w:sdtContent>
-        </w:sdt>
-      </w:tc>
+          </w:tc>
+        </w:sdtContent>
+      </w:sdt>
       <w:tc>
         <w:tcPr>
           <w:tcW w:w="5173" w:type="dxa"/>
@@ -2646,7 +2563,7 @@
               <w:sz w:val="16"/>
               <w:szCs w:val="16"/>
             </w:rPr>
-            <w:t>Wednesday, 20 August 2025</w:t>
+            <w:t>Monday, 8 December 2025</w:t>
           </w:r>
           <w:r>
             <w:rPr>
@@ -2784,12 +2701,12 @@
                 <w:szCs w:val="16"/>
               </w:rPr>
               <w:alias w:val="#Nav: /BCReportInformation/ReportRequest/UserName"/>
-              <w:tag w:val="#Nav: FS_YSR_InventoryCustomerSales/50003"/>
+              <w:tag w:val="#Nav: Inventory_Customer_Sales/713"/>
               <w:id w:val="-249272221"/>
               <w:placeholder>
                 <w:docPart w:val="66E472B77CED4562AC3C88900F76E129"/>
               </w:placeholder>
-              <w:dataBinding w:prefixMappings="xmlns:ns0='urn:microsoft-dynamics-nav/reports/FS_YSR_InventoryCustomerSales/50003/'" w:xpath="/ns0:NavWordReportXmlPart[1]/ns0:BCReportInformation[1]/ns0:ReportRequest[1]/ns0:UserName[1]" w:storeItemID="{17357049-351C-4FB5-BA49-88074E24903C}"/>
+              <w:dataBinding w:prefixMappings="xmlns:ns0='urn:microsoft-dynamics-nav/reports/Inventory_Customer_Sales/713/'" w:xpath="/ns0:NavWordReportXmlPart[1]/ns0:BCReportInformation[1]/ns0:ReportRequest[1]/ns0:UserName[1]" w:storeItemID="{0E62280E-706F-45D7-BEE2-B24E4BE14C14}"/>
               <w:text/>
             </w:sdtPr>
             <w:sdtContent>
@@ -2818,7 +2735,7 @@
     </w:tr>
     <w:tr>
       <w:trPr>
-        <w:trHeight w:hRule="exact" w:val="340"/>
+        <w:trHeight w:val="340" w:hRule="exact"/>
       </w:trPr>
       <w:tc>
         <w:tcPr>
@@ -2832,12 +2749,12 @@
               <w:szCs w:val="16"/>
             </w:rPr>
             <w:alias w:val="#Nav: /BCReportInformation/ReportRequest/CompanyName"/>
-            <w:tag w:val="#Nav: FS_YSR_InventoryCustomerSales/50003"/>
+            <w:tag w:val="#Nav: Inventory_Customer_Sales/713"/>
             <w:id w:val="-1641258246"/>
             <w:placeholder>
               <w:docPart w:val="C094C4BF41804FD1B5E0F604A4595C5E"/>
             </w:placeholder>
-            <w:dataBinding w:prefixMappings="xmlns:ns0='urn:microsoft-dynamics-nav/reports/FS_YSR_InventoryCustomerSales/50003/'" w:xpath="/ns0:NavWordReportXmlPart[1]/ns0:BCReportInformation[1]/ns0:ReportRequest[1]/ns0:CompanyName[1]" w:storeItemID="{17357049-351C-4FB5-BA49-88074E24903C}"/>
+            <w:dataBinding w:prefixMappings="xmlns:ns0='urn:microsoft-dynamics-nav/reports/Inventory_Customer_Sales/713/'" w:xpath="/ns0:NavWordReportXmlPart[1]/ns0:BCReportInformation[1]/ns0:ReportRequest[1]/ns0:CompanyName[1]" w:storeItemID="{0E62280E-706F-45D7-BEE2-B24E4BE14C14}"/>
             <w:text/>
           </w:sdtPr>
           <w:sdtContent>
@@ -2886,38 +2803,38 @@
     </w:tr>
     <w:tr>
       <w:trPr>
-        <w:trHeight w:hRule="exact" w:val="340"/>
+        <w:trHeight w:val="340" w:hRule="exact"/>
       </w:trPr>
       <w:tc>
         <w:tcPr>
           <w:tcW w:w="5317" w:type="dxa"/>
         </w:tcPr>
-        <w:sdt>
-          <w:sdtPr>
+        <w:p>
+          <w:pPr>
+            <w:pStyle w:val="Header"/>
             <w:rPr>
               <w:rFonts w:ascii="Segoe UI" w:hAnsi="Segoe UI" w:cs="Segoe UI"/>
               <w:sz w:val="16"/>
               <w:szCs w:val="16"/>
             </w:rPr>
-            <w:alias w:val="#Nav: /ReportHeader/PeriodText"/>
-            <w:tag w:val="#Nav: FS_YSR_InventoryCustomerSales/50003"/>
-            <w:id w:val="-420478092"/>
-            <w:placeholder>
-              <w:docPart w:val="62F3814E3AB24A228E77E52EB6F6D10F"/>
-            </w:placeholder>
-            <w:dataBinding w:prefixMappings="xmlns:ns0='urn:microsoft-dynamics-nav/reports/FS_YSR_InventoryCustomerSales/50003/'" w:xpath="/ns0:NavWordReportXmlPart[1]/ns0:ReportHeader[1]/ns0:PeriodText[1]" w:storeItemID="{17357049-351C-4FB5-BA49-88074E24903C}"/>
-            <w:text/>
-          </w:sdtPr>
-          <w:sdtContent>
-            <w:p>
-              <w:pPr>
-                <w:pStyle w:val="Header"/>
-                <w:rPr>
-                  <w:rFonts w:ascii="Segoe UI" w:hAnsi="Segoe UI" w:cs="Segoe UI"/>
-                  <w:sz w:val="16"/>
-                  <w:szCs w:val="16"/>
-                </w:rPr>
-              </w:pPr>
+          </w:pPr>
+          <w:sdt>
+            <w:sdtPr>
+              <w:rPr>
+                <w:rFonts w:ascii="Segoe UI" w:hAnsi="Segoe UI" w:cs="Segoe UI"/>
+                <w:sz w:val="16"/>
+                <w:szCs w:val="16"/>
+              </w:rPr>
+              <w:alias w:val="#Nav: /ReportHeader/ItemFilter"/>
+              <w:tag w:val="#Nav: Inventory_Customer_Sales/713"/>
+              <w:id w:val="-1090542280"/>
+              <w:placeholder>
+                <w:docPart w:val="DefaultPlaceholder_-1854013440"/>
+              </w:placeholder>
+              <w:dataBinding w:prefixMappings="xmlns:ns0='urn:microsoft-dynamics-nav/reports/Inventory_Customer_Sales/713/'" w:xpath="/ns0:NavWordReportXmlPart[1]/ns0:ReportHeader[1]/ns0:ItemFilter[1]" w:storeItemID="{0E62280E-706F-45D7-BEE2-B24E4BE14C14}"/>
+              <w:text/>
+            </w:sdtPr>
+            <w:sdtContent>
               <w:proofErr w:type="spellStart"/>
               <w:r>
                 <w:rPr>
@@ -2925,12 +2842,12 @@
                   <w:sz w:val="16"/>
                   <w:szCs w:val="16"/>
                 </w:rPr>
-                <w:t>PeriodText</w:t>
+                <w:t>ItemFilter</w:t>
               </w:r>
               <w:proofErr w:type="spellEnd"/>
-            </w:p>
-          </w:sdtContent>
-        </w:sdt>
+            </w:sdtContent>
+          </w:sdt>
+        </w:p>
       </w:tc>
       <w:tc>
         <w:tcPr>
@@ -2945,7 +2862,64 @@
     </w:tr>
     <w:tr>
       <w:trPr>
-        <w:trHeight w:hRule="exact" w:val="170"/>
+        <w:trHeight w:val="340" w:hRule="exact"/>
+      </w:trPr>
+      <w:tc>
+        <w:tcPr>
+          <w:tcW w:w="5317" w:type="dxa"/>
+        </w:tcPr>
+        <w:p>
+          <w:pPr>
+            <w:pStyle w:val="Header"/>
+            <w:rPr>
+              <w:rFonts w:ascii="Segoe UI" w:hAnsi="Segoe UI" w:cs="Segoe UI"/>
+              <w:sz w:val="16"/>
+              <w:szCs w:val="16"/>
+            </w:rPr>
+          </w:pPr>
+          <w:sdt>
+            <w:sdtPr>
+              <w:rPr>
+                <w:rFonts w:ascii="Segoe UI" w:hAnsi="Segoe UI" w:cs="Segoe UI"/>
+                <w:sz w:val="16"/>
+                <w:szCs w:val="16"/>
+              </w:rPr>
+              <w:alias w:val="#Nav: /ReportHeader/ItemLedgEntryFilter"/>
+              <w:tag w:val="#Nav: Inventory_Customer_Sales/713"/>
+              <w:id w:val="821245802"/>
+              <w:placeholder>
+                <w:docPart w:val="DefaultPlaceholder_-1854013440"/>
+              </w:placeholder>
+              <w:dataBinding w:prefixMappings="xmlns:ns0='urn:microsoft-dynamics-nav/reports/Inventory_Customer_Sales/713/'" w:xpath="/ns0:NavWordReportXmlPart[1]/ns0:ReportHeader[1]/ns0:ItemLedgEntryFilter[1]" w:storeItemID="{0E62280E-706F-45D7-BEE2-B24E4BE14C14}"/>
+              <w:text/>
+            </w:sdtPr>
+            <w:sdtContent>
+              <w:r>
+                <w:rPr>
+                  <w:rFonts w:ascii="Segoe UI" w:hAnsi="Segoe UI" w:cs="Segoe UI"/>
+                  <w:sz w:val="16"/>
+                  <w:szCs w:val="16"/>
+                </w:rPr>
+                <w:t>ItemLedgEntryFilter</w:t>
+              </w:r>
+            </w:sdtContent>
+          </w:sdt>
+        </w:p>
+      </w:tc>
+      <w:tc>
+        <w:tcPr>
+          <w:tcW w:w="5173" w:type="dxa"/>
+        </w:tcPr>
+        <w:p>
+          <w:pPr>
+            <w:pStyle w:val="Header"/>
+          </w:pPr>
+        </w:p>
+      </w:tc>
+    </w:tr>
+    <w:tr>
+      <w:trPr>
+        <w:trHeight w:val="170" w:hRule="exact"/>
       </w:trPr>
       <w:tc>
         <w:tcPr>
@@ -2974,6 +2948,16 @@
       </w:tc>
     </w:tr>
   </w:tbl>
+  <w:p>
+    <w:pPr>
+      <w:pStyle w:val="Header"/>
+    </w:pPr>
+  </w:p>
+</w:hdr>
+</file>
+
+<file path=word/header3.xml><?xml version="1.0" encoding="utf-8"?>
+<w:hdr xmlns:wpc="http://schemas.microsoft.com/office/word/2010/wordprocessingCanvas" xmlns:cx="http://schemas.microsoft.com/office/drawing/2014/chartex" xmlns:cx1="http://schemas.microsoft.com/office/drawing/2015/9/8/chartex" xmlns:cx2="http://schemas.microsoft.com/office/drawing/2015/10/21/chartex" xmlns:cx3="http://schemas.microsoft.com/office/drawing/2016/5/9/chartex" xmlns:cx4="http://schemas.microsoft.com/office/drawing/2016/5/10/chartex" xmlns:cx5="http://schemas.microsoft.com/office/drawing/2016/5/11/chartex" xmlns:cx6="http://schemas.microsoft.com/office/drawing/2016/5/12/chartex" xmlns:cx7="http://schemas.microsoft.com/office/drawing/2016/5/13/chartex" xmlns:cx8="http://schemas.microsoft.com/office/drawing/2016/5/14/chartex" xmlns:mc="http://schemas.openxmlformats.org/markup-compatibility/2006" xmlns:aink="http://schemas.microsoft.com/office/drawing/2016/ink" xmlns:am3d="http://schemas.microsoft.com/office/drawing/2017/model3d" xmlns:o="urn:schemas-microsoft-com:office:office" xmlns:oel="http://schemas.microsoft.com/office/2019/extlst" xmlns:r="http://schemas.openxmlformats.org/officeDocument/2006/relationships" xmlns:m="http://schemas.openxmlformats.org/officeDocument/2006/math" xmlns:v="urn:schemas-microsoft-com:vml" xmlns:wp14="http://schemas.microsoft.com/office/word/2010/wordprocessingDrawing" xmlns:wp="http://schemas.openxmlformats.org/drawingml/2006/wordprocessingDrawing" xmlns:w10="urn:schemas-microsoft-com:office:word" xmlns:w="http://schemas.openxmlformats.org/wordprocessingml/2006/main" xmlns:w14="http://schemas.microsoft.com/office/word/2010/wordml" xmlns:w15="http://schemas.microsoft.com/office/word/2012/wordml" xmlns:w16cex="http://schemas.microsoft.com/office/word/2018/wordml/cex" xmlns:w16cid="http://schemas.microsoft.com/office/word/2016/wordml/cid" xmlns:w16="http://schemas.microsoft.com/office/word/2018/wordml" xmlns:w16du="http://schemas.microsoft.com/office/word/2023/wordml/word16du" xmlns:w16sdtdh="http://schemas.microsoft.com/office/word/2020/wordml/sdtdatahash" xmlns:w16sdtfl="http://schemas.microsoft.com/office/word/2024/wordml/sdtformatlock" xmlns:w16se="http://schemas.microsoft.com/office/word/2015/wordml/symex" xmlns:wpg="http://schemas.microsoft.com/office/word/2010/wordprocessingGroup" xmlns:wpi="http://schemas.microsoft.com/office/word/2010/wordprocessingInk" xmlns:wne="http://schemas.microsoft.com/office/word/2006/wordml" xmlns:wps="http://schemas.microsoft.com/office/word/2010/wordprocessingShape" mc:Ignorable="w14 w15 w16se w16cid w16 w16cex w16sdtdh w16sdtfl w16du wp14">
   <w:p>
     <w:pPr>
       <w:pStyle w:val="Header"/>
@@ -3642,35 +3626,6 @@
     </w:docPart>
     <w:docPart>
       <w:docPartPr>
-        <w:name w:val="62F3814E3AB24A228E77E52EB6F6D10F"/>
-        <w:category>
-          <w:name w:val="General"/>
-          <w:gallery w:val="placeholder"/>
-        </w:category>
-        <w:types>
-          <w:type w:val="bbPlcHdr"/>
-        </w:types>
-        <w:behaviors>
-          <w:behavior w:val="content"/>
-        </w:behaviors>
-        <w:guid w:val="{8D7B1FFF-6123-4828-8BD7-CABC62CE3AB9}"/>
-      </w:docPartPr>
-      <w:docPartBody>
-        <w:p>
-          <w:pPr>
-            <w:pStyle w:val="62F3814E3AB24A228E77E52EB6F6D10F"/>
-          </w:pPr>
-          <w:r>
-            <w:rPr>
-              <w:rStyle w:val="PlaceholderText"/>
-            </w:rPr>
-            <w:t>Click or tap here to enter text.</w:t>
-          </w:r>
-        </w:p>
-      </w:docPartBody>
-    </w:docPart>
-    <w:docPart>
-      <w:docPartPr>
         <w:name w:val="C094C4BF41804FD1B5E0F604A4595C5E"/>
         <w:category>
           <w:name w:val="General"/>
@@ -3688,64 +3643,6 @@
         <w:p>
           <w:pPr>
             <w:pStyle w:val="C094C4BF41804FD1B5E0F604A4595C5E"/>
-          </w:pPr>
-          <w:r>
-            <w:rPr>
-              <w:rStyle w:val="PlaceholderText"/>
-            </w:rPr>
-            <w:t>Click or tap here to enter text.</w:t>
-          </w:r>
-        </w:p>
-      </w:docPartBody>
-    </w:docPart>
-    <w:docPart>
-      <w:docPartPr>
-        <w:name w:val="9DDBA3633D6C4A31997050B21A372EF2"/>
-        <w:category>
-          <w:name w:val="General"/>
-          <w:gallery w:val="placeholder"/>
-        </w:category>
-        <w:types>
-          <w:type w:val="bbPlcHdr"/>
-        </w:types>
-        <w:behaviors>
-          <w:behavior w:val="content"/>
-        </w:behaviors>
-        <w:guid w:val="{D0E39275-9C79-4AA9-BBE8-5A2F5ACF483B}"/>
-      </w:docPartPr>
-      <w:docPartBody>
-        <w:p>
-          <w:pPr>
-            <w:pStyle w:val="9DDBA3633D6C4A31997050B21A372EF2"/>
-          </w:pPr>
-          <w:r>
-            <w:rPr>
-              <w:rStyle w:val="PlaceholderText"/>
-            </w:rPr>
-            <w:t>Click or tap here to enter text.</w:t>
-          </w:r>
-        </w:p>
-      </w:docPartBody>
-    </w:docPart>
-    <w:docPart>
-      <w:docPartPr>
-        <w:name w:val="D68FD56984E5485F84E4ED8C5C4B8C12"/>
-        <w:category>
-          <w:name w:val="General"/>
-          <w:gallery w:val="placeholder"/>
-        </w:category>
-        <w:types>
-          <w:type w:val="bbPlcHdr"/>
-        </w:types>
-        <w:behaviors>
-          <w:behavior w:val="content"/>
-        </w:behaviors>
-        <w:guid w:val="{6DDDCEEE-D3F3-4715-90F4-E91021251E4E}"/>
-      </w:docPartPr>
-      <w:docPartBody>
-        <w:p>
-          <w:pPr>
-            <w:pStyle w:val="D68FD56984E5485F84E4ED8C5C4B8C12"/>
           </w:pPr>
           <w:r>
             <w:rPr>
@@ -3829,6 +3726,7 @@
     <w:rsid w:val="000A7000"/>
     <w:rsid w:val="00123962"/>
     <w:rsid w:val="001420A3"/>
+    <w:rsid w:val="00260D55"/>
     <w:rsid w:val="002615D8"/>
     <w:rsid w:val="002D4D94"/>
     <w:rsid w:val="003267BB"/>
@@ -3855,11 +3753,16 @@
     <w:rsid w:val="005A0E08"/>
     <w:rsid w:val="005D614E"/>
     <w:rsid w:val="005D6460"/>
+    <w:rsid w:val="005F6712"/>
+    <w:rsid w:val="00623127"/>
     <w:rsid w:val="00635466"/>
     <w:rsid w:val="00640FB7"/>
     <w:rsid w:val="00645647"/>
     <w:rsid w:val="00646C7A"/>
+    <w:rsid w:val="0066017E"/>
     <w:rsid w:val="00692805"/>
+    <w:rsid w:val="006D03A3"/>
+    <w:rsid w:val="006E5104"/>
     <w:rsid w:val="00725D1E"/>
     <w:rsid w:val="00761BD4"/>
     <w:rsid w:val="0076534F"/>
@@ -3881,18 +3784,27 @@
     <w:rsid w:val="00A41FC4"/>
     <w:rsid w:val="00A73DD9"/>
     <w:rsid w:val="00AB0059"/>
+    <w:rsid w:val="00AF4671"/>
+    <w:rsid w:val="00C3592C"/>
+    <w:rsid w:val="00C629CD"/>
     <w:rsid w:val="00C94998"/>
     <w:rsid w:val="00C95CF1"/>
+    <w:rsid w:val="00CC07A7"/>
     <w:rsid w:val="00D273B4"/>
     <w:rsid w:val="00D343D3"/>
     <w:rsid w:val="00D52BDD"/>
     <w:rsid w:val="00DD031A"/>
     <w:rsid w:val="00E12E86"/>
     <w:rsid w:val="00E301BF"/>
+    <w:rsid w:val="00E42C48"/>
     <w:rsid w:val="00E4545C"/>
+    <w:rsid w:val="00E56C7E"/>
+    <w:rsid w:val="00E61AE6"/>
     <w:rsid w:val="00ED4AC4"/>
     <w:rsid w:val="00F27920"/>
     <w:rsid w:val="00F53637"/>
+    <w:rsid w:val="00F75864"/>
+    <w:rsid w:val="00FA3758"/>
     <w:rsid w:val="00FC4785"/>
     <w:rsid w:val="00FD68EC"/>
     <w:rsid w:val="00FE4A68"/>
@@ -4361,13 +4273,6 @@
     <w:name w:val="66E472B77CED4562AC3C88900F76E129"/>
     <w:rsid w:val="008D56E3"/>
   </w:style>
-  <w:style w:type="paragraph" w:customStyle="1" w:styleId="62F3814E3AB24A228E77E52EB6F6D10F">
-    <w:name w:val="62F3814E3AB24A228E77E52EB6F6D10F"/>
-    <w:rsid w:val="002615D8"/>
-    <w:rPr>
-      <w:lang w:eastAsia="ja-JP"/>
-    </w:rPr>
-  </w:style>
   <w:style w:type="paragraph" w:customStyle="1" w:styleId="C094C4BF41804FD1B5E0F604A4595C5E">
     <w:name w:val="C094C4BF41804FD1B5E0F604A4595C5E"/>
     <w:rsid w:val="002615D8"/>
@@ -4708,7 +4613,9 @@
 </a:theme>
 </file>
 
-<file path=customXml/item1.xml>��< ? x m l   v e r s i o n = " 1 . 0 "   e n c o d i n g = " u t f - 1 6 " ? > < N a v W o r d R e p o r t X m l P a r t   x m l n s = " u r n : m i c r o s o f t - d y n a m i c s - n a v / r e p o r t s / F S _ Y S R _ I n v e n t o r y C u s t o m e r S a l e s / 5 0 0 0 3 / " > +<file path=customXml/item2.xml>��< ? x m l   v e r s i o n = " 1 . 0 "   e n c o d i n g = " u t f - 1 6 " ? > + 
+ < N a v W o r d R e p o r t X m l P a r t   x m l n s = " u r n : m i c r o s o f t - d y n a m i c s - n a v / r e p o r t s / I n v e n t o r y _ C u s t o m e r _ S a l e s / 7 1 3 / " >   
      < B C R e p o r t I n f o r m a t i o n >   
@@ -4776,43 +4683,43 @@
  
      < L a b e l s >   
-         < A b o u t T h e R e p o r t L a b e l > A b o u t T h e R e p o r t L a b e l < / A b o u t T h e R e p o r t L a b e l > +         < A b o u t T h e R e p o r t L b l > A b o u t T h e R e p o r t L b l < / A b o u t T h e R e p o r t L b l >   
          < A m o u n t > A m o u n t < / A m o u n t >   
-         < A m o u n t L a b e l > A m o u n t L a b e l < / A m o u n t L a b e l > +         < A m o u n t L b l > A m o u n t L b l < / A m o u n t L b l >   
          < B a s e U n i t o f M e a s u r e _ I t e m C a p t i o n > B a s e U n i t o f M e a s u r e _ I t e m C a p t i o n < / B a s e U n i t o f M e a s u r e _ I t e m C a p t i o n >   
-         < C o m p a n y L a b e l > C o m p a n y L a b e l < / C o m p a n y L a b e l > - 
-         < C u s t N a m e L a b e l > C u s t N a m e L a b e l < / C u s t N a m e L a b e l > +         < C o m p a n y L b l > C o m p a n y L b l < / C o m p a n y L b l > + 
+         < C u s t N a m e L b l > C u s t N a m e L b l < / C u s t N a m e L b l >   
          < C u s t o m e r N o > C u s t o m e r N o < / C u s t o m e r N o >   
-         < C u s t o m e r N o L a b e l > C u s t o m e r N o L a b e l < / C u s t o m e r N o L a b e l > - 
-         < D a t a R e t r i e v e d > D a t a R e t r i e v e d < / D a t a R e t r i e v e d > +         < C u s t o m e r N o L b l > C u s t o m e r N o L b l < / C u s t o m e r N o L b l > + 
+         < D a t a R e t r i e v e d L b l > D a t a R e t r i e v e d L b l < / D a t a R e t r i e v e d L b l >   
          < D e s c r i p t i o n _ I t e m C a p t i o n > D e s c r i p t i o n _ I t e m C a p t i o n < / D e s c r i p t i o n _ I t e m C a p t i o n >   
          < D i s c o u n t A m t > D i s c o u n t A m t < / D i s c o u n t A m t >   
-         < D i s c o u n t A m t L a b e l > D i s c o u n t A m t L a b e l < / D i s c o u n t A m t L a b e l > - 
-         < D o c u m e n t a t i o n L a b e l > D o c u m e n t a t i o n L a b e l < / D o c u m e n t a t i o n L a b e l > - 
-         < E n v i r o n m e n t L a b e l > E n v i r o n m e n t L a b e l < / E n v i r o n m e n t L a b e l > - 
-         < I n v C u s t o m e r S a l e s A n a l y s i s > I n v C u s t o m e r S a l e s A n a l y s i s < / I n v C u s t o m e r S a l e s A n a l y s i s > - 
-         < I n v e n t o r y C u s t o m e r S a l e s > I n v e n t o r y C u s t o m e r S a l e s < / I n v e n t o r y C u s t o m e r S a l e s > - 
-         < I n v e n t o r y C u s t o m e r S a l e s P r i n t > I n v e n t o r y C u s t o m e r S a l e s P r i n t < / I n v e n t o r y C u s t o m e r S a l e s P r i n t > +         < D i s c o u n t A m t L b l > D i s c o u n t A m t L b l < / D i s c o u n t A m t L b l > + 
+         < D o c u m e n t a t i o n L b l > D o c u m e n t a t i o n L b l < / D o c u m e n t a t i o n L b l > + 
+         < E n v i r o n m e n t L b l > E n v i r o n m e n t L b l < / E n v i r o n m e n t L b l > + 
+         < I n v C u s t o m e r S a l e s A n a l y s i s L b l > I n v C u s t o m e r S a l e s A n a l y s i s L b l < / I n v C u s t o m e r S a l e s A n a l y s i s L b l > + 
+         < I n v C u s t o m e r S a l e s P r i n t L b l > I n v C u s t o m e r S a l e s P r i n t L b l < / I n v C u s t o m e r S a l e s P r i n t L b l > + 
+         < I n v e n t o r y C u s t o m e r S a l e s L b l > I n v e n t o r y C u s t o m e r S a l e s L b l < / I n v e n t o r y C u s t o m e r S a l e s L b l >   
          < I n v o i c e d Q t y > I n v o i c e d Q t y < / I n v o i c e d Q t y >   
-         < I n v Q t y L a b e l > I n v Q t y L a b e l < / I n v Q t y L a b e l > +         < I n v Q t y L b l > I n v Q t y L b l < / I n v Q t y L b l >   
          < N a m e > N a m e < / N a m e >   
@@ -4820,23 +4727,23 @@
  
          < P a g e > P a g e < / P a g e >   
-         < P o s t i n g D a t e F i l t e r L a b e l > P o s t i n g D a t e F i l t e r L a b e l < / P o s t i n g D a t e F i l t e r L a b e l > +         < P e r i o d L b l > P e r i o d L b l < / P e r i o d L b l >   
          < P r o f i t > P r o f i t < / P r o f i t >   
          < P r o f i t _ I t e m L e d g E n t r y C a p t i o n > P r o f i t _ I t e m L e d g E n t r y C a p t i o n < / P r o f i t _ I t e m L e d g E n t r y C a p t i o n >   
-         < P r o f i t L a b e l > P r o f i t L a b e l < / P r o f i t L a b e l > +         < P r o f i t L b l > P r o f i t L b l < / P r o f i t L b l >   
          < P r o f i t P c t > P r o f i t P c t < / P r o f i t P c t >   
-         < P r o f i t P c t L a b e l > P r o f i t P c t L a b e l < / P r o f i t P c t L a b e l > - 
-         < R e p o r t N a m e L a b e l > R e p o r t N a m e L a b e l < / R e p o r t N a m e L a b e l > +         < P r o f i t P c t L b l > P r o f i t P c t L b l < / P r o f i t P c t L b l > + 
+         < R e p o r t N a m e L b l > R e p o r t N a m e L b l < / R e p o r t N a m e L b l >   
          < R e p o r t T i t l e > R e p o r t T i t l e < / R e p o r t T i t l e >   
-         < R u n O n L a b e l > R u n O n L a b e l < / R u n O n L a b e l > +         < R u n O n L b l > R u n O n L b l < / R u n O n L b l >   
          < S a l e s A m t A c t u a l _ I t e m L e d g E n t r y C a p t i o n > S a l e s A m t A c t u a l _ I t e m L e d g E n t r y C a p t i o n < / S a l e s A m t A c t u a l _ I t e m L e d g E n t r y C a p t i o n >   
@@ -4844,12 +4751,14 @@
  
          < T o t a l > T o t a l < / T o t a l >   
-         < U s e r L a b e l > U s e r L a b e l < / U s e r L a b e l > +         < U s e r L b l > U s e r L b l < / U s e r L b l >   
      < / L a b e l s >   
      < R e p o r t H e a d e r >   
+         < C o m p a n y N a m e > C o m p a n y N a m e < / C o m p a n y N a m e > + 
          < I t e m F i l t e r > I t e m F i l t e r < / I t e m F i l t e r >   
          < I t e m L e d g E n t r y F i l t e r > I t e m L e d g E n t r y F i l t e r < / I t e m L e d g E n t r y F i l t e r > @@ -4870,61 +4779,19 @@
  
              < I n t e g e r >   
-                 < C u s t N a m e > & l t ; ? x m l   v e r s i o n = " 1 . 0 "   s t a n d a l o n e = " y e s " ? & g t ; - 
- & l t ; ? m s o - a p p l i c a t i o n   p r o g i d = " W o r d . D o c u m e n t " ? & g t ; - 
- & l t ; p k g : p a c k a g e   x m l n s : p k g = " h t t p : / / s c h e m a s . m i c r o s o f t . c o m / o f f i c e / 2 0 0 6 / x m l P a c k a g e " & g t ; & l t ; p k g : p a r t   p k g : n a m e = " / _ r e l s / . r e l s "   p k g : c o n t e n t T y p e = " a p p l i c a t i o n / v n d . o p e n x m l f o r m a t s - p a c k a g e . r e l a t i o n s h i p s + x m l "   p k g : p a d d i n g = " 5 1 2 " & g t ; & l t ; p k g : x m l D a t a & g t ; & l t ; R e l a t i o n s h i p s   x m l n s = " h t t p : / / s c h e m a s . o p e n x m l f o r m a t s . o r g / p a c k a g e / 2 0 0 6 / r e l a t i o n s h i p s " & g t ; & l t ; R e l a t i o n s h i p   I d = " r I d 2 "   T y p e = " h t t p : / / s c h e m a s . m i c r o s o f t . c o m / o f f i c e / 2 0 2 0 / 0 2 / r e l a t i o n s h i p s / c l a s s i f i c a t i o n l a b e l s "   T a r g e t = " d o c M e t a d a t a / L a b e l I n f o . x m l " / & g t ; & l t ; R e l a t i o n s h i p   I d = " r I d 1 "   T y p e = " h t t p : / / s c h e m a s . o p e n x m l f o r m a t s . o r g / o f f i c e D o c u m e n t / 2 0 0 6 / r e l a t i o n s h i p s / o f f i c e D o c u m e n t "   T a r g e t = " w o r d / d o c u m e n t . x m l " / & g t ; & l t ; / R e l a t i o n s h i p s & g t ; & l t ; / p k g : x m l D a t a & g t ; & l t ; / p k g : p a r t & g t ; & l t ; p k g : p a r t   p k g : n a m e = " / w o r d / d o c u m e n t . x m l "   p k g : c o n t e n t T y p e = " a p p l i c a t i o n / v n d . o p e n x m l f o r m a t s - o f f i c e d o c u m e n t . w o r d p r o c e s s i n g m l . d o c u m e n t . m a i n + x m l " & g t ; & l t ; p k g : x m l D a t a & g t ; & l t ; w : d o c u m e n t   x m l n s : w p c = " h t t p : / / s c h e m a s . m i c r o s o f t . c o m / o f f i c e / w o r d / 2 0 1 0 / w o r d p r o c e s s i n g C a n v a s "   x m l n s : c x = " h t t p : / / s c h e m a s . m i c r o s o f t . c o m / o f f i c e / d r a w i n g / 2 0 1 4 / c h a r t e x "   x m l n s : c x 1 = " h t t p : / / s c h e m a s . m i c r o s o f t . c o m / o f f i c e / d r a w i n g / 2 0 1 5 / 9 / 8 / c h a r t e x "   x m l n s : c x 2 = " h t t p : / / s c h e m a s . m i c r o s o f t . c o m / o f f i c e / d r a w i n g / 2 0 1 5 / 1 0 / 2 1 / c h a r t e x "   x m l n s : c x 3 = " h t t p : / / s c h e m a s . m i c r o s o f t . c o m / o f f i c e / d r a w i n g / 2 0 1 6 / 5 / 9 / c h a r t e x "   x m l n s : c x 4 = " h t t p : / / s c h e m a s . m i c r o s o f t . c o m / o f f i c e / d r a w i n g / 2 0 1 6 / 5 / 1 0 / c h a r t e x "   x m l n s : c x 5 = " h t t p : / / s c h e m a s . m i c r o s o f t . c o m / o f f i c e / d r a w i n g / 2 0 1 6 / 5 / 1 1 / c h a r t e x "   x m l n s : c x 6 = " h t t p : / / s c h e m a s . m i c r o s o f t . c o m / o f f i c e / d r a w i n g / 2 0 1 6 / 5 / 1 2 / c h a r t e x "   x m l n s : c x 7 = " h t t p : / / s c h e m a s . m i c r o s o f t . c o m / o f f i c e / d r a w i n g / 2 0 1 6 / 5 / 1 3 / c h a r t e x "   x m l n s : c x 8 = " h t t p : / / s c h e m a s . m i c r o s o f t . c o m / o f f i c e / d r a w i n g / 2 0 1 6 / 5 / 1 4 / c h a r t e x "   x m l n s : m c = " h t t p : / / s c h e m a s . o p e n x m l f o r m a t s . o r g / m a r k u p - c o m p a t i b i l i t y / 2 0 0 6 "   x m l n s : a i n k = " h t t p : / / s c h e m a s . m i c r o s o f t . c o m / o f f i c e / d r a w i n g / 2 0 1 6 / i n k "   x m l n s : a m 3 d = " h t t p : / / s c h e m a s . m i c r o s o f t . c o m / o f f i c e / d r a w i n g / 2 0 1 7 / m o d e l 3 d "   x m l n s : o = " u r n : s c h e m a s - m i c r o s o f t - c o m : o f f i c e : o f f i c e "   x m l n s : o e l = " h t t p : / / s c h e m a s . m i c r o s o f t . c o m / o f f i c e / 2 0 1 9 / e x t l s t "   x m l n s : r = " h t t p : / / s c h e m a s . o p e n x m l f o r m a t s . o r g / o f f i c e D o c u m e n t / 2 0 0 6 / r e l a t i o n s h i p s "   x m l n s : m = " h t t p : / / s c h e m a s . o p e n x m l f o r m a t s . o r g / o f f i c e D o c u m e n t / 2 0 0 6 / m a t h "   x m l n s : v = " u r n : s c h e m a s - m i c r o s o f t - c o m : v m l "   x m l n s : w p 1 4 = " h t t p : / / s c h e m a s . m i c r o s o f t . c o m / o f f i c e / w o r d / 2 0 1 0 / w o r d p r o c e s s i n g D r a w i n g "   x m l n s : w p = " h t t p : / / s c h e m a s . o p e n x m l f o r m a t s . o r g / d r a w i n g m l / 2 0 0 6 / w o r d p r o c e s s i n g D r a w i n g "   x m l n s : w 1 0 = " u r n : s c h e m a s - m i c r o s o f t - c o m : o f f i c e : w o r d "   x m l n s : w = " h t t p : / / s c h e m a s . o p e n x m l f o r m a t s . o r g / w o r d p r o c e s s i n g m l / 2 0 0 6 / m a i n "   x m l n s : w 1 4 = " h t t p : / / s c h e m a s . m i c r o s o f t . c o m / o f f i c e / w o r d / 2 0 1 0 / w o r d m l "   x m l n s : w 1 5 = " h t t p : / / s c h e m a s . m i c r o s o f t . c o m / o f f i c e / w o r d / 2 0 1 2 / w o r d m l "   x m l n s : w 1 6 c e x = " h t t p : / / s c h e m a s . m i c r o s o f t . c o m / o f f i c e / w o r d / 2 0 1 8 / w o r d m l / c e x "   x m l n s : w 1 6 c i d = " h t t p : / / s c h e m a s . m i c r o s o f t . c o m / o f f i c e / w o r d / 2 0 1 6 / w o r d m l / c i d "   x m l n s : w 1 6 = " h t t p : / / s c h e m a s . m i c r o s o f t . c o m / o f f i c e / w o r d / 2 0 1 8 / w o r d m l "   x m l n s : w 1 6 d u = " h t t p : / / s c h e m a s . m i c r o s o f t . c o m / o f f i c e / w o r d / 2 0 2 3 / w o r d m l / w o r d 1 6 d u "   x m l n s : w 1 6 s d t d h = " h t t p : / / s c h e m a s . m i c r o s o f t . c o m / o f f i c e / w o r d / 2 0 2 0 / w o r d m l / s d t d a t a h a s h "   x m l n s : w 1 6 s d t f l = " h t t p : / / s c h e m a s . m i c r o s o f t . c o m / o f f i c e / w o r d / 2 0 2 4 / w o r d m l / s d t f o r m a t l o c k "   x m l n s : w 1 6 s e = " h t t p : / / s c h e m a s . m i c r o s o f t . c o m / o f f i c e / w o r d / 2 0 1 5 / w o r d m l / s y m e x "   x m l n s : w p g = " h t t p : / / s c h e m a s . m i c r o s o f t . c o m / o f f i c e / w o r d / 2 0 1 0 / w o r d p r o c e s s i n g G r o u p "   x m l n s : w p i = " h t t p : / / s c h e m a s . m i c r o s o f t . c o m / o f f i c e / w o r d / 2 0 1 0 / w o r d p r o c e s s i n g I n k "   x m l n s : w n e = " h t t p : / / s c h e m a s . m i c r o s o f t . c o m / o f f i c e / w o r d / 2 0 0 6 / w o r d m l "   x m l n s : w p s = " h t t p : / / s c h e m a s . m i c r o s o f t . c o m / o f f i c e / w o r d / 2 0 1 0 / w o r d p r o c e s s i n g S h a p e "   m c : I g n o r a b l e = " w 1 4   w 1 5   w 1 6 s e   w 1 6 c i d   w 1 6   w 1 6 c e x   w 1 6 s d t d h   w 1 6 s d t f l   w 1 6 d u   w p 1 4 " & g t ; & l t ; w : b o d y & g t ; & l t ; w : p   w 1 4 : p a r a I d = " 1 6 9 B 2 F 5 5 "   w 1 4 : t e x t I d = " 5 2 7 1 F B 1 6 "   w : r s i d R = " 0 0 1 7 6 8 9 B "   w : r s i d R D e f a u l t = " 0 0 1 7 6 8 9 B " & g t ; & l t ; w : p P r & g t ; & l t ; w : s p a c i n g   w : a f t e r = " 0 "   w : l i n e = " 2 4 0 "   w : l i n e R u l e = " a u t o " / & g t ; & l t ; / w : p P r & g t ; & l t ; w : r & g t ; & l t ; w : r P r & g t ; & l t ; w : r F o n t s   w : a s c i i = " S e g o e   U I "   w : h A n s i = " S e g o e   U I "   w : c s = " S e g o e   U I " / & g t ; & l t ; w : s z   w : v a l = " 1 6 " / & g t ; & l t ; w : s z C s   w : v a l = " 1 6 " / & g t ; & l t ; / w : r P r & g t ; & l t ; w : t & g t ; C u s t N a m e & l t ; / w : t & g t ; & l t ; / w : r & g t ; & l t ; / w : p & g t ; & l t ; w : s e c t P r   w : r s i d R = " 0 0 0 0 0 0 0 0 " & g t ; & l t ; w : p g S z   w : w = " 1 2 2 4 0 "   w : h = " 1 5 8 4 0 " / & g t ; & l t ; w : p g M a r   w : t o p = " 1 4 4 0 "   w : r i g h t = " 1 4 4 0 "   w : b o t t o m = " 1 4 4 0 "   w : l e f t = " 1 4 4 0 "   w : h e a d e r = " 7 2 0 "   w : f o o t e r = " 7 2 0 "   w : g u t t e r = " 0 " / & g t ; & l t ; w : c o l s   w : s p a c e = " 7 2 0 " / & g t ; & l t ; / w : s e c t P r & g t ; & l t ; / w : b o d y & g t ; & l t ; / w : d o c u m e n t & g t ; & l t ; / p k g : x m l D a t a & g t ; & l t ; / p k g : p a r t & g t ; & l t ; p k g : p a r t   p k g : n a m e = " / w o r d / _ r e l s / d o c u m e n t . x m l . r e l s "   p k g : c o n t e n t T y p e = " a p p l i c a t i o n / v n d . o p e n x m l f o r m a t s - p a c k a g e . r e l a t i o n s h i p s + x m l "   p k g : p a d d i n g = " 2 5 6 " & g t ; & l t ; p k g : x m l D a t a & g t ; & l t ; R e l a t i o n s h i p s   x m l n s = " h t t p : / / s c h e m a s . o p e n x m l f o r m a t s . o r g / p a c k a g e / 2 0 0 6 / r e l a t i o n s h i p s " & g t ; & l t ; R e l a t i o n s h i p   I d = " r I d 1 "   T y p e = " h t t p : / / s c h e m a s . o p e n x m l f o r m a t s . o r g / o f f i c e D o c u m e n t / 2 0 0 6 / r e l a t i o n s h i p s / s t y l e s "   T a r g e t = " s t y l e s . x m l " / & g t ; & l t ; / R e l a t i o n s h i p s & g t ; & l t ; / p k g : x m l D a t a & g t ; & l t ; / p k g : p a r t & g t ; & l t ; p k g : p a r t   p k g : n a m e = " / w o r d / s t y l e s . x m l "   p k g : c o n t e n t T y p e = " a p p l i c a t i o n / v n d . o p e n x m l f o r m a t s - o f f i c e d o c u m e n t . w o r d p r o c e s s i n g m l . s t y l e s + x m l " & g t ; & l t ; p k g : x m l D a t a & g t ; & l t ; w : s t y l e s   x m l n s : m c = " h t t p : / / s c h e m a s . o p e n x m l f o r m a t s . o r g / m a r k u p - c o m p a t i b i l i t y / 2 0 0 6 "   x m l n s : r = " h t t p : / / s c h e m a s . o p e n x m l f o r m a t s . o r g / o f f i c e D o c u m e n t / 2 0 0 6 / r e l a t i o n s h i p s "   x m l n s : w = " h t t p : / / s c h e m a s . o p e n x m l f o r m a t s . o r g / w o r d p r o c e s s i n g m l / 2 0 0 6 / m a i n "   x m l n s : w 1 4 = " h t t p : / / s c h e m a s . m i c r o s o f t . c o m / o f f i c e / w o r d / 2 0 1 0 / w o r d m l "   x m l n s : w 1 5 = " h t t p : / / s c h e m a s . m i c r o s o f t . c o m / o f f i c e / w o r d / 2 0 1 2 / w o r d m l "   x m l n s : w 1 6 c e x = " h t t p : / / s c h e m a s . m i c r o s o f t . c o m / o f f i c e / w o r d / 2 0 1 8 / w o r d m l / c e x "   x m l n s : w 1 6 c i d = " h t t p : / / s c h e m a s . m i c r o s o f t . c o m / o f f i c e / w o r d / 2 0 1 6 / w o r d m l / c i d "   x m l n s : w 1 6 = " h t t p : / / s c h e m a s . m i c r o s o f t . c o m / o f f i c e / w o r d / 2 0 1 8 / w o r d m l "   x m l n s : w 1 6 d u = " h t t p : / / s c h e m a s . m i c r o s o f t . c o m / o f f i c e / w o r d / 2 0 2 3 / w o r d m l / w o r d 1 6 d u "   x m l n s : w 1 6 s d t d h = " h t t p : / / s c h e m a s . m i c r o s o f t . c o m / o f f i c e / w o r d / 2 0 2 0 / w o r d m l / s d t d a t a h a s h "   x m l n s : w 1 6 s d t f l = " h t t p : / / s c h e m a s . m i c r o s o f t . c o m / o f f i c e / w o r d / 2 0 2 4 / w o r d m l / s d t f o r m a t l o c k "   x m l n s : w 1 6 s e = " h t t p : / / s c h e m a s . m i c r o s o f t . c o m / o f f i c e / w o r d / 2 0 1 5 / w o r d m l / s y m e x "   m c : I g n o r a b l e = " w 1 4   w 1 5   w 1 6 s e   w 1 6 c i d   w 1 6   w 1 6 c e x   w 1 6 s d t d h   w 1 6 s d t f l   w 1 6 d u " & g t ; & l t ; w : d o c D e f a u l t s & g t ; & l t ; w : r P r D e f a u l t & g t ; & l t ; w : r P r & g t ; & l t ; w : r F o n t s   w : a s c i i T h e m e = " m i n o r H A n s i "   w : e a s t A s i a T h e m e = " m i n o r E a s t A s i a "   w : h A n s i T h e m e = " m i n o r H A n s i "   w : c s t h e m e = " m i n o r B i d i " / & g t ; & l t ; w : k e r n   w : v a l = " 2 " / & g t ; & l t ; w : s z   w : v a l = " 2 4 " / & g t ; & l t ; w : s z C s   w : v a l = " 2 4 " / & g t ; & l t ; w : l a n g   w : v a l = " e n - A U "   w : e a s t A s i a = " z h - C N "   w : b i d i = " a r - S A " / & g t ; & l t ; w 1 4 : l i g a t u r e s   w 1 4 : v a l = " s t a n d a r d C o n t e x t u a l " / & g t ; & l t ; / w : r P r & g t ; & l t ; / w : r P r D e f a u l t & g t ; & l t ; w : p P r D e f a u l t & g t ; & l t ; w : p P r & g t ; & l t ; w : s p a c i n g   w : a f t e r = " 1 6 0 "   w : l i n e = " 2 7 8 "   w : l i n e R u l e = " a u t o " / & g t ; & l t ; / w : p P r & g t ; & l t ; / w : p P r D e f a u l t & g t ; & l t ; / w : d o c D e f a u l t s & g t ; & l t ; w : s t y l e   w : t y p e = " p a r a g r a p h "   w : d e f a u l t = " 1 "   w : s t y l e I d = " N o r m a l " & g t ; & l t ; w : n a m e   w : v a l = " N o r m a l " / & g t ; & l t ; w : q F o r m a t / & g t ; & l t ; / w : s t y l e & g t ; & l t ; w : s t y l e   w : t y p e = " c h a r a c t e r "   w : d e f a u l t = " 1 "   w : s t y l e I d = " D e f a u l t P a r a g r a p h F o n t " & g t ; & l t ; w : n a m e   w : v a l = " D e f a u l t   P a r a g r a p h   F o n t " / & g t ; & l t ; w : u i P r i o r i t y   w : v a l = " 1 " / & g t ; & l t ; w : s e m i H i d d e n / & g t ; & l t ; w : u n h i d e W h e n U s e d / & g t ; & l t ; / w : s t y l e & g t ; & l t ; w : s t y l e   w : t y p e = " t a b l e "   w : d e f a u l t = " 1 "   w : s t y l e I d = " T a b l e N o r m a l " & g t ; & l t ; w : n a m e   w : v a l = " N o r m a l   T a b l e " / & g t ; & l t ; w : u i P r i o r i t y   w : v a l = " 9 9 " / & g t ; & l t ; w : s e m i H i d d e n / & g t ; & l t ; w : u n h i d e W h e n U s e d / & g t ; & l t ; w : t b l P r & g t ; & l t ; w : t b l I n d   w : w = " 0 "   w : t y p e = " d x a " / & g t ; & l t ; w : t b l C e l l M a r & g t ; & l t ; w : t o p   w : w = " 0 "   w : t y p e = " d x a " / & g t ; & l t ; w : l e f t   w : w = " 1 0 8 "   w : t y p e = " d x a " / & g t ; & l t ; w : b o t t o m   w : w = " 0 "   w : t y p e = " d x a " / & g t ; & l t ; w : r i g h t   w : w = " 1 0 8 "   w : t y p e = " d x a " / & g t ; & l t ; / w : t b l C e l l M a r & g t ; & l t ; / w : t b l P r & g t ; & l t ; / w : s t y l e & g t ; & l t ; w : s t y l e   w : t y p e = " n u m b e r i n g "   w : d e f a u l t = " 1 "   w : s t y l e I d = " N o L i s t " & g t ; & l t ; w : n a m e   w : v a l = " N o   L i s t " / & g t ; & l t ; w : u i P r i o r i t y   w : v a l = " 9 9 " / & g t ; & l t ; w : s e m i H i d d e n / & g t ; & l t ; w : u n h i d e W h e n U s e d / & g t ; & l t ; / w : s t y l e & g t ; & l t ; / w : s t y l e s & g t ; & l t ; / p k g : x m l D a t a & g t ; & l t ; / p k g : p a r t & g t ; & l t ; p k g : p a r t   p k g : n a m e = " / d o c M e t a d a t a / L a b e l I n f o . x m l "   p k g : c o n t e n t T y p e = " a p p l i c a t i o n / v n d . m s - o f f i c e . c l a s s i f i c a t i o n l a b e l s + x m l " & g t ; & l t ; p k g : x m l D a t a & g t ; & l t ; c l b l : l a b e l L i s t   x m l n s : c l b l = " h t t p : / / s c h e m a s . m i c r o s o f t . c o m / o f f i c e / 2 0 2 0 / m i p L a b e l M e t a d a t a " & g t ; & l t ; c l b l : l a b e l   i d = " { 8 5 c a 8 a f 4 - 7 6 3 a - 4 5 c 2 - 8 0 a e - a 5 c a 1 b 8 0 b d d c } "   e n a b l e d = " 1 "   m e t h o d = " S t a n d a r d "   s i t e I d = " { 0 6 c d a f 0 9 - 1 4 f 0 - 4 c d 1 - 8 a c 0 - 7 b f e d 7 0 7 a 8 2 c } "   c o n t e n t B i t s = " 0 "   r e m o v e d = " 0 " / & g t ; & l t ; / c l b l : l a b e l L i s t & g t ; & l t ; / p k g : x m l D a t a & g t ; & l t ; / p k g : p a r t & g t ; & l t ; / p k g : p a c k a g e & g t ; - 
- < / C u s t N a m e > - 
-                 < D i s c o u n t A m o u n t > & l t ; ? x m l   v e r s i o n = " 1 . 0 "   s t a n d a l o n e = " y e s " ? & g t ; - 
- & l t ; ? m s o - a p p l i c a t i o n   p r o g i d = " W o r d . D o c u m e n t " ? & g t ; - 
- & l t ; p k g : p a c k a g e   x m l n s : p k g = " h t t p : / / s c h e m a s . m i c r o s o f t . c o m / o f f i c e / 2 0 0 6 / x m l P a c k a g e " & g t ; & l t ; p k g : p a r t   p k g : n a m e = " / _ r e l s / . r e l s "   p k g : c o n t e n t T y p e = " a p p l i c a t i o n / v n d . o p e n x m l f o r m a t s - p a c k a g e . r e l a t i o n s h i p s + x m l "   p k g : p a d d i n g = " 5 1 2 " & g t ; & l t ; p k g : x m l D a t a & g t ; & l t ; R e l a t i o n s h i p s   x m l n s = " h t t p : / / s c h e m a s . o p e n x m l f o r m a t s . o r g / p a c k a g e / 2 0 0 6 / r e l a t i o n s h i p s " & g t ; & l t ; R e l a t i o n s h i p   I d = " r I d 2 "   T y p e = " h t t p : / / s c h e m a s . m i c r o s o f t . c o m / o f f i c e / 2 0 2 0 / 0 2 / r e l a t i o n s h i p s / c l a s s i f i c a t i o n l a b e l s "   T a r g e t = " d o c M e t a d a t a / L a b e l I n f o . x m l " / & g t ; & l t ; R e l a t i o n s h i p   I d = " r I d 1 "   T y p e = " h t t p : / / s c h e m a s . o p e n x m l f o r m a t s . o r g / o f f i c e D o c u m e n t / 2 0 0 6 / r e l a t i o n s h i p s / o f f i c e D o c u m e n t "   T a r g e t = " w o r d / d o c u m e n t . x m l " / & g t ; & l t ; / R e l a t i o n s h i p s & g t ; & l t ; / p k g : x m l D a t a & g t ; & l t ; / p k g : p a r t & g t ; & l t ; p k g : p a r t   p k g : n a m e = " / w o r d / d o c u m e n t . x m l "   p k g : c o n t e n t T y p e = " a p p l i c a t i o n / v n d . o p e n x m l f o r m a t s - o f f i c e d o c u m e n t . w o r d p r o c e s s i n g m l . d o c u m e n t . m a i n + x m l " & g t ; & l t ; p k g : x m l D a t a & g t ; & l t ; w : d o c u m e n t   x m l n s : w p c = " h t t p : / / s c h e m a s . m i c r o s o f t . c o m / o f f i c e / w o r d / 2 0 1 0 / w o r d p r o c e s s i n g C a n v a s "   x m l n s : c x = " h t t p : / / s c h e m a s . m i c r o s o f t . c o m / o f f i c e / d r a w i n g / 2 0 1 4 / c h a r t e x "   x m l n s : c x 1 = " h t t p : / / s c h e m a s . m i c r o s o f t . c o m / o f f i c e / d r a w i n g / 2 0 1 5 / 9 / 8 / c h a r t e x "   x m l n s : c x 2 = " h t t p : / / s c h e m a s . m i c r o s o f t . c o m / o f f i c e / d r a w i n g / 2 0 1 5 / 1 0 / 2 1 / c h a r t e x "   x m l n s : c x 3 = " h t t p : / / s c h e m a s . m i c r o s o f t . c o m / o f f i c e / d r a w i n g / 2 0 1 6 / 5 / 9 / c h a r t e x "   x m l n s : c x 4 = " h t t p : / / s c h e m a s . m i c r o s o f t . c o m / o f f i c e / d r a w i n g / 2 0 1 6 / 5 / 1 0 / c h a r t e x "   x m l n s : c x 5 = " h t t p : / / s c h e m a s . m i c r o s o f t . c o m / o f f i c e / d r a w i n g / 2 0 1 6 / 5 / 1 1 / c h a r t e x "   x m l n s : c x 6 = " h t t p : / / s c h e m a s . m i c r o s o f t . c o m / o f f i c e / d r a w i n g / 2 0 1 6 / 5 / 1 2 / c h a r t e x "   x m l n s : c x 7 = " h t t p : / / s c h e m a s . m i c r o s o f t . c o m / o f f i c e / d r a w i n g / 2 0 1 6 / 5 / 1 3 / c h a r t e x "   x m l n s : c x 8 = " h t t p : / / s c h e m a s . m i c r o s o f t . c o m / o f f i c e / d r a w i n g / 2 0 1 6 / 5 / 1 4 / c h a r t e x "   x m l n s : m c = " h t t p : / / s c h e m a s . o p e n x m l f o r m a t s . o r g / m a r k u p - c o m p a t i b i l i t y / 2 0 0 6 "   x m l n s : a i n k = " h t t p : / / s c h e m a s . m i c r o s o f t . c o m / o f f i c e / d r a w i n g / 2 0 1 6 / i n k "   x m l n s : a m 3 d = " h t t p : / / s c h e m a s . m i c r o s o f t . c o m / o f f i c e / d r a w i n g / 2 0 1 7 / m o d e l 3 d "   x m l n s : o = " u r n : s c h e m a s - m i c r o s o f t - c o m : o f f i c e : o f f i c e "   x m l n s : o e l = " h t t p : / / s c h e m a s . m i c r o s o f t . c o m / o f f i c e / 2 0 1 9 / e x t l s t "   x m l n s : r = " h t t p : / / s c h e m a s . o p e n x m l f o r m a t s . o r g / o f f i c e D o c u m e n t / 2 0 0 6 / r e l a t i o n s h i p s "   x m l n s : m = " h t t p : / / s c h e m a s . o p e n x m l f o r m a t s . o r g / o f f i c e D o c u m e n t / 2 0 0 6 / m a t h "   x m l n s : v = " u r n : s c h e m a s - m i c r o s o f t - c o m : v m l "   x m l n s : w p 1 4 = " h t t p : / / s c h e m a s . m i c r o s o f t . c o m / o f f i c e / w o r d / 2 0 1 0 / w o r d p r o c e s s i n g D r a w i n g "   x m l n s : w p = " h t t p : / / s c h e m a s . o p e n x m l f o r m a t s . o r g / d r a w i n g m l / 2 0 0 6 / w o r d p r o c e s s i n g D r a w i n g "   x m l n s : w 1 0 = " u r n : s c h e m a s - m i c r o s o f t - c o m : o f f i c e : w o r d "   x m l n s : w = " h t t p : / / s c h e m a s . o p e n x m l f o r m a t s . o r g / w o r d p r o c e s s i n g m l / 2 0 0 6 / m a i n "   x m l n s : w 1 4 = " h t t p : / / s c h e m a s . m i c r o s o f t . c o m / o f f i c e / w o r d / 2 0 1 0 / w o r d m l "   x m l n s : w 1 5 = " h t t p : / / s c h e m a s . m i c r o s o f t . c o m / o f f i c e / w o r d / 2 0 1 2 / w o r d m l "   x m l n s : w 1 6 c e x = " h t t p : / / s c h e m a s . m i c r o s o f t . c o m / o f f i c e / w o r d / 2 0 1 8 / w o r d m l / c e x "   x m l n s : w 1 6 c i d = " h t t p : / / s c h e m a s . m i c r o s o f t . c o m / o f f i c e / w o r d / 2 0 1 6 / w o r d m l / c i d "   x m l n s : w 1 6 = " h t t p : / / s c h e m a s . m i c r o s o f t . c o m / o f f i c e / w o r d / 2 0 1 8 / w o r d m l "   x m l n s : w 1 6 d u = " h t t p : / / s c h e m a s . m i c r o s o f t . c o m / o f f i c e / w o r d / 2 0 2 3 / w o r d m l / w o r d 1 6 d u "   x m l n s : w 1 6 s d t d h = " h t t p : / / s c h e m a s . m i c r o s o f t . c o m / o f f i c e / w o r d / 2 0 2 0 / w o r d m l / s d t d a t a h a s h "   x m l n s : w 1 6 s d t f l = " h t t p : / / s c h e m a s . m i c r o s o f t . c o m / o f f i c e / w o r d / 2 0 2 4 / w o r d m l / s d t f o r m a t l o c k "   x m l n s : w 1 6 s e = " h t t p : / / s c h e m a s . m i c r o s o f t . c o m / o f f i c e / w o r d / 2 0 1 5 / w o r d m l / s y m e x "   x m l n s : w p g = " h t t p : / / s c h e m a s . m i c r o s o f t . c o m / o f f i c e / w o r d / 2 0 1 0 / w o r d p r o c e s s i n g G r o u p "   x m l n s : w p i = " h t t p : / / s c h e m a s . m i c r o s o f t . c o m / o f f i c e / w o r d / 2 0 1 0 / w o r d p r o c e s s i n g I n k "   x m l n s : w n e = " h t t p : / / s c h e m a s . m i c r o s o f t . c o m / o f f i c e / w o r d / 2 0 0 6 / w o r d m l "   x m l n s : w p s = " h t t p : / / s c h e m a s . m i c r o s o f t . c o m / o f f i c e / w o r d / 2 0 1 0 / w o r d p r o c e s s i n g S h a p e "   m c : I g n o r a b l e = " w 1 4   w 1 5   w 1 6 s e   w 1 6 c i d   w 1 6   w 1 6 c e x   w 1 6 s d t d h   w 1 6 s d t f l   w 1 6 d u   w p 1 4 " & g t ; & l t ; w : b o d y & g t ; & l t ; w : p   w 1 4 : p a r a I d = " 1 6 4 0 5 3 5 1 "   w 1 4 : t e x t I d = " 3 2 4 1 7 9 5 A "   w : r s i d R = " 0 0 8 D 7 E 4 5 "   w : r s i d R D e f a u l t = " 0 0 8 D 7 E 4 5 " & g t ; & l t ; w : p P r & g t ; & l t ; w : s p a c i n g   w : a f t e r = " 0 "   w : l i n e = " 2 4 0 "   w : l i n e R u l e = " a u t o " / & g t ; & l t ; w : j c   w : v a l = " r i g h t " / & g t ; & l t ; / w : p P r & g t ; & l t ; w : r & g t ; & l t ; w : r P r & g t ; & l t ; w : r F o n t s   w : a s c i i = " S e g o e   U I "   w : h A n s i = " S e g o e   U I "   w : c s = " S e g o e   U I " / & g t ; & l t ; w : s z   w : v a l = " 1 6 " / & g t ; & l t ; w : s z C s   w : v a l = " 1 6 " / & g t ; & l t ; / w : r P r & g t ; & l t ; w : t & g t ; D i s c o u n t A m o u n t & l t ; / w : t & g t ; & l t ; / w : r & g t ; & l t ; / w : p & g t ; & l t ; w : s e c t P r   w : r s i d R = " 0 0 0 0 0 0 0 0 " & g t ; & l t ; w : p g S z   w : w = " 1 2 2 4 0 "   w : h = " 1 5 8 4 0 " / & g t ; & l t ; w : p g M a r   w : t o p = " 1 4 4 0 "   w : r i g h t = " 1 4 4 0 "   w : b o t t o m = " 1 4 4 0 "   w : l e f t = " 1 4 4 0 "   w : h e a d e r = " 7 2 0 "   w : f o o t e r = " 7 2 0 "   w : g u t t e r = " 0 " / & g t ; & l t ; w : c o l s   w : s p a c e = " 7 2 0 " / & g t ; & l t ; / w : s e c t P r & g t ; & l t ; / w : b o d y & g t ; & l t ; / w : d o c u m e n t & g t ; & l t ; / p k g : x m l D a t a & g t ; & l t ; / p k g : p a r t & g t ; & l t ; p k g : p a r t   p k g : n a m e = " / w o r d / _ r e l s / d o c u m e n t . x m l . r e l s "   p k g : c o n t e n t T y p e = " a p p l i c a t i o n / v n d . o p e n x m l f o r m a t s - p a c k a g e . r e l a t i o n s h i p s + x m l "   p k g : p a d d i n g = " 2 5 6 " & g t ; & l t ; p k g : x m l D a t a & g t ; & l t ; R e l a t i o n s h i p s   x m l n s = " h t t p : / / s c h e m a s . o p e n x m l f o r m a t s . o r g / p a c k a g e / 2 0 0 6 / r e l a t i o n s h i p s " & g t ; & l t ; R e l a t i o n s h i p   I d = " r I d 1 "   T y p e = " h t t p : / / s c h e m a s . o p e n x m l f o r m a t s . o r g / o f f i c e D o c u m e n t / 2 0 0 6 / r e l a t i o n s h i p s / s t y l e s "   T a r g e t = " s t y l e s . x m l " / & g t ; & l t ; / R e l a t i o n s h i p s & g t ; & l t ; / p k g : x m l D a t a & g t ; & l t ; / p k g : p a r t & g t ; & l t ; p k g : p a r t   p k g : n a m e = " / w o r d / s t y l e s . x m l "   p k g : c o n t e n t T y p e = " a p p l i c a t i o n / v n d . o p e n x m l f o r m a t s - o f f i c e d o c u m e n t . w o r d p r o c e s s i n g m l . s t y l e s + x m l " & g t ; & l t ; p k g : x m l D a t a & g t ; & l t ; w : s t y l e s   x m l n s : m c = " h t t p : / / s c h e m a s . o p e n x m l f o r m a t s . o r g / m a r k u p - c o m p a t i b i l i t y / 2 0 0 6 "   x m l n s : r = " h t t p : / / s c h e m a s . o p e n x m l f o r m a t s . o r g / o f f i c e D o c u m e n t / 2 0 0 6 / r e l a t i o n s h i p s "   x m l n s : w = " h t t p : / / s c h e m a s . o p e n x m l f o r m a t s . o r g / w o r d p r o c e s s i n g m l / 2 0 0 6 / m a i n "   x m l n s : w 1 4 = " h t t p : / / s c h e m a s . m i c r o s o f t . c o m / o f f i c e / w o r d / 2 0 1 0 / w o r d m l "   x m l n s : w 1 5 = " h t t p : / / s c h e m a s . m i c r o s o f t . c o m / o f f i c e / w o r d / 2 0 1 2 / w o r d m l "   x m l n s : w 1 6 c e x = " h t t p : / / s c h e m a s . m i c r o s o f t . c o m / o f f i c e / w o r d / 2 0 1 8 / w o r d m l / c e x "   x m l n s : w 1 6 c i d = " h t t p : / / s c h e m a s . m i c r o s o f t . c o m / o f f i c e / w o r d / 2 0 1 6 / w o r d m l / c i d "   x m l n s : w 1 6 = " h t t p : / / s c h e m a s . m i c r o s o f t . c o m / o f f i c e / w o r d / 2 0 1 8 / w o r d m l "   x m l n s : w 1 6 d u = " h t t p : / / s c h e m a s . m i c r o s o f t . c o m / o f f i c e / w o r d / 2 0 2 3 / w o r d m l / w o r d 1 6 d u "   x m l n s : w 1 6 s d t d h = " h t t p : / / s c h e m a s . m i c r o s o f t . c o m / o f f i c e / w o r d / 2 0 2 0 / w o r d m l / s d t d a t a h a s h "   x m l n s : w 1 6 s d t f l = " h t t p : / / s c h e m a s . m i c r o s o f t . c o m / o f f i c e / w o r d / 2 0 2 4 / w o r d m l / s d t f o r m a t l o c k "   x m l n s : w 1 6 s e = " h t t p : / / s c h e m a s . m i c r o s o f t . c o m / o f f i c e / w o r d / 2 0 1 5 / w o r d m l / s y m e x "   m c : I g n o r a b l e = " w 1 4   w 1 5   w 1 6 s e   w 1 6 c i d   w 1 6   w 1 6 c e x   w 1 6 s d t d h   w 1 6 s d t f l   w 1 6 d u " & g t ; & l t ; w : d o c D e f a u l t s & g t ; & l t ; w : r P r D e f a u l t & g t ; & l t ; w : r P r & g t ; & l t ; w : r F o n t s   w : a s c i i T h e m e = " m i n o r H A n s i "   w : e a s t A s i a T h e m e = " m i n o r E a s t A s i a "   w : h A n s i T h e m e = " m i n o r H A n s i "   w : c s t h e m e = " m i n o r B i d i " / & g t ; & l t ; w : k e r n   w : v a l = " 2 " / & g t ; & l t ; w : s z   w : v a l = " 2 4 " / & g t ; & l t ; w : s z C s   w : v a l = " 2 4 " / & g t ; & l t ; w : l a n g   w : v a l = " e n - A U "   w : e a s t A s i a = " z h - C N "   w : b i d i = " a r - S A " / & g t ; & l t ; w 1 4 : l i g a t u r e s   w 1 4 : v a l = " s t a n d a r d C o n t e x t u a l " / & g t ; & l t ; / w : r P r & g t ; & l t ; / w : r P r D e f a u l t & g t ; & l t ; w : p P r D e f a u l t & g t ; & l t ; w : p P r & g t ; & l t ; w : s p a c i n g   w : a f t e r = " 1 6 0 "   w : l i n e = " 2 7 8 "   w : l i n e R u l e = " a u t o " / & g t ; & l t ; / w : p P r & g t ; & l t ; / w : p P r D e f a u l t & g t ; & l t ; / w : d o c D e f a u l t s & g t ; & l t ; w : s t y l e   w : t y p e = " p a r a g r a p h "   w : d e f a u l t = " 1 "   w : s t y l e I d = " N o r m a l " & g t ; & l t ; w : n a m e   w : v a l = " N o r m a l " / & g t ; & l t ; w : q F o r m a t / & g t ; & l t ; / w : s t y l e & g t ; & l t ; w : s t y l e   w : t y p e = " c h a r a c t e r "   w : d e f a u l t = " 1 "   w : s t y l e I d = " D e f a u l t P a r a g r a p h F o n t " & g t ; & l t ; w : n a m e   w : v a l = " D e f a u l t   P a r a g r a p h   F o n t " / & g t ; & l t ; w : u i P r i o r i t y   w : v a l = " 1 " / & g t ; & l t ; w : s e m i H i d d e n / & g t ; & l t ; w : u n h i d e W h e n U s e d / & g t ; & l t ; / w : s t y l e & g t ; & l t ; w : s t y l e   w : t y p e = " t a b l e "   w : d e f a u l t = " 1 "   w : s t y l e I d = " T a b l e N o r m a l " & g t ; & l t ; w : n a m e   w : v a l = " N o r m a l   T a b l e " / & g t ; & l t ; w : u i P r i o r i t y   w : v a l = " 9 9 " / & g t ; & l t ; w : s e m i H i d d e n / & g t ; & l t ; w : u n h i d e W h e n U s e d / & g t ; & l t ; w : t b l P r & g t ; & l t ; w : t b l I n d   w : w = " 0 "   w : t y p e = " d x a " / & g t ; & l t ; w : t b l C e l l M a r & g t ; & l t ; w : t o p   w : w = " 0 "   w : t y p e = " d x a " / & g t ; & l t ; w : l e f t   w : w = " 1 0 8 "   w : t y p e = " d x a " / & g t ; & l t ; w : b o t t o m   w : w = " 0 "   w : t y p e = " d x a " / & g t ; & l t ; w : r i g h t   w : w = " 1 0 8 "   w : t y p e = " d x a " / & g t ; & l t ; / w : t b l C e l l M a r & g t ; & l t ; / w : t b l P r & g t ; & l t ; / w : s t y l e & g t ; & l t ; w : s t y l e   w : t y p e = " n u m b e r i n g "   w : d e f a u l t = " 1 "   w : s t y l e I d = " N o L i s t " & g t ; & l t ; w : n a m e   w : v a l = " N o   L i s t " / & g t ; & l t ; w : u i P r i o r i t y   w : v a l = " 9 9 " / & g t ; & l t ; w : s e m i H i d d e n / & g t ; & l t ; w : u n h i d e W h e n U s e d / & g t ; & l t ; / w : s t y l e & g t ; & l t ; / w : s t y l e s & g t ; & l t ; / p k g : x m l D a t a & g t ; & l t ; / p k g : p a r t & g t ; & l t ; p k g : p a r t   p k g : n a m e = " / d o c M e t a d a t a / L a b e l I n f o . x m l "   p k g : c o n t e n t T y p e = " a p p l i c a t i o n / v n d . m s - o f f i c e . c l a s s i f i c a t i o n l a b e l s + x m l " & g t ; & l t ; p k g : x m l D a t a & g t ; & l t ; c l b l : l a b e l L i s t   x m l n s : c l b l = " h t t p : / / s c h e m a s . m i c r o s o f t . c o m / o f f i c e / 2 0 2 0 / m i p L a b e l M e t a d a t a " & g t ; & l t ; c l b l : l a b e l   i d = " { 8 5 c a 8 a f 4 - 7 6 3 a - 4 5 c 2 - 8 0 a e - a 5 c a 1 b 8 0 b d d c } "   e n a b l e d = " 1 "   m e t h o d = " S t a n d a r d "   s i t e I d = " { 0 6 c d a f 0 9 - 1 4 f 0 - 4 c d 1 - 8 a c 0 - 7 b f e d 7 0 7 a 8 2 c } "   c o n t e n t B i t s = " 0 "   r e m o v e d = " 0 " / & g t ; & l t ; / c l b l : l a b e l L i s t & g t ; & l t ; / p k g : x m l D a t a & g t ; & l t ; / p k g : p a r t & g t ; & l t ; / p k g : p a c k a g e & g t ; - 
- < / D i s c o u n t A m o u n t > - 
-                 < I n v Q t y _ I t e m L e d g E n t r y > & l t ; ? x m l   v e r s i o n = " 1 . 0 "   s t a n d a l o n e = " y e s " ? & g t ; - 
- & l t ; ? m s o - a p p l i c a t i o n   p r o g i d = " W o r d . D o c u m e n t " ? & g t ; - 
- & l t ; p k g : p a c k a g e   x m l n s : p k g = " h t t p : / / s c h e m a s . m i c r o s o f t . c o m / o f f i c e / 2 0 0 6 / x m l P a c k a g e " & g t ; & l t ; p k g : p a r t   p k g : n a m e = " / _ r e l s / . r e l s "   p k g : c o n t e n t T y p e = " a p p l i c a t i o n / v n d . o p e n x m l f o r m a t s - p a c k a g e . r e l a t i o n s h i p s + x m l "   p k g : p a d d i n g = " 5 1 2 " & g t ; & l t ; p k g : x m l D a t a & g t ; & l t ; R e l a t i o n s h i p s   x m l n s = " h t t p : / / s c h e m a s . o p e n x m l f o r m a t s . o r g / p a c k a g e / 2 0 0 6 / r e l a t i o n s h i p s " & g t ; & l t ; R e l a t i o n s h i p   I d = " r I d 2 "   T y p e = " h t t p : / / s c h e m a s . m i c r o s o f t . c o m / o f f i c e / 2 0 2 0 / 0 2 / r e l a t i o n s h i p s / c l a s s i f i c a t i o n l a b e l s "   T a r g e t = " d o c M e t a d a t a / L a b e l I n f o . x m l " / & g t ; & l t ; R e l a t i o n s h i p   I d = " r I d 1 "   T y p e = " h t t p : / / s c h e m a s . o p e n x m l f o r m a t s . o r g / o f f i c e D o c u m e n t / 2 0 0 6 / r e l a t i o n s h i p s / o f f i c e D o c u m e n t "   T a r g e t = " w o r d / d o c u m e n t . x m l " / & g t ; & l t ; / R e l a t i o n s h i p s & g t ; & l t ; / p k g : x m l D a t a & g t ; & l t ; / p k g : p a r t & g t ; & l t ; p k g : p a r t   p k g : n a m e = " / w o r d / d o c u m e n t . x m l "   p k g : c o n t e n t T y p e = " a p p l i c a t i o n / v n d . o p e n x m l f o r m a t s - o f f i c e d o c u m e n t . w o r d p r o c e s s i n g m l . d o c u m e n t . m a i n + x m l " & g t ; & l t ; p k g : x m l D a t a & g t ; & l t ; w : d o c u m e n t   x m l n s : w p c = " h t t p : / / s c h e m a s . m i c r o s o f t . c o m / o f f i c e / w o r d / 2 0 1 0 / w o r d p r o c e s s i n g C a n v a s "   x m l n s : c x = " h t t p : / / s c h e m a s . m i c r o s o f t . c o m / o f f i c e / d r a w i n g / 2 0 1 4 / c h a r t e x "   x m l n s : c x 1 = " h t t p : / / s c h e m a s . m i c r o s o f t . c o m / o f f i c e / d r a w i n g / 2 0 1 5 / 9 / 8 / c h a r t e x "   x m l n s : c x 2 = " h t t p : / / s c h e m a s . m i c r o s o f t . c o m / o f f i c e / d r a w i n g / 2 0 1 5 / 1 0 / 2 1 / c h a r t e x "   x m l n s : c x 3 = " h t t p : / / s c h e m a s . m i c r o s o f t . c o m / o f f i c e / d r a w i n g / 2 0 1 6 / 5 / 9 / c h a r t e x "   x m l n s : c x 4 = " h t t p : / / s c h e m a s . m i c r o s o f t . c o m / o f f i c e / d r a w i n g / 2 0 1 6 / 5 / 1 0 / c h a r t e x "   x m l n s : c x 5 = " h t t p : / / s c h e m a s . m i c r o s o f t . c o m / o f f i c e / d r a w i n g / 2 0 1 6 / 5 / 1 1 / c h a r t e x "   x m l n s : c x 6 = " h t t p : / / s c h e m a s . m i c r o s o f t . c o m / o f f i c e / d r a w i n g / 2 0 1 6 / 5 / 1 2 / c h a r t e x "   x m l n s : c x 7 = " h t t p : / / s c h e m a s . m i c r o s o f t . c o m / o f f i c e / d r a w i n g / 2 0 1 6 / 5 / 1 3 / c h a r t e x "   x m l n s : c x 8 = " h t t p : / / s c h e m a s . m i c r o s o f t . c o m / o f f i c e / d r a w i n g / 2 0 1 6 / 5 / 1 4 / c h a r t e x "   x m l n s : m c = " h t t p : / / s c h e m a s . o p e n x m l f o r m a t s . o r g / m a r k u p - c o m p a t i b i l i t y / 2 0 0 6 "   x m l n s : a i n k = " h t t p : / / s c h e m a s . m i c r o s o f t . c o m / o f f i c e / d r a w i n g / 2 0 1 6 / i n k "   x m l n s : a m 3 d = " h t t p : / / s c h e m a s . m i c r o s o f t . c o m / o f f i c e / d r a w i n g / 2 0 1 7 / m o d e l 3 d "   x m l n s : o = " u r n : s c h e m a s - m i c r o s o f t - c o m : o f f i c e : o f f i c e "   x m l n s : o e l = " h t t p : / / s c h e m a s . m i c r o s o f t . c o m / o f f i c e / 2 0 1 9 / e x t l s t "   x m l n s : r = " h t t p : / / s c h e m a s . o p e n x m l f o r m a t s . o r g / o f f i c e D o c u m e n t / 2 0 0 6 / r e l a t i o n s h i p s "   x m l n s : m = " h t t p : / / s c h e m a s . o p e n x m l f o r m a t s . o r g / o f f i c e D o c u m e n t / 2 0 0 6 / m a t h "   x m l n s : v = " u r n : s c h e m a s - m i c r o s o f t - c o m : v m l "   x m l n s : w p 1 4 = " h t t p : / / s c h e m a s . m i c r o s o f t . c o m / o f f i c e / w o r d / 2 0 1 0 / w o r d p r o c e s s i n g D r a w i n g "   x m l n s : w p = " h t t p : / / s c h e m a s . o p e n x m l f o r m a t s . o r g / d r a w i n g m l / 2 0 0 6 / w o r d p r o c e s s i n g D r a w i n g "   x m l n s : w 1 0 = " u r n : s c h e m a s - m i c r o s o f t - c o m : o f f i c e : w o r d "   x m l n s : w = " h t t p : / / s c h e m a s . o p e n x m l f o r m a t s . o r g / w o r d p r o c e s s i n g m l / 2 0 0 6 / m a i n "   x m l n s : w 1 4 = " h t t p : / / s c h e m a s . m i c r o s o f t . c o m / o f f i c e / w o r d / 2 0 1 0 / w o r d m l "   x m l n s : w 1 5 = " h t t p : / / s c h e m a s . m i c r o s o f t . c o m / o f f i c e / w o r d / 2 0 1 2 / w o r d m l "   x m l n s : w 1 6 c e x = " h t t p : / / s c h e m a s . m i c r o s o f t . c o m / o f f i c e / w o r d / 2 0 1 8 / w o r d m l / c e x "   x m l n s : w 1 6 c i d = " h t t p : / / s c h e m a s . m i c r o s o f t . c o m / o f f i c e / w o r d / 2 0 1 6 / w o r d m l / c i d "   x m l n s : w 1 6 = " h t t p : / / s c h e m a s . m i c r o s o f t . c o m / o f f i c e / w o r d / 2 0 1 8 / w o r d m l "   x m l n s : w 1 6 d u = " h t t p : / / s c h e m a s . m i c r o s o f t . c o m / o f f i c e / w o r d / 2 0 2 3 / w o r d m l / w o r d 1 6 d u "   x m l n s : w 1 6 s d t d h = " h t t p : / / s c h e m a s . m i c r o s o f t . c o m / o f f i c e / w o r d / 2 0 2 0 / w o r d m l / s d t d a t a h a s h "   x m l n s : w 1 6 s d t f l = " h t t p : / / s c h e m a s . m i c r o s o f t . c o m / o f f i c e / w o r d / 2 0 2 4 / w o r d m l / s d t f o r m a t l o c k "   x m l n s : w 1 6 s e = " h t t p : / / s c h e m a s . m i c r o s o f t . c o m / o f f i c e / w o r d / 2 0 1 5 / w o r d m l / s y m e x "   x m l n s : w p g = " h t t p : / / s c h e m a s . m i c r o s o f t . c o m / o f f i c e / w o r d / 2 0 1 0 / w o r d p r o c e s s i n g G r o u p "   x m l n s : w p i = " h t t p : / / s c h e m a s . m i c r o s o f t . c o m / o f f i c e / w o r d / 2 0 1 0 / w o r d p r o c e s s i n g I n k "   x m l n s : w n e = " h t t p : / / s c h e m a s . m i c r o s o f t . c o m / o f f i c e / w o r d / 2 0 0 6 / w o r d m l "   x m l n s : w p s = " h t t p : / / s c h e m a s . m i c r o s o f t . c o m / o f f i c e / w o r d / 2 0 1 0 / w o r d p r o c e s s i n g S h a p e "   m c : I g n o r a b l e = " w 1 4   w 1 5   w 1 6 s e   w 1 6 c i d   w 1 6   w 1 6 c e x   w 1 6 s d t d h   w 1 6 s d t f l   w 1 6 d u   w p 1 4 " & g t ; & l t ; w : b o d y & g t ; & l t ; w : p   w 1 4 : p a r a I d = " 1 9 6 4 8 8 5 0 "   w 1 4 : t e x t I d = " 3 8 A 7 8 C C 9 "   w : r s i d R = " 0 0 4 0 5 0 1 0 "   w : r s i d R D e f a u l t = " 0 0 4 0 5 0 1 0 " & g t ; & l t ; w : p P r & g t ; & l t ; w : s p a c i n g   w : a f t e r = " 0 "   w : l i n e = " 2 4 0 "   w : l i n e R u l e = " a u t o " / & g t ; & l t ; / w : p P r & g t ; & l t ; w : r & g t ; & l t ; w : r P r & g t ; & l t ; w : r F o n t s   w : a s c i i = " S e g o e   U I "   w : h A n s i = " S e g o e   U I "   w : c s = " S e g o e   U I " / & g t ; & l t ; w : s z   w : v a l = " 1 6 " / & g t ; & l t ; w : s z C s   w : v a l = " 1 6 " / & g t ; & l t ; / w : r P r & g t ; & l t ; w : t & g t ; I n v Q t y _ I t e m L e d g E n t r y & l t ; / w : t & g t ; & l t ; / w : r & g t ; & l t ; / w : p & g t ; & l t ; w : s e c t P r   w : r s i d R = " 0 0 0 0 0 0 0 0 " & g t ; & l t ; w : p g S z   w : w = " 1 2 2 4 0 "   w : h = " 1 5 8 4 0 " / & g t ; & l t ; w : p g M a r   w : t o p = " 1 4 4 0 "   w : r i g h t = " 1 4 4 0 "   w : b o t t o m = " 1 4 4 0 "   w : l e f t = " 1 4 4 0 "   w : h e a d e r = " 7 2 0 "   w : f o o t e r = " 7 2 0 "   w : g u t t e r = " 0 " / & g t ; & l t ; w : c o l s   w : s p a c e = " 7 2 0 " / & g t ; & l t ; / w : s e c t P r & g t ; & l t ; / w : b o d y & g t ; & l t ; / w : d o c u m e n t & g t ; & l t ; / p k g : x m l D a t a & g t ; & l t ; / p k g : p a r t & g t ; & l t ; p k g : p a r t   p k g : n a m e = " / w o r d / _ r e l s / d o c u m e n t . x m l . r e l s "   p k g : c o n t e n t T y p e = " a p p l i c a t i o n / v n d . o p e n x m l f o r m a t s - p a c k a g e . r e l a t i o n s h i p s + x m l "   p k g : p a d d i n g = " 2 5 6 " & g t ; & l t ; p k g : x m l D a t a & g t ; & l t ; R e l a t i o n s h i p s   x m l n s = " h t t p : / / s c h e m a s . o p e n x m l f o r m a t s . o r g / p a c k a g e / 2 0 0 6 / r e l a t i o n s h i p s " & g t ; & l t ; R e l a t i o n s h i p   I d = " r I d 1 "   T y p e = " h t t p : / / s c h e m a s . o p e n x m l f o r m a t s . o r g / o f f i c e D o c u m e n t / 2 0 0 6 / r e l a t i o n s h i p s / s t y l e s "   T a r g e t = " s t y l e s . x m l " / & g t ; & l t ; / R e l a t i o n s h i p s & g t ; & l t ; / p k g : x m l D a t a & g t ; & l t ; / p k g : p a r t & g t ; & l t ; p k g : p a r t   p k g : n a m e = " / w o r d / s t y l e s . x m l "   p k g : c o n t e n t T y p e = " a p p l i c a t i o n / v n d . o p e n x m l f o r m a t s - o f f i c e d o c u m e n t . w o r d p r o c e s s i n g m l . s t y l e s + x m l " & g t ; & l t ; p k g : x m l D a t a & g t ; & l t ; w : s t y l e s   x m l n s : m c = " h t t p : / / s c h e m a s . o p e n x m l f o r m a t s . o r g / m a r k u p - c o m p a t i b i l i t y / 2 0 0 6 "   x m l n s : r = " h t t p : / / s c h e m a s . o p e n x m l f o r m a t s . o r g / o f f i c e D o c u m e n t / 2 0 0 6 / r e l a t i o n s h i p s "   x m l n s : w = " h t t p : / / s c h e m a s . o p e n x m l f o r m a t s . o r g / w o r d p r o c e s s i n g m l / 2 0 0 6 / m a i n "   x m l n s : w 1 4 = " h t t p : / / s c h e m a s . m i c r o s o f t . c o m / o f f i c e / w o r d / 2 0 1 0 / w o r d m l "   x m l n s : w 1 5 = " h t t p : / / s c h e m a s . m i c r o s o f t . c o m / o f f i c e / w o r d / 2 0 1 2 / w o r d m l "   x m l n s : w 1 6 c e x = " h t t p : / / s c h e m a s . m i c r o s o f t . c o m / o f f i c e / w o r d / 2 0 1 8 / w o r d m l / c e x "   x m l n s : w 1 6 c i d = " h t t p : / / s c h e m a s . m i c r o s o f t . c o m / o f f i c e / w o r d / 2 0 1 6 / w o r d m l / c i d "   x m l n s : w 1 6 = " h t t p : / / s c h e m a s . m i c r o s o f t . c o m / o f f i c e / w o r d / 2 0 1 8 / w o r d m l "   x m l n s : w 1 6 d u = " h t t p : / / s c h e m a s . m i c r o s o f t . c o m / o f f i c e / w o r d / 2 0 2 3 / w o r d m l / w o r d 1 6 d u "   x m l n s : w 1 6 s d t d h = " h t t p : / / s c h e m a s . m i c r o s o f t . c o m / o f f i c e / w o r d / 2 0 2 0 / w o r d m l / s d t d a t a h a s h "   x m l n s : w 1 6 s d t f l = " h t t p : / / s c h e m a s . m i c r o s o f t . c o m / o f f i c e / w o r d / 2 0 2 4 / w o r d m l / s d t f o r m a t l o c k "   x m l n s : w 1 6 s e = " h t t p : / / s c h e m a s . m i c r o s o f t . c o m / o f f i c e / w o r d / 2 0 1 5 / w o r d m l / s y m e x "   m c : I g n o r a b l e = " w 1 4   w 1 5   w 1 6 s e   w 1 6 c i d   w 1 6   w 1 6 c e x   w 1 6 s d t d h   w 1 6 s d t f l   w 1 6 d u " & g t ; & l t ; w : d o c D e f a u l t s & g t ; & l t ; w : r P r D e f a u l t & g t ; & l t ; w : r P r & g t ; & l t ; w : r F o n t s   w : a s c i i T h e m e = " m i n o r H A n s i "   w : e a s t A s i a T h e m e = " m i n o r E a s t A s i a "   w : h A n s i T h e m e = " m i n o r H A n s i "   w : c s t h e m e = " m i n o r B i d i " / & g t ; & l t ; w : k e r n   w : v a l = " 2 " / & g t ; & l t ; w : s z   w : v a l = " 2 4 " / & g t ; & l t ; w : s z C s   w : v a l = " 2 4 " / & g t ; & l t ; w : l a n g   w : v a l = " e n - A U "   w : e a s t A s i a = " z h - C N "   w : b i d i = " a r - S A " / & g t ; & l t ; w 1 4 : l i g a t u r e s   w 1 4 : v a l = " s t a n d a r d C o n t e x t u a l " / & g t ; & l t ; / w : r P r & g t ; & l t ; / w : r P r D e f a u l t & g t ; & l t ; w : p P r D e f a u l t & g t ; & l t ; w : p P r & g t ; & l t ; w : s p a c i n g   w : a f t e r = " 1 6 0 "   w : l i n e = " 2 7 8 "   w : l i n e R u l e = " a u t o " / & g t ; & l t ; / w : p P r & g t ; & l t ; / w : p P r D e f a u l t & g t ; & l t ; / w : d o c D e f a u l t s & g t ; & l t ; w : s t y l e   w : t y p e = " p a r a g r a p h "   w : d e f a u l t = " 1 "   w : s t y l e I d = " N o r m a l " & g t ; & l t ; w : n a m e   w : v a l = " N o r m a l " / & g t ; & l t ; w : q F o r m a t / & g t ; & l t ; / w : s t y l e & g t ; & l t ; w : s t y l e   w : t y p e = " c h a r a c t e r "   w : d e f a u l t = " 1 "   w : s t y l e I d = " D e f a u l t P a r a g r a p h F o n t " & g t ; & l t ; w : n a m e   w : v a l = " D e f a u l t   P a r a g r a p h   F o n t " / & g t ; & l t ; w : u i P r i o r i t y   w : v a l = " 1 " / & g t ; & l t ; w : s e m i H i d d e n / & g t ; & l t ; w : u n h i d e W h e n U s e d / & g t ; & l t ; / w : s t y l e & g t ; & l t ; w : s t y l e   w : t y p e = " t a b l e "   w : d e f a u l t = " 1 "   w : s t y l e I d = " T a b l e N o r m a l " & g t ; & l t ; w : n a m e   w : v a l = " N o r m a l   T a b l e " / & g t ; & l t ; w : u i P r i o r i t y   w : v a l = " 9 9 " / & g t ; & l t ; w : s e m i H i d d e n / & g t ; & l t ; w : u n h i d e W h e n U s e d / & g t ; & l t ; w : t b l P r & g t ; & l t ; w : t b l I n d   w : w = " 0 "   w : t y p e = " d x a " / & g t ; & l t ; w : t b l C e l l M a r & g t ; & l t ; w : t o p   w : w = " 0 "   w : t y p e = " d x a " / & g t ; & l t ; w : l e f t   w : w = " 1 0 8 "   w : t y p e = " d x a " / & g t ; & l t ; w : b o t t o m   w : w = " 0 "   w : t y p e = " d x a " / & g t ; & l t ; w : r i g h t   w : w = " 1 0 8 "   w : t y p e = " d x a " / & g t ; & l t ; / w : t b l C e l l M a r & g t ; & l t ; / w : t b l P r & g t ; & l t ; / w : s t y l e & g t ; & l t ; w : s t y l e   w : t y p e = " n u m b e r i n g "   w : d e f a u l t = " 1 "   w : s t y l e I d = " N o L i s t " & g t ; & l t ; w : n a m e   w : v a l = " N o   L i s t " / & g t ; & l t ; w : u i P r i o r i t y   w : v a l = " 9 9 " / & g t ; & l t ; w : s e m i H i d d e n / & g t ; & l t ; w : u n h i d e W h e n U s e d / & g t ; & l t ; / w : s t y l e & g t ; & l t ; / w : s t y l e s & g t ; & l t ; / p k g : x m l D a t a & g t ; & l t ; / p k g : p a r t & g t ; & l t ; p k g : p a r t   p k g : n a m e = " / d o c M e t a d a t a / L a b e l I n f o . x m l "   p k g : c o n t e n t T y p e = " a p p l i c a t i o n / v n d . m s - o f f i c e . c l a s s i f i c a t i o n l a b e l s + x m l " & g t ; & l t ; p k g : x m l D a t a & g t ; & l t ; c l b l : l a b e l L i s t   x m l n s : c l b l = " h t t p : / / s c h e m a s . m i c r o s o f t . c o m / o f f i c e / 2 0 2 0 / m i p L a b e l M e t a d a t a " & g t ; & l t ; c l b l : l a b e l   i d = " { 8 5 c a 8 a f 4 - 7 6 3 a - 4 5 c 2 - 8 0 a e - a 5 c a 1 b 8 0 b d d c } "   e n a b l e d = " 1 "   m e t h o d = " S t a n d a r d "   s i t e I d = " { 0 6 c d a f 0 9 - 1 4 f 0 - 4 c d 1 - 8 a c 0 - 7 b f e d 7 0 7 a 8 2 c } "   c o n t e n t B i t s = " 0 "   r e m o v e d = " 0 " / & g t ; & l t ; / c l b l : l a b e l L i s t & g t ; & l t ; / p k g : x m l D a t a & g t ; & l t ; / p k g : p a r t & g t ; & l t ; / p k g : p a c k a g e & g t ; - 
- < / I n v Q t y _ I t e m L e d g E n t r y > - 
-                 < P r o f i t P c t _ I t e m L e d g E n t r y > & l t ; ? x m l   v e r s i o n = " 1 . 0 "   s t a n d a l o n e = " y e s " ? & g t ; - 
- & l t ; ? m s o - a p p l i c a t i o n   p r o g i d = " W o r d . D o c u m e n t " ? & g t ; - 
- & l t ; p k g : p a c k a g e   x m l n s : p k g = " h t t p : / / s c h e m a s . m i c r o s o f t . c o m / o f f i c e / 2 0 0 6 / x m l P a c k a g e " & g t ; & l t ; p k g : p a r t   p k g : n a m e = " / _ r e l s / . r e l s "   p k g : c o n t e n t T y p e = " a p p l i c a t i o n / v n d . o p e n x m l f o r m a t s - p a c k a g e . r e l a t i o n s h i p s + x m l "   p k g : p a d d i n g = " 5 1 2 " & g t ; & l t ; p k g : x m l D a t a & g t ; & l t ; R e l a t i o n s h i p s   x m l n s = " h t t p : / / s c h e m a s . o p e n x m l f o r m a t s . o r g / p a c k a g e / 2 0 0 6 / r e l a t i o n s h i p s " & g t ; & l t ; R e l a t i o n s h i p   I d = " r I d 2 "   T y p e = " h t t p : / / s c h e m a s . m i c r o s o f t . c o m / o f f i c e / 2 0 2 0 / 0 2 / r e l a t i o n s h i p s / c l a s s i f i c a t i o n l a b e l s "   T a r g e t = " d o c M e t a d a t a / L a b e l I n f o . x m l " / & g t ; & l t ; R e l a t i o n s h i p   I d = " r I d 1 "   T y p e = " h t t p : / / s c h e m a s . o p e n x m l f o r m a t s . o r g / o f f i c e D o c u m e n t / 2 0 0 6 / r e l a t i o n s h i p s / o f f i c e D o c u m e n t "   T a r g e t = " w o r d / d o c u m e n t . x m l " / & g t ; & l t ; / R e l a t i o n s h i p s & g t ; & l t ; / p k g : x m l D a t a & g t ; & l t ; / p k g : p a r t & g t ; & l t ; p k g : p a r t   p k g : n a m e = " / w o r d / d o c u m e n t . x m l "   p k g : c o n t e n t T y p e = " a p p l i c a t i o n / v n d . o p e n x m l f o r m a t s - o f f i c e d o c u m e n t . w o r d p r o c e s s i n g m l . d o c u m e n t . m a i n + x m l " & g t ; & l t ; p k g : x m l D a t a & g t ; & l t ; w : d o c u m e n t   x m l n s : w p c = " h t t p : / / s c h e m a s . m i c r o s o f t . c o m / o f f i c e / w o r d / 2 0 1 0 / w o r d p r o c e s s i n g C a n v a s "   x m l n s : c x = " h t t p : / / s c h e m a s . m i c r o s o f t . c o m / o f f i c e / d r a w i n g / 2 0 1 4 / c h a r t e x "   x m l n s : c x 1 = " h t t p : / / s c h e m a s . m i c r o s o f t . c o m / o f f i c e / d r a w i n g / 2 0 1 5 / 9 / 8 / c h a r t e x "   x m l n s : c x 2 = " h t t p : / / s c h e m a s . m i c r o s o f t . c o m / o f f i c e / d r a w i n g / 2 0 1 5 / 1 0 / 2 1 / c h a r t e x "   x m l n s : c x 3 = " h t t p : / / s c h e m a s . m i c r o s o f t . c o m / o f f i c e / d r a w i n g / 2 0 1 6 / 5 / 9 / c h a r t e x "   x m l n s : c x 4 = " h t t p : / / s c h e m a s . m i c r o s o f t . c o m / o f f i c e / d r a w i n g / 2 0 1 6 / 5 / 1 0 / c h a r t e x "   x m l n s : c x 5 = " h t t p : / / s c h e m a s . m i c r o s o f t . c o m / o f f i c e / d r a w i n g / 2 0 1 6 / 5 / 1 1 / c h a r t e x "   x m l n s : c x 6 = " h t t p : / / s c h e m a s . m i c r o s o f t . c o m / o f f i c e / d r a w i n g / 2 0 1 6 / 5 / 1 2 / c h a r t e x "   x m l n s : c x 7 = " h t t p : / / s c h e m a s . m i c r o s o f t . c o m / o f f i c e / d r a w i n g / 2 0 1 6 / 5 / 1 3 / c h a r t e x "   x m l n s : c x 8 = " h t t p : / / s c h e m a s . m i c r o s o f t . c o m / o f f i c e / d r a w i n g / 2 0 1 6 / 5 / 1 4 / c h a r t e x "   x m l n s : m c = " h t t p : / / s c h e m a s . o p e n x m l f o r m a t s . o r g / m a r k u p - c o m p a t i b i l i t y / 2 0 0 6 "   x m l n s : a i n k = " h t t p : / / s c h e m a s . m i c r o s o f t . c o m / o f f i c e / d r a w i n g / 2 0 1 6 / i n k "   x m l n s : a m 3 d = " h t t p : / / s c h e m a s . m i c r o s o f t . c o m / o f f i c e / d r a w i n g / 2 0 1 7 / m o d e l 3 d "   x m l n s : o = " u r n : s c h e m a s - m i c r o s o f t - c o m : o f f i c e : o f f i c e "   x m l n s : o e l = " h t t p : / / s c h e m a s . m i c r o s o f t . c o m / o f f i c e / 2 0 1 9 / e x t l s t "   x m l n s : r = " h t t p : / / s c h e m a s . o p e n x m l f o r m a t s . o r g / o f f i c e D o c u m e n t / 2 0 0 6 / r e l a t i o n s h i p s "   x m l n s : m = " h t t p : / / s c h e m a s . o p e n x m l f o r m a t s . o r g / o f f i c e D o c u m e n t / 2 0 0 6 / m a t h "   x m l n s : v = " u r n : s c h e m a s - m i c r o s o f t - c o m : v m l "   x m l n s : w p 1 4 = " h t t p : / / s c h e m a s . m i c r o s o f t . c o m / o f f i c e / w o r d / 2 0 1 0 / w o r d p r o c e s s i n g D r a w i n g "   x m l n s : w p = " h t t p : / / s c h e m a s . o p e n x m l f o r m a t s . o r g / d r a w i n g m l / 2 0 0 6 / w o r d p r o c e s s i n g D r a w i n g "   x m l n s : w 1 0 = " u r n : s c h e m a s - m i c r o s o f t - c o m : o f f i c e : w o r d "   x m l n s : w = " h t t p : / / s c h e m a s . o p e n x m l f o r m a t s . o r g / w o r d p r o c e s s i n g m l / 2 0 0 6 / m a i n "   x m l n s : w 1 4 = " h t t p : / / s c h e m a s . m i c r o s o f t . c o m / o f f i c e / w o r d / 2 0 1 0 / w o r d m l "   x m l n s : w 1 5 = " h t t p : / / s c h e m a s . m i c r o s o f t . c o m / o f f i c e / w o r d / 2 0 1 2 / w o r d m l "   x m l n s : w 1 6 c e x = " h t t p : / / s c h e m a s . m i c r o s o f t . c o m / o f f i c e / w o r d / 2 0 1 8 / w o r d m l / c e x "   x m l n s : w 1 6 c i d = " h t t p : / / s c h e m a s . m i c r o s o f t . c o m / o f f i c e / w o r d / 2 0 1 6 / w o r d m l / c i d "   x m l n s : w 1 6 = " h t t p : / / s c h e m a s . m i c r o s o f t . c o m / o f f i c e / w o r d / 2 0 1 8 / w o r d m l "   x m l n s : w 1 6 d u = " h t t p : / / s c h e m a s . m i c r o s o f t . c o m / o f f i c e / w o r d / 2 0 2 3 / w o r d m l / w o r d 1 6 d u "   x m l n s : w 1 6 s d t d h = " h t t p : / / s c h e m a s . m i c r o s o f t . c o m / o f f i c e / w o r d / 2 0 2 0 / w o r d m l / s d t d a t a h a s h "   x m l n s : w 1 6 s d t f l = " h t t p : / / s c h e m a s . m i c r o s o f t . c o m / o f f i c e / w o r d / 2 0 2 4 / w o r d m l / s d t f o r m a t l o c k "   x m l n s : w 1 6 s e = " h t t p : / / s c h e m a s . m i c r o s o f t . c o m / o f f i c e / w o r d / 2 0 1 5 / w o r d m l / s y m e x "   x m l n s : w p g = " h t t p : / / s c h e m a s . m i c r o s o f t . c o m / o f f i c e / w o r d / 2 0 1 0 / w o r d p r o c e s s i n g G r o u p "   x m l n s : w p i = " h t t p : / / s c h e m a s . m i c r o s o f t . c o m / o f f i c e / w o r d / 2 0 1 0 / w o r d p r o c e s s i n g I n k "   x m l n s : w n e = " h t t p : / / s c h e m a s . m i c r o s o f t . c o m / o f f i c e / w o r d / 2 0 0 6 / w o r d m l "   x m l n s : w p s = " h t t p : / / s c h e m a s . m i c r o s o f t . c o m / o f f i c e / w o r d / 2 0 1 0 / w o r d p r o c e s s i n g S h a p e "   m c : I g n o r a b l e = " w 1 4   w 1 5   w 1 6 s e   w 1 6 c i d   w 1 6   w 1 6 c e x   w 1 6 s d t d h   w 1 6 s d t f l   w 1 6 d u   w p 1 4 " & g t ; & l t ; w : b o d y & g t ; & l t ; w : p   w 1 4 : p a r a I d = " 7 D 7 0 6 8 E 2 "   w 1 4 : t e x t I d = " 6 7 1 8 C 4 C B "   w : r s i d R = " 0 0 3 6 1 B D 0 "   w : r s i d R D e f a u l t = " 0 0 3 6 1 B D 0 " & g t ; & l t ; w : p P r & g t ; & l t ; w : s p a c i n g   w : a f t e r = " 0 "   w : l i n e = " 2 4 0 "   w : l i n e R u l e = " a u t o " / & g t ; & l t ; w : j c   w : v a l = " r i g h t " / & g t ; & l t ; / w : p P r & g t ; & l t ; w : r & g t ; & l t ; w : r P r & g t ; & l t ; w : r F o n t s   w : a s c i i = " S e g o e   U I "   w : h A n s i = " S e g o e   U I "   w : c s = " S e g o e   U I " / & g t ; & l t ; w : s z   w : v a l = " 1 6 " / & g t ; & l t ; w : s z C s   w : v a l = " 1 6 " / & g t ; & l t ; / w : r P r & g t ; & l t ; w : t & g t ; P r o f i t P c t _ I t e m L e d g E n t r y & l t ; / w : t & g t ; & l t ; / w : r & g t ; & l t ; / w : p & g t ; & l t ; w : s e c t P r   w : r s i d R = " 0 0 0 0 0 0 0 0 " & g t ; & l t ; w : p g S z   w : w = " 1 2 2 4 0 "   w : h = " 1 5 8 4 0 " / & g t ; & l t ; w : p g M a r   w : t o p = " 1 4 4 0 "   w : r i g h t = " 1 4 4 0 "   w : b o t t o m = " 1 4 4 0 "   w : l e f t = " 1 4 4 0 "   w : h e a d e r = " 7 2 0 "   w : f o o t e r = " 7 2 0 "   w : g u t t e r = " 0 " / & g t ; & l t ; w : c o l s   w : s p a c e = " 7 2 0 " / & g t ; & l t ; / w : s e c t P r & g t ; & l t ; / w : b o d y & g t ; & l t ; / w : d o c u m e n t & g t ; & l t ; / p k g : x m l D a t a & g t ; & l t ; / p k g : p a r t & g t ; & l t ; p k g : p a r t   p k g : n a m e = " / w o r d / _ r e l s / d o c u m e n t . x m l . r e l s "   p k g : c o n t e n t T y p e = " a p p l i c a t i o n / v n d . o p e n x m l f o r m a t s - p a c k a g e . r e l a t i o n s h i p s + x m l "   p k g : p a d d i n g = " 2 5 6 " & g t ; & l t ; p k g : x m l D a t a & g t ; & l t ; R e l a t i o n s h i p s   x m l n s = " h t t p : / / s c h e m a s . o p e n x m l f o r m a t s . o r g / p a c k a g e / 2 0 0 6 / r e l a t i o n s h i p s " & g t ; & l t ; R e l a t i o n s h i p   I d = " r I d 1 "   T y p e = " h t t p : / / s c h e m a s . o p e n x m l f o r m a t s . o r g / o f f i c e D o c u m e n t / 2 0 0 6 / r e l a t i o n s h i p s / s t y l e s "   T a r g e t = " s t y l e s . x m l " / & g t ; & l t ; / R e l a t i o n s h i p s & g t ; & l t ; / p k g : x m l D a t a & g t ; & l t ; / p k g : p a r t & g t ; & l t ; p k g : p a r t   p k g : n a m e = " / w o r d / s t y l e s . x m l "   p k g : c o n t e n t T y p e = " a p p l i c a t i o n / v n d . o p e n x m l f o r m a t s - o f f i c e d o c u m e n t . w o r d p r o c e s s i n g m l . s t y l e s + x m l " & g t ; & l t ; p k g : x m l D a t a & g t ; & l t ; w : s t y l e s   x m l n s : m c = " h t t p : / / s c h e m a s . o p e n x m l f o r m a t s . o r g / m a r k u p - c o m p a t i b i l i t y / 2 0 0 6 "   x m l n s : r = " h t t p : / / s c h e m a s . o p e n x m l f o r m a t s . o r g / o f f i c e D o c u m e n t / 2 0 0 6 / r e l a t i o n s h i p s "   x m l n s : w = " h t t p : / / s c h e m a s . o p e n x m l f o r m a t s . o r g / w o r d p r o c e s s i n g m l / 2 0 0 6 / m a i n "   x m l n s : w 1 4 = " h t t p : / / s c h e m a s . m i c r o s o f t . c o m / o f f i c e / w o r d / 2 0 1 0 / w o r d m l "   x m l n s : w 1 5 = " h t t p : / / s c h e m a s . m i c r o s o f t . c o m / o f f i c e / w o r d / 2 0 1 2 / w o r d m l "   x m l n s : w 1 6 c e x = " h t t p : / / s c h e m a s . m i c r o s o f t . c o m / o f f i c e / w o r d / 2 0 1 8 / w o r d m l / c e x "   x m l n s : w 1 6 c i d = " h t t p : / / s c h e m a s . m i c r o s o f t . c o m / o f f i c e / w o r d / 2 0 1 6 / w o r d m l / c i d "   x m l n s : w 1 6 = " h t t p : / / s c h e m a s . m i c r o s o f t . c o m / o f f i c e / w o r d / 2 0 1 8 / w o r d m l "   x m l n s : w 1 6 d u = " h t t p : / / s c h e m a s . m i c r o s o f t . c o m / o f f i c e / w o r d / 2 0 2 3 / w o r d m l / w o r d 1 6 d u "   x m l n s : w 1 6 s d t d h = " h t t p : / / s c h e m a s . m i c r o s o f t . c o m / o f f i c e / w o r d / 2 0 2 0 / w o r d m l / s d t d a t a h a s h "   x m l n s : w 1 6 s d t f l = " h t t p : / / s c h e m a s . m i c r o s o f t . c o m / o f f i c e / w o r d / 2 0 2 4 / w o r d m l / s d t f o r m a t l o c k "   x m l n s : w 1 6 s e = " h t t p : / / s c h e m a s . m i c r o s o f t . c o m / o f f i c e / w o r d / 2 0 1 5 / w o r d m l / s y m e x "   m c : I g n o r a b l e = " w 1 4   w 1 5   w 1 6 s e   w 1 6 c i d   w 1 6   w 1 6 c e x   w 1 6 s d t d h   w 1 6 s d t f l   w 1 6 d u " & g t ; & l t ; w : d o c D e f a u l t s & g t ; & l t ; w : r P r D e f a u l t & g t ; & l t ; w : r P r & g t ; & l t ; w : r F o n t s   w : a s c i i T h e m e = " m i n o r H A n s i "   w : e a s t A s i a T h e m e = " m i n o r E a s t A s i a "   w : h A n s i T h e m e = " m i n o r H A n s i "   w : c s t h e m e = " m i n o r B i d i " / & g t ; & l t ; w : k e r n   w : v a l = " 2 " / & g t ; & l t ; w : s z   w : v a l = " 2 4 " / & g t ; & l t ; w : s z C s   w : v a l = " 2 4 " / & g t ; & l t ; w : l a n g   w : v a l = " e n - A U "   w : e a s t A s i a = " z h - C N "   w : b i d i = " a r - S A " / & g t ; & l t ; w 1 4 : l i g a t u r e s   w 1 4 : v a l = " s t a n d a r d C o n t e x t u a l " / & g t ; & l t ; / w : r P r & g t ; & l t ; / w : r P r D e f a u l t & g t ; & l t ; w : p P r D e f a u l t & g t ; & l t ; w : p P r & g t ; & l t ; w : s p a c i n g   w : a f t e r = " 1 6 0 "   w : l i n e = " 2 7 8 "   w : l i n e R u l e = " a u t o " / & g t ; & l t ; / w : p P r & g t ; & l t ; / w : p P r D e f a u l t & g t ; & l t ; / w : d o c D e f a u l t s & g t ; & l t ; w : s t y l e   w : t y p e = " p a r a g r a p h "   w : d e f a u l t = " 1 "   w : s t y l e I d = " N o r m a l " & g t ; & l t ; w : n a m e   w : v a l = " N o r m a l " / & g t ; & l t ; w : q F o r m a t / & g t ; & l t ; / w : s t y l e & g t ; & l t ; w : s t y l e   w : t y p e = " c h a r a c t e r "   w : d e f a u l t = " 1 "   w : s t y l e I d = " D e f a u l t P a r a g r a p h F o n t " & g t ; & l t ; w : n a m e   w : v a l = " D e f a u l t   P a r a g r a p h   F o n t " / & g t ; & l t ; w : u i P r i o r i t y   w : v a l = " 1 " / & g t ; & l t ; w : s e m i H i d d e n / & g t ; & l t ; w : u n h i d e W h e n U s e d / & g t ; & l t ; / w : s t y l e & g t ; & l t ; w : s t y l e   w : t y p e = " t a b l e "   w : d e f a u l t = " 1 "   w : s t y l e I d = " T a b l e N o r m a l " & g t ; & l t ; w : n a m e   w : v a l = " N o r m a l   T a b l e " / & g t ; & l t ; w : u i P r i o r i t y   w : v a l = " 9 9 " / & g t ; & l t ; w : s e m i H i d d e n / & g t ; & l t ; w : u n h i d e W h e n U s e d / & g t ; & l t ; w : t b l P r & g t ; & l t ; w : t b l I n d   w : w = " 0 "   w : t y p e = " d x a " / & g t ; & l t ; w : t b l C e l l M a r & g t ; & l t ; w : t o p   w : w = " 0 "   w : t y p e = " d x a " / & g t ; & l t ; w : l e f t   w : w = " 1 0 8 "   w : t y p e = " d x a " / & g t ; & l t ; w : b o t t o m   w : w = " 0 "   w : t y p e = " d x a " / & g t ; & l t ; w : r i g h t   w : w = " 1 0 8 "   w : t y p e = " d x a " / & g t ; & l t ; / w : t b l C e l l M a r & g t ; & l t ; / w : t b l P r & g t ; & l t ; / w : s t y l e & g t ; & l t ; w : s t y l e   w : t y p e = " n u m b e r i n g "   w : d e f a u l t = " 1 "   w : s t y l e I d = " N o L i s t " & g t ; & l t ; w : n a m e   w : v a l = " N o   L i s t " / & g t ; & l t ; w : u i P r i o r i t y   w : v a l = " 9 9 " / & g t ; & l t ; w : s e m i H i d d e n / & g t ; & l t ; w : u n h i d e W h e n U s e d / & g t ; & l t ; / w : s t y l e & g t ; & l t ; / w : s t y l e s & g t ; & l t ; / p k g : x m l D a t a & g t ; & l t ; / p k g : p a r t & g t ; & l t ; p k g : p a r t   p k g : n a m e = " / d o c M e t a d a t a / L a b e l I n f o . x m l "   p k g : c o n t e n t T y p e = " a p p l i c a t i o n / v n d . m s - o f f i c e . c l a s s i f i c a t i o n l a b e l s + x m l " & g t ; & l t ; p k g : x m l D a t a & g t ; & l t ; c l b l : l a b e l L i s t   x m l n s : c l b l = " h t t p : / / s c h e m a s . m i c r o s o f t . c o m / o f f i c e / 2 0 2 0 / m i p L a b e l M e t a d a t a " & g t ; & l t ; c l b l : l a b e l   i d = " { 8 5 c a 8 a f 4 - 7 6 3 a - 4 5 c 2 - 8 0 a e - a 5 c a 1 b 8 0 b d d c } "   e n a b l e d = " 1 "   m e t h o d = " S t a n d a r d "   s i t e I d = " { 0 6 c d a f 0 9 - 1 4 f 0 - 4 c d 1 - 8 a c 0 - 7 b f e d 7 0 7 a 8 2 c } "   c o n t e n t B i t s = " 0 "   r e m o v e d = " 0 " / & g t ; & l t ; / c l b l : l a b e l L i s t & g t ; & l t ; / p k g : x m l D a t a & g t ; & l t ; / p k g : p a r t & g t ; & l t ; / p k g : p a c k a g e & g t ; - 
- < / P r o f i t P c t _ I t e m L e d g E n t r y > - 
-                 < P r o f i t _ I t e m L e d g E n t r y > & l t ; ? x m l   v e r s i o n = " 1 . 0 "   s t a n d a l o n e = " y e s " ? & g t ; - 
- & l t ; ? m s o - a p p l i c a t i o n   p r o g i d = " W o r d . D o c u m e n t " ? & g t ; - 
- & l t ; p k g : p a c k a g e   x m l n s : p k g = " h t t p : / / s c h e m a s . m i c r o s o f t . c o m / o f f i c e / 2 0 0 6 / x m l P a c k a g e " & g t ; & l t ; p k g : p a r t   p k g : n a m e = " / _ r e l s / . r e l s "   p k g : c o n t e n t T y p e = " a p p l i c a t i o n / v n d . o p e n x m l f o r m a t s - p a c k a g e . r e l a t i o n s h i p s + x m l "   p k g : p a d d i n g = " 5 1 2 " & g t ; & l t ; p k g : x m l D a t a & g t ; & l t ; R e l a t i o n s h i p s   x m l n s = " h t t p : / / s c h e m a s . o p e n x m l f o r m a t s . o r g / p a c k a g e / 2 0 0 6 / r e l a t i o n s h i p s " & g t ; & l t ; R e l a t i o n s h i p   I d = " r I d 2 "   T y p e = " h t t p : / / s c h e m a s . m i c r o s o f t . c o m / o f f i c e / 2 0 2 0 / 0 2 / r e l a t i o n s h i p s / c l a s s i f i c a t i o n l a b e l s "   T a r g e t = " d o c M e t a d a t a / L a b e l I n f o . x m l " / & g t ; & l t ; R e l a t i o n s h i p   I d = " r I d 1 "   T y p e = " h t t p : / / s c h e m a s . o p e n x m l f o r m a t s . o r g / o f f i c e D o c u m e n t / 2 0 0 6 / r e l a t i o n s h i p s / o f f i c e D o c u m e n t "   T a r g e t = " w o r d / d o c u m e n t . x m l " / & g t ; & l t ; / R e l a t i o n s h i p s & g t ; & l t ; / p k g : x m l D a t a & g t ; & l t ; / p k g : p a r t & g t ; & l t ; p k g : p a r t   p k g : n a m e = " / w o r d / d o c u m e n t . x m l "   p k g : c o n t e n t T y p e = " a p p l i c a t i o n / v n d . o p e n x m l f o r m a t s - o f f i c e d o c u m e n t . w o r d p r o c e s s i n g m l . d o c u m e n t . m a i n + x m l " & g t ; & l t ; p k g : x m l D a t a & g t ; & l t ; w : d o c u m e n t   x m l n s : w p c = " h t t p : / / s c h e m a s . m i c r o s o f t . c o m / o f f i c e / w o r d / 2 0 1 0 / w o r d p r o c e s s i n g C a n v a s "   x m l n s : c x = " h t t p : / / s c h e m a s . m i c r o s o f t . c o m / o f f i c e / d r a w i n g / 2 0 1 4 / c h a r t e x "   x m l n s : c x 1 = " h t t p : / / s c h e m a s . m i c r o s o f t . c o m / o f f i c e / d r a w i n g / 2 0 1 5 / 9 / 8 / c h a r t e x "   x m l n s : c x 2 = " h t t p : / / s c h e m a s . m i c r o s o f t . c o m / o f f i c e / d r a w i n g / 2 0 1 5 / 1 0 / 2 1 / c h a r t e x "   x m l n s : c x 3 = " h t t p : / / s c h e m a s . m i c r o s o f t . c o m / o f f i c e / d r a w i n g / 2 0 1 6 / 5 / 9 / c h a r t e x "   x m l n s : c x 4 = " h t t p : / / s c h e m a s . m i c r o s o f t . c o m / o f f i c e / d r a w i n g / 2 0 1 6 / 5 / 1 0 / c h a r t e x "   x m l n s : c x 5 = " h t t p : / / s c h e m a s . m i c r o s o f t . c o m / o f f i c e / d r a w i n g / 2 0 1 6 / 5 / 1 1 / c h a r t e x "   x m l n s : c x 6 = " h t t p : / / s c h e m a s . m i c r o s o f t . c o m / o f f i c e / d r a w i n g / 2 0 1 6 / 5 / 1 2 / c h a r t e x "   x m l n s : c x 7 = " h t t p : / / s c h e m a s . m i c r o s o f t . c o m / o f f i c e / d r a w i n g / 2 0 1 6 / 5 / 1 3 / c h a r t e x "   x m l n s : c x 8 = " h t t p : / / s c h e m a s . m i c r o s o f t . c o m / o f f i c e / d r a w i n g / 2 0 1 6 / 5 / 1 4 / c h a r t e x "   x m l n s : m c = " h t t p : / / s c h e m a s . o p e n x m l f o r m a t s . o r g / m a r k u p - c o m p a t i b i l i t y / 2 0 0 6 "   x m l n s : a i n k = " h t t p : / / s c h e m a s . m i c r o s o f t . c o m / o f f i c e / d r a w i n g / 2 0 1 6 / i n k "   x m l n s : a m 3 d = " h t t p : / / s c h e m a s . m i c r o s o f t . c o m / o f f i c e / d r a w i n g / 2 0 1 7 / m o d e l 3 d "   x m l n s : o = " u r n : s c h e m a s - m i c r o s o f t - c o m : o f f i c e : o f f i c e "   x m l n s : o e l = " h t t p : / / s c h e m a s . m i c r o s o f t . c o m / o f f i c e / 2 0 1 9 / e x t l s t "   x m l n s : r = " h t t p : / / s c h e m a s . o p e n x m l f o r m a t s . o r g / o f f i c e D o c u m e n t / 2 0 0 6 / r e l a t i o n s h i p s "   x m l n s : m = " h t t p : / / s c h e m a s . o p e n x m l f o r m a t s . o r g / o f f i c e D o c u m e n t / 2 0 0 6 / m a t h "   x m l n s : v = " u r n : s c h e m a s - m i c r o s o f t - c o m : v m l "   x m l n s : w p 1 4 = " h t t p : / / s c h e m a s . m i c r o s o f t . c o m / o f f i c e / w o r d / 2 0 1 0 / w o r d p r o c e s s i n g D r a w i n g "   x m l n s : w p = " h t t p : / / s c h e m a s . o p e n x m l f o r m a t s . o r g / d r a w i n g m l / 2 0 0 6 / w o r d p r o c e s s i n g D r a w i n g "   x m l n s : w 1 0 = " u r n : s c h e m a s - m i c r o s o f t - c o m : o f f i c e : w o r d "   x m l n s : w = " h t t p : / / s c h e m a s . o p e n x m l f o r m a t s . o r g / w o r d p r o c e s s i n g m l / 2 0 0 6 / m a i n "   x m l n s : w 1 4 = " h t t p : / / s c h e m a s . m i c r o s o f t . c o m / o f f i c e / w o r d / 2 0 1 0 / w o r d m l "   x m l n s : w 1 5 = " h t t p : / / s c h e m a s . m i c r o s o f t . c o m / o f f i c e / w o r d / 2 0 1 2 / w o r d m l "   x m l n s : w 1 6 c e x = " h t t p : / / s c h e m a s . m i c r o s o f t . c o m / o f f i c e / w o r d / 2 0 1 8 / w o r d m l / c e x "   x m l n s : w 1 6 c i d = " h t t p : / / s c h e m a s . m i c r o s o f t . c o m / o f f i c e / w o r d / 2 0 1 6 / w o r d m l / c i d "   x m l n s : w 1 6 = " h t t p : / / s c h e m a s . m i c r o s o f t . c o m / o f f i c e / w o r d / 2 0 1 8 / w o r d m l "   x m l n s : w 1 6 d u = " h t t p : / / s c h e m a s . m i c r o s o f t . c o m / o f f i c e / w o r d / 2 0 2 3 / w o r d m l / w o r d 1 6 d u "   x m l n s : w 1 6 s d t d h = " h t t p : / / s c h e m a s . m i c r o s o f t . c o m / o f f i c e / w o r d / 2 0 2 0 / w o r d m l / s d t d a t a h a s h "   x m l n s : w 1 6 s d t f l = " h t t p : / / s c h e m a s . m i c r o s o f t . c o m / o f f i c e / w o r d / 2 0 2 4 / w o r d m l / s d t f o r m a t l o c k "   x m l n s : w 1 6 s e = " h t t p : / / s c h e m a s . m i c r o s o f t . c o m / o f f i c e / w o r d / 2 0 1 5 / w o r d m l / s y m e x "   x m l n s : w p g = " h t t p : / / s c h e m a s . m i c r o s o f t . c o m / o f f i c e / w o r d / 2 0 1 0 / w o r d p r o c e s s i n g G r o u p "   x m l n s : w p i = " h t t p : / / s c h e m a s . m i c r o s o f t . c o m / o f f i c e / w o r d / 2 0 1 0 / w o r d p r o c e s s i n g I n k "   x m l n s : w n e = " h t t p : / / s c h e m a s . m i c r o s o f t . c o m / o f f i c e / w o r d / 2 0 0 6 / w o r d m l "   x m l n s : w p s = " h t t p : / / s c h e m a s . m i c r o s o f t . c o m / o f f i c e / w o r d / 2 0 1 0 / w o r d p r o c e s s i n g S h a p e "   m c : I g n o r a b l e = " w 1 4   w 1 5   w 1 6 s e   w 1 6 c i d   w 1 6   w 1 6 c e x   w 1 6 s d t d h   w 1 6 s d t f l   w 1 6 d u   w p 1 4 " & g t ; & l t ; w : b o d y & g t ; & l t ; w : p   w 1 4 : p a r a I d = " 6 E 4 6 3 0 F 0 "   w 1 4 : t e x t I d = " 3 1 6 1 1 B 4 9 "   w : r s i d R = " 0 0 E E 3 B 7 5 "   w : r s i d R D e f a u l t = " 0 0 E E 3 B 7 5 " & g t ; & l t ; w : p P r & g t ; & l t ; w : s p a c i n g   w : a f t e r = " 0 "   w : l i n e = " 2 4 0 "   w : l i n e R u l e = " a u t o " / & g t ; & l t ; w : j c   w : v a l = " r i g h t " / & g t ; & l t ; / w : p P r & g t ; & l t ; w : r & g t ; & l t ; w : r P r & g t ; & l t ; w : r F o n t s   w : a s c i i = " S e g o e   U I "   w : h A n s i = " S e g o e   U I "   w : c s = " S e g o e   U I " / & g t ; & l t ; w : s z   w : v a l = " 1 6 " / & g t ; & l t ; w : s z C s   w : v a l = " 1 6 " / & g t ; & l t ; / w : r P r & g t ; & l t ; w : t & g t ; P r o f i t _ I t e m L e d g E n t r y & l t ; / w : t & g t ; & l t ; / w : r & g t ; & l t ; / w : p & g t ; & l t ; w : s e c t P r   w : r s i d R = " 0 0 0 0 0 0 0 0 " & g t ; & l t ; w : p g S z   w : w = " 1 2 2 4 0 "   w : h = " 1 5 8 4 0 " / & g t ; & l t ; w : p g M a r   w : t o p = " 1 4 4 0 "   w : r i g h t = " 1 4 4 0 "   w : b o t t o m = " 1 4 4 0 "   w : l e f t = " 1 4 4 0 "   w : h e a d e r = " 7 2 0 "   w : f o o t e r = " 7 2 0 "   w : g u t t e r = " 0 " / & g t ; & l t ; w : c o l s   w : s p a c e = " 7 2 0 " / & g t ; & l t ; / w : s e c t P r & g t ; & l t ; / w : b o d y & g t ; & l t ; / w : d o c u m e n t & g t ; & l t ; / p k g : x m l D a t a & g t ; & l t ; / p k g : p a r t & g t ; & l t ; p k g : p a r t   p k g : n a m e = " / w o r d / _ r e l s / d o c u m e n t . x m l . r e l s "   p k g : c o n t e n t T y p e = " a p p l i c a t i o n / v n d . o p e n x m l f o r m a t s - p a c k a g e . r e l a t i o n s h i p s + x m l "   p k g : p a d d i n g = " 2 5 6 " & g t ; & l t ; p k g : x m l D a t a & g t ; & l t ; R e l a t i o n s h i p s   x m l n s = " h t t p : / / s c h e m a s . o p e n x m l f o r m a t s . o r g / p a c k a g e / 2 0 0 6 / r e l a t i o n s h i p s " & g t ; & l t ; R e l a t i o n s h i p   I d = " r I d 1 "   T y p e = " h t t p : / / s c h e m a s . o p e n x m l f o r m a t s . o r g / o f f i c e D o c u m e n t / 2 0 0 6 / r e l a t i o n s h i p s / s t y l e s "   T a r g e t = " s t y l e s . x m l " / & g t ; & l t ; / R e l a t i o n s h i p s & g t ; & l t ; / p k g : x m l D a t a & g t ; & l t ; / p k g : p a r t & g t ; & l t ; p k g : p a r t   p k g : n a m e = " / w o r d / s t y l e s . x m l "   p k g : c o n t e n t T y p e = " a p p l i c a t i o n / v n d . o p e n x m l f o r m a t s - o f f i c e d o c u m e n t . w o r d p r o c e s s i n g m l . s t y l e s + x m l " & g t ; & l t ; p k g : x m l D a t a & g t ; & l t ; w : s t y l e s   x m l n s : m c = " h t t p : / / s c h e m a s . o p e n x m l f o r m a t s . o r g / m a r k u p - c o m p a t i b i l i t y / 2 0 0 6 "   x m l n s : r = " h t t p : / / s c h e m a s . o p e n x m l f o r m a t s . o r g / o f f i c e D o c u m e n t / 2 0 0 6 / r e l a t i o n s h i p s "   x m l n s : w = " h t t p : / / s c h e m a s . o p e n x m l f o r m a t s . o r g / w o r d p r o c e s s i n g m l / 2 0 0 6 / m a i n "   x m l n s : w 1 4 = " h t t p : / / s c h e m a s . m i c r o s o f t . c o m / o f f i c e / w o r d / 2 0 1 0 / w o r d m l "   x m l n s : w 1 5 = " h t t p : / / s c h e m a s . m i c r o s o f t . c o m / o f f i c e / w o r d / 2 0 1 2 / w o r d m l "   x m l n s : w 1 6 c e x = " h t t p : / / s c h e m a s . m i c r o s o f t . c o m / o f f i c e / w o r d / 2 0 1 8 / w o r d m l / c e x "   x m l n s : w 1 6 c i d = " h t t p : / / s c h e m a s . m i c r o s o f t . c o m / o f f i c e / w o r d / 2 0 1 6 / w o r d m l / c i d "   x m l n s : w 1 6 = " h t t p : / / s c h e m a s . m i c r o s o f t . c o m / o f f i c e / w o r d / 2 0 1 8 / w o r d m l "   x m l n s : w 1 6 d u = " h t t p : / / s c h e m a s . m i c r o s o f t . c o m / o f f i c e / w o r d / 2 0 2 3 / w o r d m l / w o r d 1 6 d u "   x m l n s : w 1 6 s d t d h = " h t t p : / / s c h e m a s . m i c r o s o f t . c o m / o f f i c e / w o r d / 2 0 2 0 / w o r d m l / s d t d a t a h a s h "   x m l n s : w 1 6 s d t f l = " h t t p : / / s c h e m a s . m i c r o s o f t . c o m / o f f i c e / w o r d / 2 0 2 4 / w o r d m l / s d t f o r m a t l o c k "   x m l n s : w 1 6 s e = " h t t p : / / s c h e m a s . m i c r o s o f t . c o m / o f f i c e / w o r d / 2 0 1 5 / w o r d m l / s y m e x "   m c : I g n o r a b l e = " w 1 4   w 1 5   w 1 6 s e   w 1 6 c i d   w 1 6   w 1 6 c e x   w 1 6 s d t d h   w 1 6 s d t f l   w 1 6 d u " & g t ; & l t ; w : d o c D e f a u l t s & g t ; & l t ; w : r P r D e f a u l t & g t ; & l t ; w : r P r & g t ; & l t ; w : r F o n t s   w : a s c i i T h e m e = " m i n o r H A n s i "   w : e a s t A s i a T h e m e = " m i n o r E a s t A s i a "   w : h A n s i T h e m e = " m i n o r H A n s i "   w : c s t h e m e = " m i n o r B i d i " / & g t ; & l t ; w : k e r n   w : v a l = " 2 " / & g t ; & l t ; w : s z   w : v a l = " 2 4 " / & g t ; & l t ; w : s z C s   w : v a l = " 2 4 " / & g t ; & l t ; w : l a n g   w : v a l = " e n - A U "   w : e a s t A s i a = " z h - C N "   w : b i d i = " a r - S A " / & g t ; & l t ; w 1 4 : l i g a t u r e s   w 1 4 : v a l = " s t a n d a r d C o n t e x t u a l " / & g t ; & l t ; / w : r P r & g t ; & l t ; / w : r P r D e f a u l t & g t ; & l t ; w : p P r D e f a u l t & g t ; & l t ; w : p P r & g t ; & l t ; w : s p a c i n g   w : a f t e r = " 1 6 0 "   w : l i n e = " 2 7 8 "   w : l i n e R u l e = " a u t o " / & g t ; & l t ; / w : p P r & g t ; & l t ; / w : p P r D e f a u l t & g t ; & l t ; / w : d o c D e f a u l t s & g t ; & l t ; w : s t y l e   w : t y p e = " p a r a g r a p h "   w : d e f a u l t = " 1 "   w : s t y l e I d = " N o r m a l " & g t ; & l t ; w : n a m e   w : v a l = " N o r m a l " / & g t ; & l t ; w : q F o r m a t / & g t ; & l t ; / w : s t y l e & g t ; & l t ; w : s t y l e   w : t y p e = " c h a r a c t e r "   w : d e f a u l t = " 1 "   w : s t y l e I d = " D e f a u l t P a r a g r a p h F o n t " & g t ; & l t ; w : n a m e   w : v a l = " D e f a u l t   P a r a g r a p h   F o n t " / & g t ; & l t ; w : u i P r i o r i t y   w : v a l = " 1 " / & g t ; & l t ; w : s e m i H i d d e n / & g t ; & l t ; w : u n h i d e W h e n U s e d / & g t ; & l t ; / w : s t y l e & g t ; & l t ; w : s t y l e   w : t y p e = " t a b l e "   w : d e f a u l t = " 1 "   w : s t y l e I d = " T a b l e N o r m a l " & g t ; & l t ; w : n a m e   w : v a l = " N o r m a l   T a b l e " / & g t ; & l t ; w : u i P r i o r i t y   w : v a l = " 9 9 " / & g t ; & l t ; w : s e m i H i d d e n / & g t ; & l t ; w : u n h i d e W h e n U s e d / & g t ; & l t ; w : t b l P r & g t ; & l t ; w : t b l I n d   w : w = " 0 "   w : t y p e = " d x a " / & g t ; & l t ; w : t b l C e l l M a r & g t ; & l t ; w : t o p   w : w = " 0 "   w : t y p e = " d x a " / & g t ; & l t ; w : l e f t   w : w = " 1 0 8 "   w : t y p e = " d x a " / & g t ; & l t ; w : b o t t o m   w : w = " 0 "   w : t y p e = " d x a " / & g t ; & l t ; w : r i g h t   w : w = " 1 0 8 "   w : t y p e = " d x a " / & g t ; & l t ; / w : t b l C e l l M a r & g t ; & l t ; / w : t b l P r & g t ; & l t ; / w : s t y l e & g t ; & l t ; w : s t y l e   w : t y p e = " n u m b e r i n g "   w : d e f a u l t = " 1 "   w : s t y l e I d = " N o L i s t " & g t ; & l t ; w : n a m e   w : v a l = " N o   L i s t " / & g t ; & l t ; w : u i P r i o r i t y   w : v a l = " 9 9 " / & g t ; & l t ; w : s e m i H i d d e n / & g t ; & l t ; w : u n h i d e W h e n U s e d / & g t ; & l t ; / w : s t y l e & g t ; & l t ; / w : s t y l e s & g t ; & l t ; / p k g : x m l D a t a & g t ; & l t ; / p k g : p a r t & g t ; & l t ; p k g : p a r t   p k g : n a m e = " / d o c M e t a d a t a / L a b e l I n f o . x m l "   p k g : c o n t e n t T y p e = " a p p l i c a t i o n / v n d . m s - o f f i c e . c l a s s i f i c a t i o n l a b e l s + x m l " & g t ; & l t ; p k g : x m l D a t a & g t ; & l t ; c l b l : l a b e l L i s t   x m l n s : c l b l = " h t t p : / / s c h e m a s . m i c r o s o f t . c o m / o f f i c e / 2 0 2 0 / m i p L a b e l M e t a d a t a " & g t ; & l t ; c l b l : l a b e l   i d = " { 8 5 c a 8 a f 4 - 7 6 3 a - 4 5 c 2 - 8 0 a e - a 5 c a 1 b 8 0 b d d c } "   e n a b l e d = " 1 "   m e t h o d = " S t a n d a r d "   s i t e I d = " { 0 6 c d a f 0 9 - 1 4 f 0 - 4 c d 1 - 8 a c 0 - 7 b f e d 7 0 7 a 8 2 c } "   c o n t e n t B i t s = " 0 "   r e m o v e d = " 0 " / & g t ; & l t ; / c l b l : l a b e l L i s t & g t ; & l t ; / p k g : x m l D a t a & g t ; & l t ; / p k g : p a r t & g t ; & l t ; / p k g : p a c k a g e & g t ; - 
- < / P r o f i t _ I t e m L e d g E n t r y > - 
-                 < S a l e s A m t A c t u a l _ I t e m L e d g E n t r y > & l t ; ? x m l   v e r s i o n = " 1 . 0 "   s t a n d a l o n e = " y e s " ? & g t ; - 
- & l t ; ? m s o - a p p l i c a t i o n   p r o g i d = " W o r d . D o c u m e n t " ? & g t ; - 
- & l t ; p k g : p a c k a g e   x m l n s : p k g = " h t t p : / / s c h e m a s . m i c r o s o f t . c o m / o f f i c e / 2 0 0 6 / x m l P a c k a g e " & g t ; & l t ; p k g : p a r t   p k g : n a m e = " / _ r e l s / . r e l s "   p k g : c o n t e n t T y p e = " a p p l i c a t i o n / v n d . o p e n x m l f o r m a t s - p a c k a g e . r e l a t i o n s h i p s + x m l "   p k g : p a d d i n g = " 5 1 2 " & g t ; & l t ; p k g : x m l D a t a & g t ; & l t ; R e l a t i o n s h i p s   x m l n s = " h t t p : / / s c h e m a s . o p e n x m l f o r m a t s . o r g / p a c k a g e / 2 0 0 6 / r e l a t i o n s h i p s " & g t ; & l t ; R e l a t i o n s h i p   I d = " r I d 2 "   T y p e = " h t t p : / / s c h e m a s . m i c r o s o f t . c o m / o f f i c e / 2 0 2 0 / 0 2 / r e l a t i o n s h i p s / c l a s s i f i c a t i o n l a b e l s "   T a r g e t = " d o c M e t a d a t a / L a b e l I n f o . x m l " / & g t ; & l t ; R e l a t i o n s h i p   I d = " r I d 1 "   T y p e = " h t t p : / / s c h e m a s . o p e n x m l f o r m a t s . o r g / o f f i c e D o c u m e n t / 2 0 0 6 / r e l a t i o n s h i p s / o f f i c e D o c u m e n t "   T a r g e t = " w o r d / d o c u m e n t . x m l " / & g t ; & l t ; / R e l a t i o n s h i p s & g t ; & l t ; / p k g : x m l D a t a & g t ; & l t ; / p k g : p a r t & g t ; & l t ; p k g : p a r t   p k g : n a m e = " / w o r d / d o c u m e n t . x m l "   p k g : c o n t e n t T y p e = " a p p l i c a t i o n / v n d . o p e n x m l f o r m a t s - o f f i c e d o c u m e n t . w o r d p r o c e s s i n g m l . d o c u m e n t . m a i n + x m l " & g t ; & l t ; p k g : x m l D a t a & g t ; & l t ; w : d o c u m e n t   x m l n s : w p c = " h t t p : / / s c h e m a s . m i c r o s o f t . c o m / o f f i c e / w o r d / 2 0 1 0 / w o r d p r o c e s s i n g C a n v a s "   x m l n s : c x = " h t t p : / / s c h e m a s . m i c r o s o f t . c o m / o f f i c e / d r a w i n g / 2 0 1 4 / c h a r t e x "   x m l n s : c x 1 = " h t t p : / / s c h e m a s . m i c r o s o f t . c o m / o f f i c e / d r a w i n g / 2 0 1 5 / 9 / 8 / c h a r t e x "   x m l n s : c x 2 = " h t t p : / / s c h e m a s . m i c r o s o f t . c o m / o f f i c e / d r a w i n g / 2 0 1 5 / 1 0 / 2 1 / c h a r t e x "   x m l n s : c x 3 = " h t t p : / / s c h e m a s . m i c r o s o f t . c o m / o f f i c e / d r a w i n g / 2 0 1 6 / 5 / 9 / c h a r t e x "   x m l n s : c x 4 = " h t t p : / / s c h e m a s . m i c r o s o f t . c o m / o f f i c e / d r a w i n g / 2 0 1 6 / 5 / 1 0 / c h a r t e x "   x m l n s : c x 5 = " h t t p : / / s c h e m a s . m i c r o s o f t . c o m / o f f i c e / d r a w i n g / 2 0 1 6 / 5 / 1 1 / c h a r t e x "   x m l n s : c x 6 = " h t t p : / / s c h e m a s . m i c r o s o f t . c o m / o f f i c e / d r a w i n g / 2 0 1 6 / 5 / 1 2 / c h a r t e x "   x m l n s : c x 7 = " h t t p : / / s c h e m a s . m i c r o s o f t . c o m / o f f i c e / d r a w i n g / 2 0 1 6 / 5 / 1 3 / c h a r t e x "   x m l n s : c x 8 = " h t t p : / / s c h e m a s . m i c r o s o f t . c o m / o f f i c e / d r a w i n g / 2 0 1 6 / 5 / 1 4 / c h a r t e x "   x m l n s : m c = " h t t p : / / s c h e m a s . o p e n x m l f o r m a t s . o r g / m a r k u p - c o m p a t i b i l i t y / 2 0 0 6 "   x m l n s : a i n k = " h t t p : / / s c h e m a s . m i c r o s o f t . c o m / o f f i c e / d r a w i n g / 2 0 1 6 / i n k "   x m l n s : a m 3 d = " h t t p : / / s c h e m a s . m i c r o s o f t . c o m / o f f i c e / d r a w i n g / 2 0 1 7 / m o d e l 3 d "   x m l n s : o = " u r n : s c h e m a s - m i c r o s o f t - c o m : o f f i c e : o f f i c e "   x m l n s : o e l = " h t t p : / / s c h e m a s . m i c r o s o f t . c o m / o f f i c e / 2 0 1 9 / e x t l s t "   x m l n s : r = " h t t p : / / s c h e m a s . o p e n x m l f o r m a t s . o r g / o f f i c e D o c u m e n t / 2 0 0 6 / r e l a t i o n s h i p s "   x m l n s : m = " h t t p : / / s c h e m a s . o p e n x m l f o r m a t s . o r g / o f f i c e D o c u m e n t / 2 0 0 6 / m a t h "   x m l n s : v = " u r n : s c h e m a s - m i c r o s o f t - c o m : v m l "   x m l n s : w p 1 4 = " h t t p : / / s c h e m a s . m i c r o s o f t . c o m / o f f i c e / w o r d / 2 0 1 0 / w o r d p r o c e s s i n g D r a w i n g "   x m l n s : w p = " h t t p : / / s c h e m a s . o p e n x m l f o r m a t s . o r g / d r a w i n g m l / 2 0 0 6 / w o r d p r o c e s s i n g D r a w i n g "   x m l n s : w 1 0 = " u r n : s c h e m a s - m i c r o s o f t - c o m : o f f i c e : w o r d "   x m l n s : w = " h t t p : / / s c h e m a s . o p e n x m l f o r m a t s . o r g / w o r d p r o c e s s i n g m l / 2 0 0 6 / m a i n "   x m l n s : w 1 4 = " h t t p : / / s c h e m a s . m i c r o s o f t . c o m / o f f i c e / w o r d / 2 0 1 0 / w o r d m l "   x m l n s : w 1 5 = " h t t p : / / s c h e m a s . m i c r o s o f t . c o m / o f f i c e / w o r d / 2 0 1 2 / w o r d m l "   x m l n s : w 1 6 c e x = " h t t p : / / s c h e m a s . m i c r o s o f t . c o m / o f f i c e / w o r d / 2 0 1 8 / w o r d m l / c e x "   x m l n s : w 1 6 c i d = " h t t p : / / s c h e m a s . m i c r o s o f t . c o m / o f f i c e / w o r d / 2 0 1 6 / w o r d m l / c i d "   x m l n s : w 1 6 = " h t t p : / / s c h e m a s . m i c r o s o f t . c o m / o f f i c e / w o r d / 2 0 1 8 / w o r d m l "   x m l n s : w 1 6 d u = " h t t p : / / s c h e m a s . m i c r o s o f t . c o m / o f f i c e / w o r d / 2 0 2 3 / w o r d m l / w o r d 1 6 d u "   x m l n s : w 1 6 s d t d h = " h t t p : / / s c h e m a s . m i c r o s o f t . c o m / o f f i c e / w o r d / 2 0 2 0 / w o r d m l / s d t d a t a h a s h "   x m l n s : w 1 6 s d t f l = " h t t p : / / s c h e m a s . m i c r o s o f t . c o m / o f f i c e / w o r d / 2 0 2 4 / w o r d m l / s d t f o r m a t l o c k "   x m l n s : w 1 6 s e = " h t t p : / / s c h e m a s . m i c r o s o f t . c o m / o f f i c e / w o r d / 2 0 1 5 / w o r d m l / s y m e x "   x m l n s : w p g = " h t t p : / / s c h e m a s . m i c r o s o f t . c o m / o f f i c e / w o r d / 2 0 1 0 / w o r d p r o c e s s i n g G r o u p "   x m l n s : w p i = " h t t p : / / s c h e m a s . m i c r o s o f t . c o m / o f f i c e / w o r d / 2 0 1 0 / w o r d p r o c e s s i n g I n k "   x m l n s : w n e = " h t t p : / / s c h e m a s . m i c r o s o f t . c o m / o f f i c e / w o r d / 2 0 0 6 / w o r d m l "   x m l n s : w p s = " h t t p : / / s c h e m a s . m i c r o s o f t . c o m / o f f i c e / w o r d / 2 0 1 0 / w o r d p r o c e s s i n g S h a p e "   m c : I g n o r a b l e = " w 1 4   w 1 5   w 1 6 s e   w 1 6 c i d   w 1 6   w 1 6 c e x   w 1 6 s d t d h   w 1 6 s d t f l   w 1 6 d u   w p 1 4 " & g t ; & l t ; w : b o d y & g t ; & l t ; w : p   w 1 4 : p a r a I d = " 6 A 5 7 C 3 2 B "   w 1 4 : t e x t I d = " 3 6 3 9 0 7 C 2 "   w : r s i d R = " 0 0 2 7 0 C 6 D "   w : r s i d R D e f a u l t = " 0 0 2 7 0 C 6 D " & g t ; & l t ; w : p P r & g t ; & l t ; w : s p a c i n g   w : a f t e r = " 0 "   w : l i n e = " 2 4 0 "   w : l i n e R u l e = " a u t o " / & g t ; & l t ; / w : p P r & g t ; & l t ; w : r & g t ; & l t ; w : r P r & g t ; & l t ; w : r F o n t s   w : a s c i i = " S e g o e   U I "   w : h A n s i = " S e g o e   U I "   w : c s = " S e g o e   U I " / & g t ; & l t ; w : s z   w : v a l = " 1 6 " / & g t ; & l t ; w : s z C s   w : v a l = " 1 6 " / & g t ; & l t ; / w : r P r & g t ; & l t ; w : t & g t ; S a l e s A m t A c t u a l _ I t e m L e d g E n t r y & l t ; / w : t & g t ; & l t ; / w : r & g t ; & l t ; / w : p & g t ; & l t ; w : s e c t P r   w : r s i d R = " 0 0 0 0 0 0 0 0 " & g t ; & l t ; w : p g S z   w : w = " 1 2 2 4 0 "   w : h = " 1 5 8 4 0 " / & g t ; & l t ; w : p g M a r   w : t o p = " 1 4 4 0 "   w : r i g h t = " 1 4 4 0 "   w : b o t t o m = " 1 4 4 0 "   w : l e f t = " 1 4 4 0 "   w : h e a d e r = " 7 2 0 "   w : f o o t e r = " 7 2 0 "   w : g u t t e r = " 0 " / & g t ; & l t ; w : c o l s   w : s p a c e = " 7 2 0 " / & g t ; & l t ; / w : s e c t P r & g t ; & l t ; / w : b o d y & g t ; & l t ; / w : d o c u m e n t & g t ; & l t ; / p k g : x m l D a t a & g t ; & l t ; / p k g : p a r t & g t ; & l t ; p k g : p a r t   p k g : n a m e = " / w o r d / _ r e l s / d o c u m e n t . x m l . r e l s "   p k g : c o n t e n t T y p e = " a p p l i c a t i o n / v n d . o p e n x m l f o r m a t s - p a c k a g e . r e l a t i o n s h i p s + x m l "   p k g : p a d d i n g = " 2 5 6 " & g t ; & l t ; p k g : x m l D a t a & g t ; & l t ; R e l a t i o n s h i p s   x m l n s = " h t t p : / / s c h e m a s . o p e n x m l f o r m a t s . o r g / p a c k a g e / 2 0 0 6 / r e l a t i o n s h i p s " & g t ; & l t ; R e l a t i o n s h i p   I d = " r I d 1 "   T y p e = " h t t p : / / s c h e m a s . o p e n x m l f o r m a t s . o r g / o f f i c e D o c u m e n t / 2 0 0 6 / r e l a t i o n s h i p s / s t y l e s "   T a r g e t = " s t y l e s . x m l " / & g t ; & l t ; / R e l a t i o n s h i p s & g t ; & l t ; / p k g : x m l D a t a & g t ; & l t ; / p k g : p a r t & g t ; & l t ; p k g : p a r t   p k g : n a m e = " / w o r d / s t y l e s . x m l "   p k g : c o n t e n t T y p e = " a p p l i c a t i o n / v n d . o p e n x m l f o r m a t s - o f f i c e d o c u m e n t . w o r d p r o c e s s i n g m l . s t y l e s + x m l " & g t ; & l t ; p k g : x m l D a t a & g t ; & l t ; w : s t y l e s   x m l n s : m c = " h t t p : / / s c h e m a s . o p e n x m l f o r m a t s . o r g / m a r k u p - c o m p a t i b i l i t y / 2 0 0 6 "   x m l n s : r = " h t t p : / / s c h e m a s . o p e n x m l f o r m a t s . o r g / o f f i c e D o c u m e n t / 2 0 0 6 / r e l a t i o n s h i p s "   x m l n s : w = " h t t p : / / s c h e m a s . o p e n x m l f o r m a t s . o r g / w o r d p r o c e s s i n g m l / 2 0 0 6 / m a i n "   x m l n s : w 1 4 = " h t t p : / / s c h e m a s . m i c r o s o f t . c o m / o f f i c e / w o r d / 2 0 1 0 / w o r d m l "   x m l n s : w 1 5 = " h t t p : / / s c h e m a s . m i c r o s o f t . c o m / o f f i c e / w o r d / 2 0 1 2 / w o r d m l "   x m l n s : w 1 6 c e x = " h t t p : / / s c h e m a s . m i c r o s o f t . c o m / o f f i c e / w o r d / 2 0 1 8 / w o r d m l / c e x "   x m l n s : w 1 6 c i d = " h t t p : / / s c h e m a s . m i c r o s o f t . c o m / o f f i c e / w o r d / 2 0 1 6 / w o r d m l / c i d "   x m l n s : w 1 6 = " h t t p : / / s c h e m a s . m i c r o s o f t . c o m / o f f i c e / w o r d / 2 0 1 8 / w o r d m l "   x m l n s : w 1 6 d u = " h t t p : / / s c h e m a s . m i c r o s o f t . c o m / o f f i c e / w o r d / 2 0 2 3 / w o r d m l / w o r d 1 6 d u "   x m l n s : w 1 6 s d t d h = " h t t p : / / s c h e m a s . m i c r o s o f t . c o m / o f f i c e / w o r d / 2 0 2 0 / w o r d m l / s d t d a t a h a s h "   x m l n s : w 1 6 s d t f l = " h t t p : / / s c h e m a s . m i c r o s o f t . c o m / o f f i c e / w o r d / 2 0 2 4 / w o r d m l / s d t f o r m a t l o c k "   x m l n s : w 1 6 s e = " h t t p : / / s c h e m a s . m i c r o s o f t . c o m / o f f i c e / w o r d / 2 0 1 5 / w o r d m l / s y m e x "   m c : I g n o r a b l e = " w 1 4   w 1 5   w 1 6 s e   w 1 6 c i d   w 1 6   w 1 6 c e x   w 1 6 s d t d h   w 1 6 s d t f l   w 1 6 d u " & g t ; & l t ; w : d o c D e f a u l t s & g t ; & l t ; w : r P r D e f a u l t & g t ; & l t ; w : r P r & g t ; & l t ; w : r F o n t s   w : a s c i i T h e m e = " m i n o r H A n s i "   w : e a s t A s i a T h e m e = " m i n o r E a s t A s i a "   w : h A n s i T h e m e = " m i n o r H A n s i "   w : c s t h e m e = " m i n o r B i d i " / & g t ; & l t ; w : k e r n   w : v a l = " 2 " / & g t ; & l t ; w : s z   w : v a l = " 2 4 " / & g t ; & l t ; w : s z C s   w : v a l = " 2 4 " / & g t ; & l t ; w : l a n g   w : v a l = " e n - A U "   w : e a s t A s i a = " z h - C N "   w : b i d i = " a r - S A " / & g t ; & l t ; w 1 4 : l i g a t u r e s   w 1 4 : v a l = " s t a n d a r d C o n t e x t u a l " / & g t ; & l t ; / w : r P r & g t ; & l t ; / w : r P r D e f a u l t & g t ; & l t ; w : p P r D e f a u l t & g t ; & l t ; w : p P r & g t ; & l t ; w : s p a c i n g   w : a f t e r = " 1 6 0 "   w : l i n e = " 2 7 8 "   w : l i n e R u l e = " a u t o " / & g t ; & l t ; / w : p P r & g t ; & l t ; / w : p P r D e f a u l t & g t ; & l t ; / w : d o c D e f a u l t s & g t ; & l t ; w : s t y l e   w : t y p e = " p a r a g r a p h "   w : d e f a u l t = " 1 "   w : s t y l e I d = " N o r m a l " & g t ; & l t ; w : n a m e   w : v a l = " N o r m a l " / & g t ; & l t ; w : q F o r m a t / & g t ; & l t ; / w : s t y l e & g t ; & l t ; w : s t y l e   w : t y p e = " c h a r a c t e r "   w : d e f a u l t = " 1 "   w : s t y l e I d = " D e f a u l t P a r a g r a p h F o n t " & g t ; & l t ; w : n a m e   w : v a l = " D e f a u l t   P a r a g r a p h   F o n t " / & g t ; & l t ; w : u i P r i o r i t y   w : v a l = " 1 " / & g t ; & l t ; w : s e m i H i d d e n / & g t ; & l t ; w : u n h i d e W h e n U s e d / & g t ; & l t ; / w : s t y l e & g t ; & l t ; w : s t y l e   w : t y p e = " t a b l e "   w : d e f a u l t = " 1 "   w : s t y l e I d = " T a b l e N o r m a l " & g t ; & l t ; w : n a m e   w : v a l = " N o r m a l   T a b l e " / & g t ; & l t ; w : u i P r i o r i t y   w : v a l = " 9 9 " / & g t ; & l t ; w : s e m i H i d d e n / & g t ; & l t ; w : u n h i d e W h e n U s e d / & g t ; & l t ; w : t b l P r & g t ; & l t ; w : t b l I n d   w : w = " 0 "   w : t y p e = " d x a " / & g t ; & l t ; w : t b l C e l l M a r & g t ; & l t ; w : t o p   w : w = " 0 "   w : t y p e = " d x a " / & g t ; & l t ; w : l e f t   w : w = " 1 0 8 "   w : t y p e = " d x a " / & g t ; & l t ; w : b o t t o m   w : w = " 0 "   w : t y p e = " d x a " / & g t ; & l t ; w : r i g h t   w : w = " 1 0 8 "   w : t y p e = " d x a " / & g t ; & l t ; / w : t b l C e l l M a r & g t ; & l t ; / w : t b l P r & g t ; & l t ; / w : s t y l e & g t ; & l t ; w : s t y l e   w : t y p e = " n u m b e r i n g "   w : d e f a u l t = " 1 "   w : s t y l e I d = " N o L i s t " & g t ; & l t ; w : n a m e   w : v a l = " N o   L i s t " / & g t ; & l t ; w : u i P r i o r i t y   w : v a l = " 9 9 " / & g t ; & l t ; w : s e m i H i d d e n / & g t ; & l t ; w : u n h i d e W h e n U s e d / & g t ; & l t ; / w : s t y l e & g t ; & l t ; / w : s t y l e s & g t ; & l t ; / p k g : x m l D a t a & g t ; & l t ; / p k g : p a r t & g t ; & l t ; p k g : p a r t   p k g : n a m e = " / d o c M e t a d a t a / L a b e l I n f o . x m l "   p k g : c o n t e n t T y p e = " a p p l i c a t i o n / v n d . m s - o f f i c e . c l a s s i f i c a t i o n l a b e l s + x m l " & g t ; & l t ; p k g : x m l D a t a & g t ; & l t ; c l b l : l a b e l L i s t   x m l n s : c l b l = " h t t p : / / s c h e m a s . m i c r o s o f t . c o m / o f f i c e / 2 0 2 0 / m i p L a b e l M e t a d a t a " & g t ; & l t ; c l b l : l a b e l   i d = " { 8 5 c a 8 a f 4 - 7 6 3 a - 4 5 c 2 - 8 0 a e - a 5 c a 1 b 8 0 b d d c } "   e n a b l e d = " 1 "   m e t h o d = " S t a n d a r d "   s i t e I d = " { 0 6 c d a f 0 9 - 1 4 f 0 - 4 c d 1 - 8 a c 0 - 7 b f e d 7 0 7 a 8 2 c } "   c o n t e n t B i t s = " 0 "   r e m o v e d = " 0 " / & g t ; & l t ; / c l b l : l a b e l L i s t & g t ; & l t ; / p k g : x m l D a t a & g t ; & l t ; / p k g : p a r t & g t ; & l t ; / p k g : p a c k a g e & g t ; - 
- < / S a l e s A m t A c t u a l _ I t e m L e d g E n t r y > - 
-                 < S o u r c e N o _ I t e m L e d g E n t r y > & l t ; ? x m l   v e r s i o n = " 1 . 0 "   s t a n d a l o n e = " y e s " ? & g t ; - 
- & l t ; ? m s o - a p p l i c a t i o n   p r o g i d = " W o r d . D o c u m e n t " ? & g t ; - 
- & l t ; p k g : p a c k a g e   x m l n s : p k g = " h t t p : / / s c h e m a s . m i c r o s o f t . c o m / o f f i c e / 2 0 0 6 / x m l P a c k a g e " & g t ; & l t ; p k g : p a r t   p k g : n a m e = " / _ r e l s / . r e l s "   p k g : c o n t e n t T y p e = " a p p l i c a t i o n / v n d . o p e n x m l f o r m a t s - p a c k a g e . r e l a t i o n s h i p s + x m l "   p k g : p a d d i n g = " 5 1 2 " & g t ; & l t ; p k g : x m l D a t a & g t ; & l t ; R e l a t i o n s h i p s   x m l n s = " h t t p : / / s c h e m a s . o p e n x m l f o r m a t s . o r g / p a c k a g e / 2 0 0 6 / r e l a t i o n s h i p s " & g t ; & l t ; R e l a t i o n s h i p   I d = " r I d 2 "   T y p e = " h t t p : / / s c h e m a s . m i c r o s o f t . c o m / o f f i c e / 2 0 2 0 / 0 2 / r e l a t i o n s h i p s / c l a s s i f i c a t i o n l a b e l s "   T a r g e t = " d o c M e t a d a t a / L a b e l I n f o . x m l " / & g t ; & l t ; R e l a t i o n s h i p   I d = " r I d 1 "   T y p e = " h t t p : / / s c h e m a s . o p e n x m l f o r m a t s . o r g / o f f i c e D o c u m e n t / 2 0 0 6 / r e l a t i o n s h i p s / o f f i c e D o c u m e n t "   T a r g e t = " w o r d / d o c u m e n t . x m l " / & g t ; & l t ; / R e l a t i o n s h i p s & g t ; & l t ; / p k g : x m l D a t a & g t ; & l t ; / p k g : p a r t & g t ; & l t ; p k g : p a r t   p k g : n a m e = " / w o r d / d o c u m e n t . x m l "   p k g : c o n t e n t T y p e = " a p p l i c a t i o n / v n d . o p e n x m l f o r m a t s - o f f i c e d o c u m e n t . w o r d p r o c e s s i n g m l . d o c u m e n t . m a i n + x m l " & g t ; & l t ; p k g : x m l D a t a & g t ; & l t ; w : d o c u m e n t   x m l n s : w p c = " h t t p : / / s c h e m a s . m i c r o s o f t . c o m / o f f i c e / w o r d / 2 0 1 0 / w o r d p r o c e s s i n g C a n v a s "   x m l n s : c x = " h t t p : / / s c h e m a s . m i c r o s o f t . c o m / o f f i c e / d r a w i n g / 2 0 1 4 / c h a r t e x "   x m l n s : c x 1 = " h t t p : / / s c h e m a s . m i c r o s o f t . c o m / o f f i c e / d r a w i n g / 2 0 1 5 / 9 / 8 / c h a r t e x "   x m l n s : c x 2 = " h t t p : / / s c h e m a s . m i c r o s o f t . c o m / o f f i c e / d r a w i n g / 2 0 1 5 / 1 0 / 2 1 / c h a r t e x "   x m l n s : c x 3 = " h t t p : / / s c h e m a s . m i c r o s o f t . c o m / o f f i c e / d r a w i n g / 2 0 1 6 / 5 / 9 / c h a r t e x "   x m l n s : c x 4 = " h t t p : / / s c h e m a s . m i c r o s o f t . c o m / o f f i c e / d r a w i n g / 2 0 1 6 / 5 / 1 0 / c h a r t e x "   x m l n s : c x 5 = " h t t p : / / s c h e m a s . m i c r o s o f t . c o m / o f f i c e / d r a w i n g / 2 0 1 6 / 5 / 1 1 / c h a r t e x "   x m l n s : c x 6 = " h t t p : / / s c h e m a s . m i c r o s o f t . c o m / o f f i c e / d r a w i n g / 2 0 1 6 / 5 / 1 2 / c h a r t e x "   x m l n s : c x 7 = " h t t p : / / s c h e m a s . m i c r o s o f t . c o m / o f f i c e / d r a w i n g / 2 0 1 6 / 5 / 1 3 / c h a r t e x "   x m l n s : c x 8 = " h t t p : / / s c h e m a s . m i c r o s o f t . c o m / o f f i c e / d r a w i n g / 2 0 1 6 / 5 / 1 4 / c h a r t e x "   x m l n s : m c = " h t t p : / / s c h e m a s . o p e n x m l f o r m a t s . o r g / m a r k u p - c o m p a t i b i l i t y / 2 0 0 6 "   x m l n s : a i n k = " h t t p : / / s c h e m a s . m i c r o s o f t . c o m / o f f i c e / d r a w i n g / 2 0 1 6 / i n k "   x m l n s : a m 3 d = " h t t p : / / s c h e m a s . m i c r o s o f t . c o m / o f f i c e / d r a w i n g / 2 0 1 7 / m o d e l 3 d "   x m l n s : o = " u r n : s c h e m a s - m i c r o s o f t - c o m : o f f i c e : o f f i c e "   x m l n s : o e l = " h t t p : / / s c h e m a s . m i c r o s o f t . c o m / o f f i c e / 2 0 1 9 / e x t l s t "   x m l n s : r = " h t t p : / / s c h e m a s . o p e n x m l f o r m a t s . o r g / o f f i c e D o c u m e n t / 2 0 0 6 / r e l a t i o n s h i p s "   x m l n s : m = " h t t p : / / s c h e m a s . o p e n x m l f o r m a t s . o r g / o f f i c e D o c u m e n t / 2 0 0 6 / m a t h "   x m l n s : v = " u r n : s c h e m a s - m i c r o s o f t - c o m : v m l "   x m l n s : w p 1 4 = " h t t p : / / s c h e m a s . m i c r o s o f t . c o m / o f f i c e / w o r d / 2 0 1 0 / w o r d p r o c e s s i n g D r a w i n g "   x m l n s : w p = " h t t p : / / s c h e m a s . o p e n x m l f o r m a t s . o r g / d r a w i n g m l / 2 0 0 6 / w o r d p r o c e s s i n g D r a w i n g "   x m l n s : w 1 0 = " u r n : s c h e m a s - m i c r o s o f t - c o m : o f f i c e : w o r d "   x m l n s : w = " h t t p : / / s c h e m a s . o p e n x m l f o r m a t s . o r g / w o r d p r o c e s s i n g m l / 2 0 0 6 / m a i n "   x m l n s : w 1 4 = " h t t p : / / s c h e m a s . m i c r o s o f t . c o m / o f f i c e / w o r d / 2 0 1 0 / w o r d m l "   x m l n s : w 1 5 = " h t t p : / / s c h e m a s . m i c r o s o f t . c o m / o f f i c e / w o r d / 2 0 1 2 / w o r d m l "   x m l n s : w 1 6 c e x = " h t t p : / / s c h e m a s . m i c r o s o f t . c o m / o f f i c e / w o r d / 2 0 1 8 / w o r d m l / c e x "   x m l n s : w 1 6 c i d = " h t t p : / / s c h e m a s . m i c r o s o f t . c o m / o f f i c e / w o r d / 2 0 1 6 / w o r d m l / c i d "   x m l n s : w 1 6 = " h t t p : / / s c h e m a s . m i c r o s o f t . c o m / o f f i c e / w o r d / 2 0 1 8 / w o r d m l "   x m l n s : w 1 6 d u = " h t t p : / / s c h e m a s . m i c r o s o f t . c o m / o f f i c e / w o r d / 2 0 2 3 / w o r d m l / w o r d 1 6 d u "   x m l n s : w 1 6 s d t d h = " h t t p : / / s c h e m a s . m i c r o s o f t . c o m / o f f i c e / w o r d / 2 0 2 0 / w o r d m l / s d t d a t a h a s h "   x m l n s : w 1 6 s d t f l = " h t t p : / / s c h e m a s . m i c r o s o f t . c o m / o f f i c e / w o r d / 2 0 2 4 / w o r d m l / s d t f o r m a t l o c k "   x m l n s : w 1 6 s e = " h t t p : / / s c h e m a s . m i c r o s o f t . c o m / o f f i c e / w o r d / 2 0 1 5 / w o r d m l / s y m e x "   x m l n s : w p g = " h t t p : / / s c h e m a s . m i c r o s o f t . c o m / o f f i c e / w o r d / 2 0 1 0 / w o r d p r o c e s s i n g G r o u p "   x m l n s : w p i = " h t t p : / / s c h e m a s . m i c r o s o f t . c o m / o f f i c e / w o r d / 2 0 1 0 / w o r d p r o c e s s i n g I n k "   x m l n s : w n e = " h t t p : / / s c h e m a s . m i c r o s o f t . c o m / o f f i c e / w o r d / 2 0 0 6 / w o r d m l "   x m l n s : w p s = " h t t p : / / s c h e m a s . m i c r o s o f t . c o m / o f f i c e / w o r d / 2 0 1 0 / w o r d p r o c e s s i n g S h a p e "   m c : I g n o r a b l e = " w 1 4   w 1 5   w 1 6 s e   w 1 6 c i d   w 1 6   w 1 6 c e x   w 1 6 s d t d h   w 1 6 s d t f l   w 1 6 d u   w p 1 4 " & g t ; & l t ; w : b o d y & g t ; & l t ; w : p   w 1 4 : p a r a I d = " 0 D 4 E 6 3 2 4 "   w 1 4 : t e x t I d = " 4 E 9 4 1 7 F 5 "   w : r s i d R = " 0 0 4 5 1 8 D 8 "   w : r s i d R D e f a u l t = " 0 0 4 5 1 8 D 8 " & g t ; & l t ; w : p P r & g t ; & l t ; w : s p a c i n g   w : a f t e r = " 0 "   w : l i n e = " 2 4 0 "   w : l i n e R u l e = " a u t o " / & g t ; & l t ; / w : p P r & g t ; & l t ; w : r   w : r s i d R P r = " 0 0 9 3 6 B 0 9 " & g t ; & l t ; w : r P r & g t ; & l t ; w : r F o n t s   w : a s c i i = " S e g o e   U I "   w : h A n s i = " S e g o e   U I "   w : c s = " S e g o e   U I " / & g t ; & l t ; w : b / & g t ; & l t ; w : b C s / & g t ; & l t ; w : s z   w : v a l = " 1 6 " / & g t ; & l t ; w : s z C s   w : v a l = " 1 6 " / & g t ; & l t ; / w : r P r & g t ; & l t ; w : t & g t ; S o u r c e N o _ I t e m L e d g E n t r y & l t ; / w : t & g t ; & l t ; / w : r & g t ; & l t ; / w : p & g t ; & l t ; w : s e c t P r   w : r s i d R = " 0 0 0 0 0 0 0 0 " & g t ; & l t ; w : p g S z   w : w = " 1 2 2 4 0 "   w : h = " 1 5 8 4 0 " / & g t ; & l t ; w : p g M a r   w : t o p = " 1 4 4 0 "   w : r i g h t = " 1 4 4 0 "   w : b o t t o m = " 1 4 4 0 "   w : l e f t = " 1 4 4 0 "   w : h e a d e r = " 7 2 0 "   w : f o o t e r = " 7 2 0 "   w : g u t t e r = " 0 " / & g t ; & l t ; w : c o l s   w : s p a c e = " 7 2 0 " / & g t ; & l t ; / w : s e c t P r & g t ; & l t ; / w : b o d y & g t ; & l t ; / w : d o c u m e n t & g t ; & l t ; / p k g : x m l D a t a & g t ; & l t ; / p k g : p a r t & g t ; & l t ; p k g : p a r t   p k g : n a m e = " / w o r d / _ r e l s / d o c u m e n t . x m l . r e l s "   p k g : c o n t e n t T y p e = " a p p l i c a t i o n / v n d . o p e n x m l f o r m a t s - p a c k a g e . r e l a t i o n s h i p s + x m l "   p k g : p a d d i n g = " 2 5 6 " & g t ; & l t ; p k g : x m l D a t a & g t ; & l t ; R e l a t i o n s h i p s   x m l n s = " h t t p : / / s c h e m a s . o p e n x m l f o r m a t s . o r g / p a c k a g e / 2 0 0 6 / r e l a t i o n s h i p s " & g t ; & l t ; R e l a t i o n s h i p   I d = " r I d 1 "   T y p e = " h t t p : / / s c h e m a s . o p e n x m l f o r m a t s . o r g / o f f i c e D o c u m e n t / 2 0 0 6 / r e l a t i o n s h i p s / s t y l e s "   T a r g e t = " s t y l e s . x m l " / & g t ; & l t ; / R e l a t i o n s h i p s & g t ; & l t ; / p k g : x m l D a t a & g t ; & l t ; / p k g : p a r t & g t ; & l t ; p k g : p a r t   p k g : n a m e = " / w o r d / s t y l e s . x m l "   p k g : c o n t e n t T y p e = " a p p l i c a t i o n / v n d . o p e n x m l f o r m a t s - o f f i c e d o c u m e n t . w o r d p r o c e s s i n g m l . s t y l e s + x m l " & g t ; & l t ; p k g : x m l D a t a & g t ; & l t ; w : s t y l e s   x m l n s : m c = " h t t p : / / s c h e m a s . o p e n x m l f o r m a t s . o r g / m a r k u p - c o m p a t i b i l i t y / 2 0 0 6 "   x m l n s : r = " h t t p : / / s c h e m a s . o p e n x m l f o r m a t s . o r g / o f f i c e D o c u m e n t / 2 0 0 6 / r e l a t i o n s h i p s "   x m l n s : w = " h t t p : / / s c h e m a s . o p e n x m l f o r m a t s . o r g / w o r d p r o c e s s i n g m l / 2 0 0 6 / m a i n "   x m l n s : w 1 4 = " h t t p : / / s c h e m a s . m i c r o s o f t . c o m / o f f i c e / w o r d / 2 0 1 0 / w o r d m l "   x m l n s : w 1 5 = " h t t p : / / s c h e m a s . m i c r o s o f t . c o m / o f f i c e / w o r d / 2 0 1 2 / w o r d m l "   x m l n s : w 1 6 c e x = " h t t p : / / s c h e m a s . m i c r o s o f t . c o m / o f f i c e / w o r d / 2 0 1 8 / w o r d m l / c e x "   x m l n s : w 1 6 c i d = " h t t p : / / s c h e m a s . m i c r o s o f t . c o m / o f f i c e / w o r d / 2 0 1 6 / w o r d m l / c i d "   x m l n s : w 1 6 = " h t t p : / / s c h e m a s . m i c r o s o f t . c o m / o f f i c e / w o r d / 2 0 1 8 / w o r d m l "   x m l n s : w 1 6 d u = " h t t p : / / s c h e m a s . m i c r o s o f t . c o m / o f f i c e / w o r d / 2 0 2 3 / w o r d m l / w o r d 1 6 d u "   x m l n s : w 1 6 s d t d h = " h t t p : / / s c h e m a s . m i c r o s o f t . c o m / o f f i c e / w o r d / 2 0 2 0 / w o r d m l / s d t d a t a h a s h "   x m l n s : w 1 6 s d t f l = " h t t p : / / s c h e m a s . m i c r o s o f t . c o m / o f f i c e / w o r d / 2 0 2 4 / w o r d m l / s d t f o r m a t l o c k "   x m l n s : w 1 6 s e = " h t t p : / / s c h e m a s . m i c r o s o f t . c o m / o f f i c e / w o r d / 2 0 1 5 / w o r d m l / s y m e x "   m c : I g n o r a b l e = " w 1 4   w 1 5   w 1 6 s e   w 1 6 c i d   w 1 6   w 1 6 c e x   w 1 6 s d t d h   w 1 6 s d t f l   w 1 6 d u " & g t ; & l t ; w : d o c D e f a u l t s & g t ; & l t ; w : r P r D e f a u l t & g t ; & l t ; w : r P r & g t ; & l t ; w : r F o n t s   w : a s c i i T h e m e = " m i n o r H A n s i "   w : e a s t A s i a T h e m e = " m i n o r E a s t A s i a "   w : h A n s i T h e m e = " m i n o r H A n s i "   w : c s t h e m e = " m i n o r B i d i " / & g t ; & l t ; w : k e r n   w : v a l = " 2 " / & g t ; & l t ; w : s z   w : v a l = " 2 4 " / & g t ; & l t ; w : s z C s   w : v a l = " 2 4 " / & g t ; & l t ; w : l a n g   w : v a l = " e n - A U "   w : e a s t A s i a = " z h - C N "   w : b i d i = " a r - S A " / & g t ; & l t ; w 1 4 : l i g a t u r e s   w 1 4 : v a l = " s t a n d a r d C o n t e x t u a l " / & g t ; & l t ; / w : r P r & g t ; & l t ; / w : r P r D e f a u l t & g t ; & l t ; w : p P r D e f a u l t & g t ; & l t ; w : p P r & g t ; & l t ; w : s p a c i n g   w : a f t e r = " 1 6 0 "   w : l i n e = " 2 7 8 "   w : l i n e R u l e = " a u t o " / & g t ; & l t ; / w : p P r & g t ; & l t ; / w : p P r D e f a u l t & g t ; & l t ; / w : d o c D e f a u l t s & g t ; & l t ; w : s t y l e   w : t y p e = " p a r a g r a p h "   w : d e f a u l t = " 1 "   w : s t y l e I d = " N o r m a l " & g t ; & l t ; w : n a m e   w : v a l = " N o r m a l " / & g t ; & l t ; w : q F o r m a t / & g t ; & l t ; w : r s i d   w : v a l = " 0 0 4 5 1 8 D 8 " / & g t ; & l t ; / w : s t y l e & g t ; & l t ; w : s t y l e   w : t y p e = " c h a r a c t e r "   w : d e f a u l t = " 1 "   w : s t y l e I d = " D e f a u l t P a r a g r a p h F o n t " & g t ; & l t ; w : n a m e   w : v a l = " D e f a u l t   P a r a g r a p h   F o n t " / & g t ; & l t ; w : u i P r i o r i t y   w : v a l = " 1 " / & g t ; & l t ; w : s e m i H i d d e n / & g t ; & l t ; w : u n h i d e W h e n U s e d / & g t ; & l t ; w : r s i d   w : v a l = " 0 0 4 5 1 8 D 8 " / & g t ; & l t ; / w : s t y l e & g t ; & l t ; w : s t y l e   w : t y p e = " t a b l e "   w : d e f a u l t = " 1 "   w : s t y l e I d = " T a b l e N o r m a l " & g t ; & l t ; w : n a m e   w : v a l = " N o r m a l   T a b l e " / & g t ; & l t ; w : u i P r i o r i t y   w : v a l = " 9 9 " / & g t ; & l t ; w : s e m i H i d d e n / & g t ; & l t ; w : u n h i d e W h e n U s e d / & g t ; & l t ; w : t b l P r & g t ; & l t ; w : t b l I n d   w : w = " 0 "   w : t y p e = " d x a " / & g t ; & l t ; w : t b l C e l l M a r & g t ; & l t ; w : t o p   w : w = " 0 "   w : t y p e = " d x a " / & g t ; & l t ; w : l e f t   w : w = " 1 0 8 "   w : t y p e = " d x a " / & g t ; & l t ; w : b o t t o m   w : w = " 0 "   w : t y p e = " d x a " / & g t ; & l t ; w : r i g h t   w : w = " 1 0 8 "   w : t y p e = " d x a " / & g t ; & l t ; / w : t b l C e l l M a r & g t ; & l t ; / w : t b l P r & g t ; & l t ; / w : s t y l e & g t ; & l t ; w : s t y l e   w : t y p e = " n u m b e r i n g "   w : d e f a u l t = " 1 "   w : s t y l e I d = " N o L i s t " & g t ; & l t ; w : n a m e   w : v a l = " N o   L i s t " / & g t ; & l t ; w : u i P r i o r i t y   w : v a l = " 9 9 " / & g t ; & l t ; w : s e m i H i d d e n / & g t ; & l t ; w : u n h i d e W h e n U s e d / & g t ; & l t ; w : r s i d   w : v a l = " 0 0 4 5 1 8 D 8 " / & g t ; & l t ; / w : s t y l e & g t ; & l t ; / w : s t y l e s & g t ; & l t ; / p k g : x m l D a t a & g t ; & l t ; / p k g : p a r t & g t ; & l t ; p k g : p a r t   p k g : n a m e = " / d o c M e t a d a t a / L a b e l I n f o . x m l "   p k g : c o n t e n t T y p e = " a p p l i c a t i o n / v n d . m s - o f f i c e . c l a s s i f i c a t i o n l a b e l s + x m l " & g t ; & l t ; p k g : x m l D a t a & g t ; & l t ; c l b l : l a b e l L i s t   x m l n s : c l b l = " h t t p : / / s c h e m a s . m i c r o s o f t . c o m / o f f i c e / 2 0 2 0 / m i p L a b e l M e t a d a t a " & g t ; & l t ; c l b l : l a b e l   i d = " { 8 5 c a 8 a f 4 - 7 6 3 a - 4 5 c 2 - 8 0 a e - a 5 c a 1 b 8 0 b d d c } "   e n a b l e d = " 1 "   m e t h o d = " S t a n d a r d "   s i t e I d = " { 0 6 c d a f 0 9 - 1 4 f 0 - 4 c d 1 - 8 a c 0 - 7 b f e d 7 0 7 a 8 2 c } "   c o n t e n t B i t s = " 0 "   r e m o v e d = " 0 " / & g t ; & l t ; / c l b l : l a b e l L i s t & g t ; & l t ; / p k g : x m l D a t a & g t ; & l t ; / p k g : p a r t & g t ; & l t ; / p k g : p a c k a g e & g t ; - 
- < / S o u r c e N o _ I t e m L e d g E n t r y > +                 < C u s t N a m e > C u s t N a m e < / C u s t N a m e > + 
+                 < D i s c o u n t A m o u n t > D i s c o u n t A m o u n t < / D i s c o u n t A m o u n t > + 
+                 < I n v Q t y _ I t e m L e d g E n t r y > I n v Q t y _ I t e m L e d g E n t r y < / I n v Q t y _ I t e m L e d g E n t r y > + 
+                 < P r o f i t P c t _ I t e m L e d g E n t r y > P r o f i t P c t _ I t e m L e d g E n t r y < / P r o f i t P c t _ I t e m L e d g E n t r y > + 
+                 < P r o f i t _ I t e m L e d g E n t r y > P r o f i t _ I t e m L e d g E n t r y < / P r o f i t _ I t e m L e d g E n t r y > + 
+                 < S a l e s A m t A c t u a l _ I t e m L e d g E n t r y > S a l e s A m t A c t u a l _ I t e m L e d g E n t r y < / S a l e s A m t A c t u a l _ I t e m L e d g E n t r y > + 
+                 < S o u r c e N o _ I t e m L e d g E n t r y > S o u r c e N o _ I t e m L e d g E n t r y < / S o u r c e N o _ I t e m L e d g E n t r y >   
              < / I n t e g e r >   
@@ -4940,13 +4807,7 @@
  
              < S u b T o t a l s _ P r o f i t > S u b T o t a l s _ P r o f i t < / S u b T o t a l s _ P r o f i t >   
-             < S u b T o t a l s _ P r o f i t P c t > & l t ; ? x m l   v e r s i o n = " 1 . 0 "   s t a n d a l o n e = " y e s " ? & g t ; - 
- & l t ; ? m s o - a p p l i c a t i o n   p r o g i d = " W o r d . D o c u m e n t " ? & g t ; - 
- & l t ; p k g : p a c k a g e   x m l n s : p k g = " h t t p : / / s c h e m a s . m i c r o s o f t . c o m / o f f i c e / 2 0 0 6 / x m l P a c k a g e " & g t ; & l t ; p k g : p a r t   p k g : n a m e = " / _ r e l s / . r e l s "   p k g : c o n t e n t T y p e = " a p p l i c a t i o n / v n d . o p e n x m l f o r m a t s - p a c k a g e . r e l a t i o n s h i p s + x m l "   p k g : p a d d i n g = " 5 1 2 " & g t ; & l t ; p k g : x m l D a t a & g t ; & l t ; R e l a t i o n s h i p s   x m l n s = " h t t p : / / s c h e m a s . o p e n x m l f o r m a t s . o r g / p a c k a g e / 2 0 0 6 / r e l a t i o n s h i p s " & g t ; & l t ; R e l a t i o n s h i p   I d = " r I d 2 "   T y p e = " h t t p : / / s c h e m a s . m i c r o s o f t . c o m / o f f i c e / 2 0 2 0 / 0 2 / r e l a t i o n s h i p s / c l a s s i f i c a t i o n l a b e l s "   T a r g e t = " d o c M e t a d a t a / L a b e l I n f o . x m l " / & g t ; & l t ; R e l a t i o n s h i p   I d = " r I d 1 "   T y p e = " h t t p : / / s c h e m a s . o p e n x m l f o r m a t s . o r g / o f f i c e D o c u m e n t / 2 0 0 6 / r e l a t i o n s h i p s / o f f i c e D o c u m e n t "   T a r g e t = " w o r d / d o c u m e n t . x m l " / & g t ; & l t ; / R e l a t i o n s h i p s & g t ; & l t ; / p k g : x m l D a t a & g t ; & l t ; / p k g : p a r t & g t ; & l t ; p k g : p a r t   p k g : n a m e = " / w o r d / d o c u m e n t . x m l "   p k g : c o n t e n t T y p e = " a p p l i c a t i o n / v n d . o p e n x m l f o r m a t s - o f f i c e d o c u m e n t . w o r d p r o c e s s i n g m l . d o c u m e n t . m a i n + x m l " & g t ; & l t ; p k g : x m l D a t a & g t ; & l t ; w : d o c u m e n t   x m l n s : w p c = " h t t p : / / s c h e m a s . m i c r o s o f t . c o m / o f f i c e / w o r d / 2 0 1 0 / w o r d p r o c e s s i n g C a n v a s "   x m l n s : c x = " h t t p : / / s c h e m a s . m i c r o s o f t . c o m / o f f i c e / d r a w i n g / 2 0 1 4 / c h a r t e x "   x m l n s : c x 1 = " h t t p : / / s c h e m a s . m i c r o s o f t . c o m / o f f i c e / d r a w i n g / 2 0 1 5 / 9 / 8 / c h a r t e x "   x m l n s : c x 2 = " h t t p : / / s c h e m a s . m i c r o s o f t . c o m / o f f i c e / d r a w i n g / 2 0 1 5 / 1 0 / 2 1 / c h a r t e x "   x m l n s : c x 3 = " h t t p : / / s c h e m a s . m i c r o s o f t . c o m / o f f i c e / d r a w i n g / 2 0 1 6 / 5 / 9 / c h a r t e x "   x m l n s : c x 4 = " h t t p : / / s c h e m a s . m i c r o s o f t . c o m / o f f i c e / d r a w i n g / 2 0 1 6 / 5 / 1 0 / c h a r t e x "   x m l n s : c x 5 = " h t t p : / / s c h e m a s . m i c r o s o f t . c o m / o f f i c e / d r a w i n g / 2 0 1 6 / 5 / 1 1 / c h a r t e x "   x m l n s : c x 6 = " h t t p : / / s c h e m a s . m i c r o s o f t . c o m / o f f i c e / d r a w i n g / 2 0 1 6 / 5 / 1 2 / c h a r t e x "   x m l n s : c x 7 = " h t t p : / / s c h e m a s . m i c r o s o f t . c o m / o f f i c e / d r a w i n g / 2 0 1 6 / 5 / 1 3 / c h a r t e x "   x m l n s : c x 8 = " h t t p : / / s c h e m a s . m i c r o s o f t . c o m / o f f i c e / d r a w i n g / 2 0 1 6 / 5 / 1 4 / c h a r t e x "   x m l n s : m c = " h t t p : / / s c h e m a s . o p e n x m l f o r m a t s . o r g / m a r k u p - c o m p a t i b i l i t y / 2 0 0 6 "   x m l n s : a i n k = " h t t p : / / s c h e m a s . m i c r o s o f t . c o m / o f f i c e / d r a w i n g / 2 0 1 6 / i n k "   x m l n s : a m 3 d = " h t t p : / / s c h e m a s . m i c r o s o f t . c o m / o f f i c e / d r a w i n g / 2 0 1 7 / m o d e l 3 d "   x m l n s : o = " u r n : s c h e m a s - m i c r o s o f t - c o m : o f f i c e : o f f i c e "   x m l n s : o e l = " h t t p : / / s c h e m a s . m i c r o s o f t . c o m / o f f i c e / 2 0 1 9 / e x t l s t "   x m l n s : r = " h t t p : / / s c h e m a s . o p e n x m l f o r m a t s . o r g / o f f i c e D o c u m e n t / 2 0 0 6 / r e l a t i o n s h i p s "   x m l n s : m = " h t t p : / / s c h e m a s . o p e n x m l f o r m a t s . o r g / o f f i c e D o c u m e n t / 2 0 0 6 / m a t h "   x m l n s : v = " u r n : s c h e m a s - m i c r o s o f t - c o m : v m l "   x m l n s : w p 1 4 = " h t t p : / / s c h e m a s . m i c r o s o f t . c o m / o f f i c e / w o r d / 2 0 1 0 / w o r d p r o c e s s i n g D r a w i n g "   x m l n s : w p = " h t t p : / / s c h e m a s . o p e n x m l f o r m a t s . o r g / d r a w i n g m l / 2 0 0 6 / w o r d p r o c e s s i n g D r a w i n g "   x m l n s : w 1 0 = " u r n : s c h e m a s - m i c r o s o f t - c o m : o f f i c e : w o r d "   x m l n s : w = " h t t p : / / s c h e m a s . o p e n x m l f o r m a t s . o r g / w o r d p r o c e s s i n g m l / 2 0 0 6 / m a i n "   x m l n s : w 1 4 = " h t t p : / / s c h e m a s . m i c r o s o f t . c o m / o f f i c e / w o r d / 2 0 1 0 / w o r d m l "   x m l n s : w 1 5 = " h t t p : / / s c h e m a s . m i c r o s o f t . c o m / o f f i c e / w o r d / 2 0 1 2 / w o r d m l "   x m l n s : w 1 6 c e x = " h t t p : / / s c h e m a s . m i c r o s o f t . c o m / o f f i c e / w o r d / 2 0 1 8 / w o r d m l / c e x "   x m l n s : w 1 6 c i d = " h t t p : / / s c h e m a s . m i c r o s o f t . c o m / o f f i c e / w o r d / 2 0 1 6 / w o r d m l / c i d "   x m l n s : w 1 6 = " h t t p : / / s c h e m a s . m i c r o s o f t . c o m / o f f i c e / w o r d / 2 0 1 8 / w o r d m l "   x m l n s : w 1 6 d u = " h t t p : / / s c h e m a s . m i c r o s o f t . c o m / o f f i c e / w o r d / 2 0 2 3 / w o r d m l / w o r d 1 6 d u "   x m l n s : w 1 6 s d t d h = " h t t p : / / s c h e m a s . m i c r o s o f t . c o m / o f f i c e / w o r d / 2 0 2 0 / w o r d m l / s d t d a t a h a s h "   x m l n s : w 1 6 s d t f l = " h t t p : / / s c h e m a s . m i c r o s o f t . c o m / o f f i c e / w o r d / 2 0 2 4 / w o r d m l / s d t f o r m a t l o c k "   x m l n s : w 1 6 s e = " h t t p : / / s c h e m a s . m i c r o s o f t . c o m / o f f i c e / w o r d / 2 0 1 5 / w o r d m l / s y m e x "   x m l n s : w p g = " h t t p : / / s c h e m a s . m i c r o s o f t . c o m / o f f i c e / w o r d / 2 0 1 0 / w o r d p r o c e s s i n g G r o u p "   x m l n s : w p i = " h t t p : / / s c h e m a s . m i c r o s o f t . c o m / o f f i c e / w o r d / 2 0 1 0 / w o r d p r o c e s s i n g I n k "   x m l n s : w n e = " h t t p : / / s c h e m a s . m i c r o s o f t . c o m / o f f i c e / w o r d / 2 0 0 6 / w o r d m l "   x m l n s : w p s = " h t t p : / / s c h e m a s . m i c r o s o f t . c o m / o f f i c e / w o r d / 2 0 1 0 / w o r d p r o c e s s i n g S h a p e "   m c : I g n o r a b l e = " w 1 4   w 1 5   w 1 6 s e   w 1 6 c i d   w 1 6   w 1 6 c e x   w 1 6 s d t d h   w 1 6 s d t f l   w 1 6 d u   w p 1 4 " & g t ; & l t ; w : b o d y & g t ; & l t ; w : p   w 1 4 : p a r a I d = " 7 2 E 2 6 2 2 B "   w 1 4 : t e x t I d = " 5 0 3 B 0 B A 3 "   w : r s i d R = " 0 0 D 3 2 8 C C "   w : r s i d R D e f a u l t = " 0 0 D 3 2 8 C C " & g t ; & l t ; w : p P r & g t ; & l t ; w : s p a c i n g   w : a f t e r = " 0 "   w : l i n e = " 2 4 0 "   w : l i n e R u l e = " a u t o " / & g t ; & l t ; w : j c   w : v a l = " r i g h t " / & g t ; & l t ; / w : p P r & g t ; & l t ; w : r   w : r s i d R P r = " 0 0 9 3 6 B 0 9 " & g t ; & l t ; w : r P r & g t ; & l t ; w : r F o n t s   w : a s c i i = " S e g o e   U I "   w : h A n s i = " S e g o e   U I "   w : c s = " S e g o e   U I " / & g t ; & l t ; w : b / & g t ; & l t ; w : b C s / & g t ; & l t ; w : s z   w : v a l = " 1 6 " / & g t ; & l t ; w : s z C s   w : v a l = " 1 6 " / & g t ; & l t ; / w : r P r & g t ; & l t ; w : t & g t ; S u b T o t a l s & l t ; / w : t & g t ; & l t ; / w : r & g t ; & l t ; w : r & g t ; & l t ; w : r P r & g t ; & l t ; w : r F o n t s   w : a s c i i = " S e g o e   U I "   w : h A n s i = " S e g o e   U I "   w : c s = " S e g o e   U I " / & g t ; & l t ; w : s z   w : v a l = " 1 6 " / & g t ; & l t ; w : s z C s   w : v a l = " 1 6 " / & g t ; & l t ; / w : r P r & g t ; & l t ; w : t & g t ; _ P r o f i t P c t & l t ; / w : t & g t ; & l t ; / w : r & g t ; & l t ; / w : p & g t ; & l t ; w : s e c t P r   w : r s i d R = " 0 0 0 0 0 0 0 0 " & g t ; & l t ; w : p g S z   w : w = " 1 2 2 4 0 "   w : h = " 1 5 8 4 0 " / & g t ; & l t ; w : p g M a r   w : t o p = " 1 4 4 0 "   w : r i g h t = " 1 4 4 0 "   w : b o t t o m = " 1 4 4 0 "   w : l e f t = " 1 4 4 0 "   w : h e a d e r = " 7 2 0 "   w : f o o t e r = " 7 2 0 "   w : g u t t e r = " 0 " / & g t ; & l t ; w : c o l s   w : s p a c e = " 7 2 0 " / & g t ; & l t ; / w : s e c t P r & g t ; & l t ; / w : b o d y & g t ; & l t ; / w : d o c u m e n t & g t ; & l t ; / p k g : x m l D a t a & g t ; & l t ; / p k g : p a r t & g t ; & l t ; p k g : p a r t   p k g : n a m e = " / w o r d / _ r e l s / d o c u m e n t . x m l . r e l s "   p k g : c o n t e n t T y p e = " a p p l i c a t i o n / v n d . o p e n x m l f o r m a t s - p a c k a g e . r e l a t i o n s h i p s + x m l "   p k g : p a d d i n g = " 2 5 6 " & g t ; & l t ; p k g : x m l D a t a & g t ; & l t ; R e l a t i o n s h i p s   x m l n s = " h t t p : / / s c h e m a s . o p e n x m l f o r m a t s . o r g / p a c k a g e / 2 0 0 6 / r e l a t i o n s h i p s " & g t ; & l t ; R e l a t i o n s h i p   I d = " r I d 1 "   T y p e = " h t t p : / / s c h e m a s . o p e n x m l f o r m a t s . o r g / o f f i c e D o c u m e n t / 2 0 0 6 / r e l a t i o n s h i p s / s t y l e s "   T a r g e t = " s t y l e s . x m l " / & g t ; & l t ; / R e l a t i o n s h i p s & g t ; & l t ; / p k g : x m l D a t a & g t ; & l t ; / p k g : p a r t & g t ; & l t ; p k g : p a r t   p k g : n a m e = " / w o r d / s t y l e s . x m l "   p k g : c o n t e n t T y p e = " a p p l i c a t i o n / v n d . o p e n x m l f o r m a t s - o f f i c e d o c u m e n t . w o r d p r o c e s s i n g m l . s t y l e s + x m l " & g t ; & l t ; p k g : x m l D a t a & g t ; & l t ; w : s t y l e s   x m l n s : m c = " h t t p : / / s c h e m a s . o p e n x m l f o r m a t s . o r g / m a r k u p - c o m p a t i b i l i t y / 2 0 0 6 "   x m l n s : r = " h t t p : / / s c h e m a s . o p e n x m l f o r m a t s . o r g / o f f i c e D o c u m e n t / 2 0 0 6 / r e l a t i o n s h i p s "   x m l n s : w = " h t t p : / / s c h e m a s . o p e n x m l f o r m a t s . o r g / w o r d p r o c e s s i n g m l / 2 0 0 6 / m a i n "   x m l n s : w 1 4 = " h t t p : / / s c h e m a s . m i c r o s o f t . c o m / o f f i c e / w o r d / 2 0 1 0 / w o r d m l "   x m l n s : w 1 5 = " h t t p : / / s c h e m a s . m i c r o s o f t . c o m / o f f i c e / w o r d / 2 0 1 2 / w o r d m l "   x m l n s : w 1 6 c e x = " h t t p : / / s c h e m a s . m i c r o s o f t . c o m / o f f i c e / w o r d / 2 0 1 8 / w o r d m l / c e x "   x m l n s : w 1 6 c i d = " h t t p : / / s c h e m a s . m i c r o s o f t . c o m / o f f i c e / w o r d / 2 0 1 6 / w o r d m l / c i d "   x m l n s : w 1 6 = " h t t p : / / s c h e m a s . m i c r o s o f t . c o m / o f f i c e / w o r d / 2 0 1 8 / w o r d m l "   x m l n s : w 1 6 d u = " h t t p : / / s c h e m a s . m i c r o s o f t . c o m / o f f i c e / w o r d / 2 0 2 3 / w o r d m l / w o r d 1 6 d u "   x m l n s : w 1 6 s d t d h = " h t t p : / / s c h e m a s . m i c r o s o f t . c o m / o f f i c e / w o r d / 2 0 2 0 / w o r d m l / s d t d a t a h a s h "   x m l n s : w 1 6 s d t f l = " h t t p : / / s c h e m a s . m i c r o s o f t . c o m / o f f i c e / w o r d / 2 0 2 4 / w o r d m l / s d t f o r m a t l o c k "   x m l n s : w 1 6 s e = " h t t p : / / s c h e m a s . m i c r o s o f t . c o m / o f f i c e / w o r d / 2 0 1 5 / w o r d m l / s y m e x "   m c : I g n o r a b l e = " w 1 4   w 1 5   w 1 6 s e   w 1 6 c i d   w 1 6   w 1 6 c e x   w 1 6 s d t d h   w 1 6 s d t f l   w 1 6 d u " & g t ; & l t ; w : d o c D e f a u l t s & g t ; & l t ; w : r P r D e f a u l t & g t ; & l t ; w : r P r & g t ; & l t ; w : r F o n t s   w : a s c i i T h e m e = " m i n o r H A n s i "   w : e a s t A s i a T h e m e = " m i n o r E a s t A s i a "   w : h A n s i T h e m e = " m i n o r H A n s i "   w : c s t h e m e = " m i n o r B i d i " / & g t ; & l t ; w : k e r n   w : v a l = " 2 " / & g t ; & l t ; w : s z   w : v a l = " 2 4 " / & g t ; & l t ; w : s z C s   w : v a l = " 2 4 " / & g t ; & l t ; w : l a n g   w : v a l = " e n - A U "   w : e a s t A s i a = " z h - C N "   w : b i d i = " a r - S A " / & g t ; & l t ; w 1 4 : l i g a t u r e s   w 1 4 : v a l = " s t a n d a r d C o n t e x t u a l " / & g t ; & l t ; / w : r P r & g t ; & l t ; / w : r P r D e f a u l t & g t ; & l t ; w : p P r D e f a u l t & g t ; & l t ; w : p P r & g t ; & l t ; w : s p a c i n g   w : a f t e r = " 1 6 0 "   w : l i n e = " 2 7 8 "   w : l i n e R u l e = " a u t o " / & g t ; & l t ; / w : p P r & g t ; & l t ; / w : p P r D e f a u l t & g t ; & l t ; / w : d o c D e f a u l t s & g t ; & l t ; w : s t y l e   w : t y p e = " p a r a g r a p h "   w : d e f a u l t = " 1 "   w : s t y l e I d = " N o r m a l " & g t ; & l t ; w : n a m e   w : v a l = " N o r m a l " / & g t ; & l t ; w : q F o r m a t / & g t ; & l t ; w : r s i d   w : v a l = " 0 0 D 3 2 8 C C " / & g t ; & l t ; / w : s t y l e & g t ; & l t ; w : s t y l e   w : t y p e = " c h a r a c t e r "   w : d e f a u l t = " 1 "   w : s t y l e I d = " D e f a u l t P a r a g r a p h F o n t " & g t ; & l t ; w : n a m e   w : v a l = " D e f a u l t   P a r a g r a p h   F o n t " / & g t ; & l t ; w : u i P r i o r i t y   w : v a l = " 1 " / & g t ; & l t ; w : s e m i H i d d e n / & g t ; & l t ; w : u n h i d e W h e n U s e d / & g t ; & l t ; w : r s i d   w : v a l = " 0 0 D 3 2 8 C C " / & g t ; & l t ; / w : s t y l e & g t ; & l t ; w : s t y l e   w : t y p e = " t a b l e "   w : d e f a u l t = " 1 "   w : s t y l e I d = " T a b l e N o r m a l " & g t ; & l t ; w : n a m e   w : v a l = " N o r m a l   T a b l e " / & g t ; & l t ; w : u i P r i o r i t y   w : v a l = " 9 9 " / & g t ; & l t ; w : s e m i H i d d e n / & g t ; & l t ; w : u n h i d e W h e n U s e d / & g t ; & l t ; w : t b l P r & g t ; & l t ; w : t b l I n d   w : w = " 0 "   w : t y p e = " d x a " / & g t ; & l t ; w : t b l C e l l M a r & g t ; & l t ; w : t o p   w : w = " 0 "   w : t y p e = " d x a " / & g t ; & l t ; w : l e f t   w : w = " 1 0 8 "   w : t y p e = " d x a " / & g t ; & l t ; w : b o t t o m   w : w = " 0 "   w : t y p e = " d x a " / & g t ; & l t ; w : r i g h t   w : w = " 1 0 8 "   w : t y p e = " d x a " / & g t ; & l t ; / w : t b l C e l l M a r & g t ; & l t ; / w : t b l P r & g t ; & l t ; / w : s t y l e & g t ; & l t ; w : s t y l e   w : t y p e = " n u m b e r i n g "   w : d e f a u l t = " 1 "   w : s t y l e I d = " N o L i s t " & g t ; & l t ; w : n a m e   w : v a l = " N o   L i s t " / & g t ; & l t ; w : u i P r i o r i t y   w : v a l = " 9 9 " / & g t ; & l t ; w : s e m i H i d d e n / & g t ; & l t ; w : u n h i d e W h e n U s e d / & g t ; & l t ; w : r s i d   w : v a l = " 0 0 D 3 2 8 C C " / & g t ; & l t ; / w : s t y l e & g t ; & l t ; / w : s t y l e s & g t ; & l t ; / p k g : x m l D a t a & g t ; & l t ; / p k g : p a r t & g t ; & l t ; p k g : p a r t   p k g : n a m e = " / d o c M e t a d a t a / L a b e l I n f o . x m l "   p k g : c o n t e n t T y p e = " a p p l i c a t i o n / v n d . m s - o f f i c e . c l a s s i f i c a t i o n l a b e l s + x m l " & g t ; & l t ; p k g : x m l D a t a & g t ; & l t ; c l b l : l a b e l L i s t   x m l n s : c l b l = " h t t p : / / s c h e m a s . m i c r o s o f t . c o m / o f f i c e / 2 0 2 0 / m i p L a b e l M e t a d a t a " & g t ; & l t ; c l b l : l a b e l   i d = " { 8 5 c a 8 a f 4 - 7 6 3 a - 4 5 c 2 - 8 0 a e - a 5 c a 1 b 8 0 b d d c } "   e n a b l e d = " 1 "   m e t h o d = " S t a n d a r d "   s i t e I d = " { 0 6 c d a f 0 9 - 1 4 f 0 - 4 c d 1 - 8 a c 0 - 7 b f e d 7 0 7 a 8 2 c } "   c o n t e n t B i t s = " 0 "   r e m o v e d = " 0 " / & g t ; & l t ; / c l b l : l a b e l L i s t & g t ; & l t ; / p k g : x m l D a t a & g t ; & l t ; / p k g : p a r t & g t ; & l t ; / p k g : p a c k a g e & g t ; - 
- < / S u b T o t a l s _ P r o f i t P c t > +             < S u b T o t a l s _ P r o f i t P c t > S u b T o t a l s _ P r o f i t P c t < / S u b T o t a l s _ P r o f i t P c t >   
              < S u b T o t a l s _ S a l e s A m t A c t u a l > S u b T o t a l s _ S a l e s A m t A c t u a l < / S u b T o t a l s _ S a l e s A m t A c t u a l >   
@@ -4967,14 +4828,6 @@
      < / T o t a l s >   
  < / N a v W o r d R e p o r t X m l P a r t > 
-</file>
-
-<file path=customXml/itemProps1.xml><?xml version="1.0" encoding="utf-8"?>
-<ds:datastoreItem xmlns:ds="http://schemas.openxmlformats.org/officeDocument/2006/customXml" ds:itemID="{17357049-351C-4FB5-BA49-88074E24903C}">
-  <ds:schemaRefs>
-    <ds:schemaRef ds:uri="urn:microsoft-dynamics-nav/reports/FS_YSR_InventoryCustomerSales/50003/"/>
-  </ds:schemaRefs>
-</ds:datastoreItem>
 </file>
 
 <file path=docMetadata/LabelInfo.xml><?xml version="1.0" encoding="utf-8"?>

</xml_diff>

<commit_message>
Sync to upstream it-28 (SHA: 45a53643ea43ff6e7f9fcd9266a0f118365d92e9)
</commit_message>
<xml_diff>
--- a/BaseApp/Source/Base Application/Inventory/Reports/InventoryCustomerSales.docx
+++ b/BaseApp/Source/Base Application/Inventory/Reports/InventoryCustomerSales.docx
@@ -42,10 +42,10 @@
             <w:placeholder>
               <w:docPart w:val="DefaultPlaceholder_-1854013440"/>
             </w:placeholder>
-            <w:dataBinding w:prefixMappings="xmlns:ns0='urn:microsoft-dynamics-nav/reports/Inventory_Customer_Sales/713/'" w:xpath="/ns0:NavWordReportXmlPart[1]/ns0:Labels[1]/ns0:CustomerNoLbl[1]" w:storeItemID="{0E62280E-706F-45D7-BEE2-B24E4BE14C14}"/>
+            <w:dataBinding w:prefixMappings="xmlns:ns0='urn:microsoft-dynamics-nav/reports/FS_YSD_InventoryCustomerSales/50019/' " w:xpath="/ns0:NavWordReportXmlPart[1]/ns0:Labels[1]/ns0:CustomerNoLbl[1]" w:storeItemID="{0E62280E-706F-45D7-BEE2-B24E4BE14C14}"/>
             <w:text/>
             <w:alias w:val="#Nav: /Labels/CustomerNoLbl"/>
-            <w:tag w:val="#Nav: Inventory_Customer_Sales/713"/>
+            <w:tag w:val="#Nav: FS_YSD_InventoryCustomerSales/50019"/>
           </w:sdtPr>
           <w:sdtContent>
             <w:tc>
@@ -88,10 +88,10 @@
             <w:placeholder>
               <w:docPart w:val="DefaultPlaceholder_-1854013440"/>
             </w:placeholder>
-            <w:dataBinding w:prefixMappings="xmlns:ns0='urn:microsoft-dynamics-nav/reports/Inventory_Customer_Sales/713/'" w:xpath="/ns0:NavWordReportXmlPart[1]/ns0:Labels[1]/ns0:CustNameLbl[1]" w:storeItemID="{0E62280E-706F-45D7-BEE2-B24E4BE14C14}"/>
+            <w:dataBinding w:prefixMappings="xmlns:ns0='urn:microsoft-dynamics-nav/reports/FS_YSD_InventoryCustomerSales/50019/' " w:xpath="/ns0:NavWordReportXmlPart[1]/ns0:Labels[1]/ns0:CustNameLbl[1]" w:storeItemID="{0E62280E-706F-45D7-BEE2-B24E4BE14C14}"/>
             <w:text/>
             <w:alias w:val="#Nav: /Labels/CustNameLbl"/>
-            <w:tag w:val="#Nav: Inventory_Customer_Sales/713"/>
+            <w:tag w:val="#Nav: FS_YSD_InventoryCustomerSales/50019"/>
           </w:sdtPr>
           <w:sdtContent>
             <w:tc>
@@ -158,10 +158,10 @@
               <w:placeholder>
                 <w:docPart w:val="DefaultPlaceholder_-1854013440"/>
               </w:placeholder>
-              <w:dataBinding w:prefixMappings="xmlns:ns0='urn:microsoft-dynamics-nav/reports/Inventory_Customer_Sales/713/'" w:xpath="/ns0:NavWordReportXmlPart[1]/ns0:Labels[1]/ns0:InvQtyLbl[1]" w:storeItemID="{0E62280E-706F-45D7-BEE2-B24E4BE14C14}"/>
+              <w:dataBinding w:prefixMappings="xmlns:ns0='urn:microsoft-dynamics-nav/reports/FS_YSD_InventoryCustomerSales/50019/' " w:xpath="/ns0:NavWordReportXmlPart[1]/ns0:Labels[1]/ns0:InvQtyLbl[1]" w:storeItemID="{0E62280E-706F-45D7-BEE2-B24E4BE14C14}"/>
               <w:text/>
               <w:alias w:val="#Nav: /Labels/InvQtyLbl"/>
-              <w:tag w:val="#Nav: Inventory_Customer_Sales/713"/>
+              <w:tag w:val="#Nav: FS_YSD_InventoryCustomerSales/50019"/>
             </w:sdtPr>
             <w:sdtContent>
               <w:p>
@@ -212,10 +212,10 @@
             <w:placeholder>
               <w:docPart w:val="DefaultPlaceholder_-1854013440"/>
             </w:placeholder>
-            <w:dataBinding w:prefixMappings="xmlns:ns0='urn:microsoft-dynamics-nav/reports/Inventory_Customer_Sales/713/'" w:xpath="/ns0:NavWordReportXmlPart[1]/ns0:Labels[1]/ns0:AmountLbl[1]" w:storeItemID="{0E62280E-706F-45D7-BEE2-B24E4BE14C14}"/>
+            <w:dataBinding w:prefixMappings="xmlns:ns0='urn:microsoft-dynamics-nav/reports/FS_YSD_InventoryCustomerSales/50019/' " w:xpath="/ns0:NavWordReportXmlPart[1]/ns0:Labels[1]/ns0:AmountLbl[1]" w:storeItemID="{0E62280E-706F-45D7-BEE2-B24E4BE14C14}"/>
             <w:text/>
             <w:alias w:val="#Nav: /Labels/AmountLbl"/>
-            <w:tag w:val="#Nav: Inventory_Customer_Sales/713"/>
+            <w:tag w:val="#Nav: FS_YSD_InventoryCustomerSales/50019"/>
           </w:sdtPr>
           <w:sdtContent>
             <w:tc>
@@ -269,10 +269,10 @@
               <w:placeholder>
                 <w:docPart w:val="DefaultPlaceholder_-1854013440"/>
               </w:placeholder>
-              <w:dataBinding w:prefixMappings="xmlns:ns0='urn:microsoft-dynamics-nav/reports/Inventory_Customer_Sales/713/'" w:xpath="/ns0:NavWordReportXmlPart[1]/ns0:Labels[1]/ns0:DiscountAmtLbl[1]" w:storeItemID="{0E62280E-706F-45D7-BEE2-B24E4BE14C14}"/>
+              <w:dataBinding w:prefixMappings="xmlns:ns0='urn:microsoft-dynamics-nav/reports/FS_YSD_InventoryCustomerSales/50019/' " w:xpath="/ns0:NavWordReportXmlPart[1]/ns0:Labels[1]/ns0:DiscountAmtLbl[1]" w:storeItemID="{0E62280E-706F-45D7-BEE2-B24E4BE14C14}"/>
               <w:text/>
               <w:alias w:val="#Nav: /Labels/DiscountAmtLbl"/>
-              <w:tag w:val="#Nav: Inventory_Customer_Sales/713"/>
+              <w:tag w:val="#Nav: FS_YSD_InventoryCustomerSales/50019"/>
             </w:sdtPr>
             <w:sdtContent>
               <w:p>
@@ -323,10 +323,10 @@
             <w:placeholder>
               <w:docPart w:val="DefaultPlaceholder_-1854013440"/>
             </w:placeholder>
-            <w:dataBinding w:prefixMappings="xmlns:ns0='urn:microsoft-dynamics-nav/reports/Inventory_Customer_Sales/713/'" w:xpath="/ns0:NavWordReportXmlPart[1]/ns0:Labels[1]/ns0:ProfitLbl[1]" w:storeItemID="{0E62280E-706F-45D7-BEE2-B24E4BE14C14}"/>
+            <w:dataBinding w:prefixMappings="xmlns:ns0='urn:microsoft-dynamics-nav/reports/FS_YSD_InventoryCustomerSales/50019/' " w:xpath="/ns0:NavWordReportXmlPart[1]/ns0:Labels[1]/ns0:ProfitLbl[1]" w:storeItemID="{0E62280E-706F-45D7-BEE2-B24E4BE14C14}"/>
             <w:text/>
             <w:alias w:val="#Nav: /Labels/ProfitLbl"/>
-            <w:tag w:val="#Nav: Inventory_Customer_Sales/713"/>
+            <w:tag w:val="#Nav: FS_YSD_InventoryCustomerSales/50019"/>
           </w:sdtPr>
           <w:sdtContent>
             <w:tc>
@@ -375,10 +375,10 @@
             <w:placeholder>
               <w:docPart w:val="DefaultPlaceholder_-1854013440"/>
             </w:placeholder>
-            <w:dataBinding w:prefixMappings="xmlns:ns0='urn:microsoft-dynamics-nav/reports/Inventory_Customer_Sales/713/'" w:xpath="/ns0:NavWordReportXmlPart[1]/ns0:Labels[1]/ns0:ProfitPctLbl[1]" w:storeItemID="{0E62280E-706F-45D7-BEE2-B24E4BE14C14}"/>
+            <w:dataBinding w:prefixMappings="xmlns:ns0='urn:microsoft-dynamics-nav/reports/FS_YSD_InventoryCustomerSales/50019/' " w:xpath="/ns0:NavWordReportXmlPart[1]/ns0:Labels[1]/ns0:ProfitPctLbl[1]" w:storeItemID="{0E62280E-706F-45D7-BEE2-B24E4BE14C14}"/>
             <w:text/>
             <w:alias w:val="#Nav: /Labels/ProfitPctLbl"/>
-            <w:tag w:val="#Nav: Inventory_Customer_Sales/713"/>
+            <w:tag w:val="#Nav: FS_YSD_InventoryCustomerSales/50019"/>
           </w:sdtPr>
           <w:sdtContent>
             <w:tc>
@@ -574,9 +574,9 @@
             <w:lang w:eastAsia="zh-CN"/>
           </w:rPr>
           <w:alias w:val="#Nav: /Item"/>
-          <w:tag w:val="#Nav: Inventory_Customer_Sales/713"/>
+          <w:tag w:val="#Nav: FS_YSD_InventoryCustomerSales/50019"/>
           <w:id w:val="37015946"/>
-          <w15:dataBinding w:prefixMappings="xmlns:ns0='urn:microsoft-dynamics-nav/reports/Inventory_Customer_Sales/713/'" w:xpath="/ns0:NavWordReportXmlPart[1]/ns0:Item" w:storeItemID="{0E62280E-706F-45D7-BEE2-B24E4BE14C14}"/>
+          <w15:dataBinding w:prefixMappings="xmlns:ns0='urn:microsoft-dynamics-nav/reports/FS_YSD_InventoryCustomerSales/50019/' " w:xpath="/ns0:NavWordReportXmlPart[1]/ns0:Item" w:storeItemID="{0E62280E-706F-45D7-BEE2-B24E4BE14C14}"/>
           <w15:repeatingSection/>
         </w:sdtPr>
         <w:sdtEndPr>
@@ -949,12 +949,12 @@
                       <w:szCs w:val="16"/>
                     </w:rPr>
                     <w:alias w:val="#Nav: /Labels/BaseUnitofMeasure_ItemCaption"/>
-                    <w:tag w:val="#Nav: Inventory_Customer_Sales/713"/>
+                    <w:tag w:val="#Nav: FS_YSD_InventoryCustomerSales/50019"/>
                     <w:id w:val="-1204844"/>
                     <w:placeholder>
                       <w:docPart w:val="DefaultPlaceholder_-1854013440"/>
                     </w:placeholder>
-                    <w:dataBinding w:prefixMappings="xmlns:ns0='urn:microsoft-dynamics-nav/reports/Inventory_Customer_Sales/713/'" w:xpath="/ns0:NavWordReportXmlPart[1]/ns0:Labels[1]/ns0:BaseUnitofMeasure_ItemCaption[1]" w:storeItemID="{0E62280E-706F-45D7-BEE2-B24E4BE14C14}"/>
+                    <w:dataBinding w:prefixMappings="xmlns:ns0='urn:microsoft-dynamics-nav/reports/FS_YSD_InventoryCustomerSales/50019/'" w:xpath="/ns0:NavWordReportXmlPart[1]/ns0:Labels[1]/ns0:BaseUnitofMeasure_ItemCaption[1]" w:storeItemID="{0E62280E-706F-45D7-BEE2-B24E4BE14C14}"/>
                     <w:text/>
                   </w:sdtPr>
                   <w:sdtContent>
@@ -1113,9 +1113,9 @@
                     <w:lang w:eastAsia="zh-CN"/>
                   </w:rPr>
                   <w:alias w:val="#Nav: /Item/Item_Ledger_Entry"/>
-                  <w:tag w:val="#Nav: Inventory_Customer_Sales/713"/>
+                  <w:tag w:val="#Nav: FS_YSD_InventoryCustomerSales/50019"/>
                   <w:id w:val="100769726"/>
-                  <w15:dataBinding w:prefixMappings="xmlns:ns0='urn:microsoft-dynamics-nav/reports/Inventory_Customer_Sales/713/'" w:xpath="/ns0:NavWordReportXmlPart[1]/ns0:Item[1]/ns0:Item_Ledger_Entry" w:storeItemID="{0E62280E-706F-45D7-BEE2-B24E4BE14C14}"/>
+                  <w15:dataBinding w:prefixMappings="xmlns:ns0='urn:microsoft-dynamics-nav/reports/FS_YSD_InventoryCustomerSales/50019/' " w:xpath="/ns0:NavWordReportXmlPart[1]/ns0:Item[1]/ns0:Item_Ledger_Entry" w:storeItemID="{0E62280E-706F-45D7-BEE2-B24E4BE14C14}"/>
                   <w15:repeatingSection/>
                 </w:sdtPr>
                 <w:sdtEndPr>
@@ -1159,9 +1159,9 @@
                             <w:lang w:eastAsia="zh-CN"/>
                           </w:rPr>
                           <w:alias w:val="#Nav: /Item/Item_Ledger_Entry/Integer"/>
-                          <w:tag w:val="#Nav: Inventory_Customer_Sales/713"/>
+                          <w:tag w:val="#Nav: FS_YSD_InventoryCustomerSales/50019"/>
                           <w:id w:val="1092279626"/>
-                          <w15:dataBinding w:prefixMappings="xmlns:ns0='urn:microsoft-dynamics-nav/reports/Inventory_Customer_Sales/713/'" w:xpath="/ns0:NavWordReportXmlPart[1]/ns0:Item[1]/ns0:Item_Ledger_Entry[1]/ns0:Integer" w:storeItemID="{0E62280E-706F-45D7-BEE2-B24E4BE14C14}"/>
+                          <w15:dataBinding w:prefixMappings="xmlns:ns0='urn:microsoft-dynamics-nav/reports/FS_YSD_InventoryCustomerSales/50019/' " w:xpath="/ns0:NavWordReportXmlPart[1]/ns0:Item[1]/ns0:Item_Ledger_Entry[1]/ns0:Integer" w:storeItemID="{0E62280E-706F-45D7-BEE2-B24E4BE14C14}"/>
                           <w15:repeatingSection/>
                         </w:sdtPr>
                         <w:sdtEndPr>
@@ -2126,12 +2126,12 @@
               <w:szCs w:val="16"/>
             </w:rPr>
             <w:alias w:val="#Nav: /Totals/Totals_SalesAmtActual"/>
-            <w:tag w:val="#Nav: Inventory_Customer_Sales/713"/>
+            <w:tag w:val="#Nav: FS_YSD_InventoryCustomerSales/50019"/>
             <w:id w:val="-1960557500"/>
             <w:placeholder>
               <w:docPart w:val="DefaultPlaceholder_-1854013440"/>
             </w:placeholder>
-            <w:dataBinding w:prefixMappings="xmlns:ns0='urn:microsoft-dynamics-nav/reports/Inventory_Customer_Sales/713/'" w:xpath="/ns0:NavWordReportXmlPart[1]/ns0:Totals[1]/ns0:Totals_SalesAmtActual[1]" w:storeItemID="{0E62280E-706F-45D7-BEE2-B24E4BE14C14}"/>
+            <w:dataBinding w:prefixMappings="xmlns:ns0='urn:microsoft-dynamics-nav/reports/FS_YSD_InventoryCustomerSales/50019/'" w:xpath="/ns0:NavWordReportXmlPart[1]/ns0:Totals[1]/ns0:Totals_SalesAmtActual[1]" w:storeItemID="{0E62280E-706F-45D7-BEE2-B24E4BE14C14}"/>
             <w:text/>
           </w:sdtPr>
           <w:sdtContent>
@@ -2180,12 +2180,12 @@
               <w:szCs w:val="16"/>
             </w:rPr>
             <w:alias w:val="#Nav: /Totals/Totals_DiscountAmount"/>
-            <w:tag w:val="#Nav: Inventory_Customer_Sales/713"/>
+            <w:tag w:val="#Nav: FS_YSD_InventoryCustomerSales/50019"/>
             <w:id w:val="-1954698414"/>
             <w:placeholder>
               <w:docPart w:val="DefaultPlaceholder_-1854013440"/>
             </w:placeholder>
-            <w:dataBinding w:prefixMappings="xmlns:ns0='urn:microsoft-dynamics-nav/reports/Inventory_Customer_Sales/713/'" w:xpath="/ns0:NavWordReportXmlPart[1]/ns0:Totals[1]/ns0:Totals_DiscountAmount[1]" w:storeItemID="{0E62280E-706F-45D7-BEE2-B24E4BE14C14}"/>
+            <w:dataBinding w:prefixMappings="xmlns:ns0='urn:microsoft-dynamics-nav/reports/FS_YSD_InventoryCustomerSales/50019/'" w:xpath="/ns0:NavWordReportXmlPart[1]/ns0:Totals[1]/ns0:Totals_DiscountAmount[1]" w:storeItemID="{0E62280E-706F-45D7-BEE2-B24E4BE14C14}"/>
             <w:text/>
           </w:sdtPr>
           <w:sdtContent>
@@ -2234,12 +2234,12 @@
               <w:szCs w:val="16"/>
             </w:rPr>
             <w:alias w:val="#Nav: /Totals/Totals_Profit"/>
-            <w:tag w:val="#Nav: Inventory_Customer_Sales/713"/>
+            <w:tag w:val="#Nav: FS_YSD_InventoryCustomerSales/50019"/>
             <w:id w:val="1030993549"/>
             <w:placeholder>
               <w:docPart w:val="DefaultPlaceholder_-1854013440"/>
             </w:placeholder>
-            <w:dataBinding w:prefixMappings="xmlns:ns0='urn:microsoft-dynamics-nav/reports/Inventory_Customer_Sales/713/'" w:xpath="/ns0:NavWordReportXmlPart[1]/ns0:Totals[1]/ns0:Totals_Profit[1]" w:storeItemID="{0E62280E-706F-45D7-BEE2-B24E4BE14C14}"/>
+            <w:dataBinding w:prefixMappings="xmlns:ns0='urn:microsoft-dynamics-nav/reports/FS_YSD_InventoryCustomerSales/50019/'" w:xpath="/ns0:NavWordReportXmlPart[1]/ns0:Totals[1]/ns0:Totals_Profit[1]" w:storeItemID="{0E62280E-706F-45D7-BEE2-B24E4BE14C14}"/>
             <w:text/>
           </w:sdtPr>
           <w:sdtContent>
@@ -2288,12 +2288,12 @@
               <w:szCs w:val="16"/>
             </w:rPr>
             <w:alias w:val="#Nav: /Totals/Totals_ProfitPct"/>
-            <w:tag w:val="#Nav: Inventory_Customer_Sales/713"/>
+            <w:tag w:val="#Nav: FS_YSD_InventoryCustomerSales/50019"/>
             <w:id w:val="1949193217"/>
             <w:placeholder>
               <w:docPart w:val="DefaultPlaceholder_-1854013440"/>
             </w:placeholder>
-            <w:dataBinding w:prefixMappings="xmlns:ns0='urn:microsoft-dynamics-nav/reports/Inventory_Customer_Sales/713/'" w:xpath="/ns0:NavWordReportXmlPart[1]/ns0:Totals[1]/ns0:Totals_ProfitPct[1]" w:storeItemID="{0E62280E-706F-45D7-BEE2-B24E4BE14C14}"/>
+            <w:dataBinding w:prefixMappings="xmlns:ns0='urn:microsoft-dynamics-nav/reports/FS_YSD_InventoryCustomerSales/50019/'" w:xpath="/ns0:NavWordReportXmlPart[1]/ns0:Totals[1]/ns0:Totals_ProfitPct[1]" w:storeItemID="{0E62280E-706F-45D7-BEE2-B24E4BE14C14}"/>
             <w:text/>
           </w:sdtPr>
           <w:sdtContent>
@@ -2478,12 +2478,12 @@
             <w:szCs w:val="28"/>
           </w:rPr>
           <w:alias w:val="#Nav: /Labels/InventoryCustomerSalesLbl"/>
-          <w:tag w:val="#Nav: Inventory_Customer_Sales/713"/>
+          <w:tag w:val="#Nav: FS_YSD_InventoryCustomerSales/50019"/>
           <w:id w:val="1258788525"/>
           <w:placeholder>
             <w:docPart w:val="DefaultPlaceholder_-1854013440"/>
           </w:placeholder>
-          <w:dataBinding w:prefixMappings="xmlns:ns0='urn:microsoft-dynamics-nav/reports/Inventory_Customer_Sales/713/'" w:xpath="/ns0:NavWordReportXmlPart[1]/ns0:Labels[1]/ns0:InventoryCustomerSalesLbl[1]" w:storeItemID="{0E62280E-706F-45D7-BEE2-B24E4BE14C14}"/>
+          <w:dataBinding w:prefixMappings="xmlns:ns0='urn:microsoft-dynamics-nav/reports/FS_YSD_InventoryCustomerSales/50019/' " w:xpath="/ns0:NavWordReportXmlPart[1]/ns0:Labels[1]/ns0:InventoryCustomerSalesLbl[1]" w:storeItemID="{0E62280E-706F-45D7-BEE2-B24E4BE14C14}"/>
           <w:text/>
         </w:sdtPr>
         <w:sdtContent>
@@ -2701,12 +2701,12 @@
                 <w:szCs w:val="16"/>
               </w:rPr>
               <w:alias w:val="#Nav: /BCReportInformation/ReportRequest/UserName"/>
-              <w:tag w:val="#Nav: Inventory_Customer_Sales/713"/>
+              <w:tag w:val="#Nav: FS_YSD_InventoryCustomerSales/50019"/>
               <w:id w:val="-249272221"/>
               <w:placeholder>
                 <w:docPart w:val="66E472B77CED4562AC3C88900F76E129"/>
               </w:placeholder>
-              <w:dataBinding w:prefixMappings="xmlns:ns0='urn:microsoft-dynamics-nav/reports/Inventory_Customer_Sales/713/'" w:xpath="/ns0:NavWordReportXmlPart[1]/ns0:BCReportInformation[1]/ns0:ReportRequest[1]/ns0:UserName[1]" w:storeItemID="{0E62280E-706F-45D7-BEE2-B24E4BE14C14}"/>
+              <w:dataBinding w:prefixMappings="xmlns:ns0='urn:microsoft-dynamics-nav/reports/FS_YSD_InventoryCustomerSales/50019/'" w:xpath="/ns0:NavWordReportXmlPart[1]/ns0:BCReportInformation[1]/ns0:ReportRequest[1]/ns0:UserName[1]" w:storeItemID="{0E62280E-706F-45D7-BEE2-B24E4BE14C14}"/>
               <w:text/>
             </w:sdtPr>
             <w:sdtContent>
@@ -2749,12 +2749,12 @@
               <w:szCs w:val="16"/>
             </w:rPr>
             <w:alias w:val="#Nav: /BCReportInformation/ReportRequest/CompanyName"/>
-            <w:tag w:val="#Nav: Inventory_Customer_Sales/713"/>
+            <w:tag w:val="#Nav: FS_YSD_InventoryCustomerSales/50019"/>
             <w:id w:val="-1641258246"/>
             <w:placeholder>
               <w:docPart w:val="C094C4BF41804FD1B5E0F604A4595C5E"/>
             </w:placeholder>
-            <w:dataBinding w:prefixMappings="xmlns:ns0='urn:microsoft-dynamics-nav/reports/Inventory_Customer_Sales/713/'" w:xpath="/ns0:NavWordReportXmlPart[1]/ns0:BCReportInformation[1]/ns0:ReportRequest[1]/ns0:CompanyName[1]" w:storeItemID="{0E62280E-706F-45D7-BEE2-B24E4BE14C14}"/>
+            <w:dataBinding w:prefixMappings="xmlns:ns0='urn:microsoft-dynamics-nav/reports/FS_YSD_InventoryCustomerSales/50019/'" w:xpath="/ns0:NavWordReportXmlPart[1]/ns0:BCReportInformation[1]/ns0:ReportRequest[1]/ns0:CompanyName[1]" w:storeItemID="{0E62280E-706F-45D7-BEE2-B24E4BE14C14}"/>
             <w:text/>
           </w:sdtPr>
           <w:sdtContent>
@@ -2826,12 +2826,12 @@
                 <w:szCs w:val="16"/>
               </w:rPr>
               <w:alias w:val="#Nav: /ReportHeader/ItemFilter"/>
-              <w:tag w:val="#Nav: Inventory_Customer_Sales/713"/>
+              <w:tag w:val="#Nav: FS_YSD_InventoryCustomerSales/50019"/>
               <w:id w:val="-1090542280"/>
               <w:placeholder>
                 <w:docPart w:val="DefaultPlaceholder_-1854013440"/>
               </w:placeholder>
-              <w:dataBinding w:prefixMappings="xmlns:ns0='urn:microsoft-dynamics-nav/reports/Inventory_Customer_Sales/713/'" w:xpath="/ns0:NavWordReportXmlPart[1]/ns0:ReportHeader[1]/ns0:ItemFilter[1]" w:storeItemID="{0E62280E-706F-45D7-BEE2-B24E4BE14C14}"/>
+              <w:dataBinding w:prefixMappings="xmlns:ns0='urn:microsoft-dynamics-nav/reports/FS_YSD_InventoryCustomerSales/50019/' " w:xpath="/ns0:NavWordReportXmlPart[1]/ns0:ReportHeader[1]/ns0:ItemFilter[1]" w:storeItemID="{0E62280E-706F-45D7-BEE2-B24E4BE14C14}"/>
               <w:text/>
             </w:sdtPr>
             <w:sdtContent>
@@ -2885,12 +2885,12 @@
                 <w:szCs w:val="16"/>
               </w:rPr>
               <w:alias w:val="#Nav: /ReportHeader/ItemLedgEntryFilter"/>
-              <w:tag w:val="#Nav: Inventory_Customer_Sales/713"/>
+              <w:tag w:val="#Nav: FS_YSD_InventoryCustomerSales/50019"/>
               <w:id w:val="821245802"/>
               <w:placeholder>
                 <w:docPart w:val="DefaultPlaceholder_-1854013440"/>
               </w:placeholder>
-              <w:dataBinding w:prefixMappings="xmlns:ns0='urn:microsoft-dynamics-nav/reports/Inventory_Customer_Sales/713/'" w:xpath="/ns0:NavWordReportXmlPart[1]/ns0:ReportHeader[1]/ns0:ItemLedgEntryFilter[1]" w:storeItemID="{0E62280E-706F-45D7-BEE2-B24E4BE14C14}"/>
+              <w:dataBinding w:prefixMappings="xmlns:ns0='urn:microsoft-dynamics-nav/reports/FS_YSD_InventoryCustomerSales/50019/' " w:xpath="/ns0:NavWordReportXmlPart[1]/ns0:ReportHeader[1]/ns0:ItemLedgEntryFilter[1]" w:storeItemID="{0E62280E-706F-45D7-BEE2-B24E4BE14C14}"/>
               <w:text/>
             </w:sdtPr>
             <w:sdtContent>
@@ -4613,9 +4613,9 @@
 </a:theme>
 </file>
 
-<file path=customXml/item2.xml>��< ? x m l   v e r s i o n = " 1 . 0 "   e n c o d i n g = " u t f - 1 6 " ? > - 
- < N a v W o r d R e p o r t X m l P a r t   x m l n s = " u r n : m i c r o s o f t - d y n a m i c s - n a v / r e p o r t s / I n v e n t o r y _ C u s t o m e r _ S a l e s / 7 1 3 / " > +<file path=customXml/item1.xml>��< ? x m l   v e r s i o n = " 1 . 0 "   e n c o d i n g = " u t f - 1 6 " ? > + 
+ < N a v W o r d R e p o r t X m l P a r t   x m l n s = " u r n : m i c r o s o f t - d y n a m i c s - n a v / r e p o r t s / F S _ Y S D _ I n v e n t o r y C u s t o m e r S a l e s / 5 0 0 1 9 / " >   
      < B C R e p o r t I n f o r m a t i o n >   
@@ -4685,8 +4685,6 @@
  
          < A b o u t T h e R e p o r t L b l > A b o u t T h e R e p o r t L b l < / A b o u t T h e R e p o r t L b l >   
-         < A m o u n t > A m o u n t < / A m o u n t > - 
          < A m o u n t L b l > A m o u n t L b l < / A m o u n t L b l >   
          < B a s e U n i t o f M e a s u r e _ I t e m C a p t i o n > B a s e U n i t o f M e a s u r e _ I t e m C a p t i o n < / B a s e U n i t o f M e a s u r e _ I t e m C a p t i o n > @@ -4695,16 +4693,12 @@
  
          < C u s t N a m e L b l > C u s t N a m e L b l < / C u s t N a m e L b l >   
-         < C u s t o m e r N o > C u s t o m e r N o < / C u s t o m e r N o > - 
          < C u s t o m e r N o L b l > C u s t o m e r N o L b l < / C u s t o m e r N o L b l >   
          < D a t a R e t r i e v e d L b l > D a t a R e t r i e v e d L b l < / D a t a R e t r i e v e d L b l >   
          < D e s c r i p t i o n _ I t e m C a p t i o n > D e s c r i p t i o n _ I t e m C a p t i o n < / D e s c r i p t i o n _ I t e m C a p t i o n >   
-         < D i s c o u n t A m t > D i s c o u n t A m t < / D i s c o u n t A m t > - 
          < D i s c o u n t A m t L b l > D i s c o u n t A m t L b l < / D i s c o u n t A m t L b l >   
          < D o c u m e n t a t i o n L b l > D o c u m e n t a t i o n L b l < / D o c u m e n t a t i o n L b l > @@ -4717,54 +4711,36 @@
  
          < I n v e n t o r y C u s t o m e r S a l e s L b l > I n v e n t o r y C u s t o m e r S a l e s L b l < / I n v e n t o r y C u s t o m e r S a l e s L b l >   
-         < I n v o i c e d Q t y > I n v o i c e d Q t y < / I n v o i c e d Q t y > - 
          < I n v Q t y L b l > I n v Q t y L b l < / I n v Q t y L b l >   
-         < N a m e > N a m e < / N a m e > - 
          < N o _ I t e m C a p t i o n > N o _ I t e m C a p t i o n < / N o _ I t e m C a p t i o n >   
-         < P a g e > P a g e < / P a g e > - 
          < P e r i o d L b l > P e r i o d L b l < / P e r i o d L b l >   
-         < P r o f i t > P r o f i t < / P r o f i t > - 
          < P r o f i t _ I t e m L e d g E n t r y C a p t i o n > P r o f i t _ I t e m L e d g E n t r y C a p t i o n < / P r o f i t _ I t e m L e d g E n t r y C a p t i o n >   
          < P r o f i t L b l > P r o f i t L b l < / P r o f i t L b l >   
-         < P r o f i t P c t > P r o f i t P c t < / P r o f i t P c t > - 
          < P r o f i t P c t L b l > P r o f i t P c t L b l < / P r o f i t P c t L b l >   
          < R e p o r t N a m e L b l > R e p o r t N a m e L b l < / R e p o r t N a m e L b l >   
-         < R e p o r t T i t l e > R e p o r t T i t l e < / R e p o r t T i t l e > - 
          < R u n O n L b l > R u n O n L b l < / R u n O n L b l >   
          < S a l e s A m t A c t u a l _ I t e m L e d g E n t r y C a p t i o n > S a l e s A m t A c t u a l _ I t e m L e d g E n t r y C a p t i o n < / S a l e s A m t A c t u a l _ I t e m L e d g E n t r y C a p t i o n >   
          < S o u r c e N o _ I t e m L e d g E n t r y C a p t i o n > S o u r c e N o _ I t e m L e d g E n t r y C a p t i o n < / S o u r c e N o _ I t e m L e d g E n t r y C a p t i o n >   
-         < T o t a l > T o t a l < / T o t a l > - 
          < U s e r L b l > U s e r L b l < / U s e r L b l >   
      < / L a b e l s >   
      < R e p o r t H e a d e r >   
-         < C o m p a n y N a m e > C o m p a n y N a m e < / C o m p a n y N a m e > - 
          < I t e m F i l t e r > I t e m F i l t e r < / I t e m F i l t e r >   
          < I t e m L e d g E n t r y F i l t e r > I t e m L e d g E n t r y F i l t e r < / I t e m L e d g E n t r y F i l t e r >   
-         < P e r i o d T e x t > P e r i o d T e x t < / P e r i o d T e x t > - 
      < / R e p o r t H e a d e r >   
      < I t e m > @@ -4828,6 +4804,14 @@
      < / T o t a l s >   
  < / N a v W o r d R e p o r t X m l P a r t > 
+</file>
+
+<file path=customXml/itemProps1.xml><?xml version="1.0" encoding="utf-8"?>
+<ds:datastoreItem xmlns:ds="http://schemas.openxmlformats.org/officeDocument/2006/customXml" ds:itemID="{0E62280E-706F-45D7-BEE2-B24E4BE14C14}">
+  <ds:schemaRefs>
+    <ds:schemaRef ds:uri="urn:microsoft-dynamics-nav/reports/FS_YSD_InventoryCustomerSales/50019/"/>
+  </ds:schemaRefs>
+</ds:datastoreItem>
 </file>
 
 <file path=docMetadata/LabelInfo.xml><?xml version="1.0" encoding="utf-8"?>

</xml_diff>